<commit_message>
feat(presentation): polish candidate showcase and unify contest materials
</commit_message>
<xml_diff>
--- a/docs/preliminary-candidate/credproof-manuscript-candidate.docx
+++ b/docs/preliminary-candidate/credproof-manuscript-candidate.docx
@@ -540,7 +540,7 @@
         <w:rPr>
           <w:rFonts w:ascii="宋体" w:hAnsi="宋体" w:eastAsia="宋体" w:cs="宋体"/>
         </w:rPr>
-        <w:instrText xml:space="preserve"> HYPERLINK \l _Toc27086 </w:instrText>
+        <w:instrText xml:space="preserve"> HYPERLINK \l _Toc6410 </w:instrText>
       </w:r>
       <w:r>
         <w:rPr>
@@ -561,7 +561,7 @@
         <w:fldChar w:fldCharType="begin"/>
       </w:r>
       <w:r>
-        <w:instrText xml:space="preserve"> PAGEREF _Toc27086 \h </w:instrText>
+        <w:instrText xml:space="preserve"> PAGEREF _Toc6410 \h </w:instrText>
       </w:r>
       <w:r>
         <w:fldChar w:fldCharType="separate"/>
@@ -598,7 +598,7 @@
         <w:rPr>
           <w:rFonts w:ascii="宋体" w:hAnsi="宋体" w:eastAsia="宋体" w:cs="宋体"/>
         </w:rPr>
-        <w:instrText xml:space="preserve"> HYPERLINK \l _Toc21319 </w:instrText>
+        <w:instrText xml:space="preserve"> HYPERLINK \l _Toc16836 </w:instrText>
       </w:r>
       <w:r>
         <w:rPr>
@@ -619,7 +619,7 @@
         <w:fldChar w:fldCharType="begin"/>
       </w:r>
       <w:r>
-        <w:instrText xml:space="preserve"> PAGEREF _Toc21319 \h </w:instrText>
+        <w:instrText xml:space="preserve"> PAGEREF _Toc16836 \h </w:instrText>
       </w:r>
       <w:r>
         <w:fldChar w:fldCharType="separate"/>
@@ -656,7 +656,7 @@
         <w:rPr>
           <w:rFonts w:ascii="宋体" w:hAnsi="宋体" w:eastAsia="宋体" w:cs="宋体"/>
         </w:rPr>
-        <w:instrText xml:space="preserve"> HYPERLINK \l _Toc32427 </w:instrText>
+        <w:instrText xml:space="preserve"> HYPERLINK \l _Toc23060 </w:instrText>
       </w:r>
       <w:r>
         <w:rPr>
@@ -677,7 +677,7 @@
         <w:fldChar w:fldCharType="begin"/>
       </w:r>
       <w:r>
-        <w:instrText xml:space="preserve"> PAGEREF _Toc32427 \h </w:instrText>
+        <w:instrText xml:space="preserve"> PAGEREF _Toc23060 \h </w:instrText>
       </w:r>
       <w:r>
         <w:fldChar w:fldCharType="separate"/>
@@ -714,7 +714,7 @@
         <w:rPr>
           <w:rFonts w:ascii="宋体" w:hAnsi="宋体" w:eastAsia="宋体" w:cs="宋体"/>
         </w:rPr>
-        <w:instrText xml:space="preserve"> HYPERLINK \l _Toc16645 </w:instrText>
+        <w:instrText xml:space="preserve"> HYPERLINK \l _Toc10203 </w:instrText>
       </w:r>
       <w:r>
         <w:rPr>
@@ -735,7 +735,7 @@
         <w:fldChar w:fldCharType="begin"/>
       </w:r>
       <w:r>
-        <w:instrText xml:space="preserve"> PAGEREF _Toc16645 \h </w:instrText>
+        <w:instrText xml:space="preserve"> PAGEREF _Toc10203 \h </w:instrText>
       </w:r>
       <w:r>
         <w:fldChar w:fldCharType="separate"/>
@@ -772,7 +772,7 @@
         <w:rPr>
           <w:rFonts w:ascii="宋体" w:hAnsi="宋体" w:eastAsia="宋体" w:cs="宋体"/>
         </w:rPr>
-        <w:instrText xml:space="preserve"> HYPERLINK \l _Toc30872 </w:instrText>
+        <w:instrText xml:space="preserve"> HYPERLINK \l _Toc20433 </w:instrText>
       </w:r>
       <w:r>
         <w:rPr>
@@ -793,7 +793,7 @@
         <w:fldChar w:fldCharType="begin"/>
       </w:r>
       <w:r>
-        <w:instrText xml:space="preserve"> PAGEREF _Toc30872 \h </w:instrText>
+        <w:instrText xml:space="preserve"> PAGEREF _Toc20433 \h </w:instrText>
       </w:r>
       <w:r>
         <w:fldChar w:fldCharType="separate"/>
@@ -830,7 +830,7 @@
         <w:rPr>
           <w:rFonts w:ascii="宋体" w:hAnsi="宋体" w:eastAsia="宋体" w:cs="宋体"/>
         </w:rPr>
-        <w:instrText xml:space="preserve"> HYPERLINK \l _Toc12653 </w:instrText>
+        <w:instrText xml:space="preserve"> HYPERLINK \l _Toc25533 </w:instrText>
       </w:r>
       <w:r>
         <w:rPr>
@@ -851,13 +851,13 @@
         <w:fldChar w:fldCharType="begin"/>
       </w:r>
       <w:r>
-        <w:instrText xml:space="preserve"> PAGEREF _Toc12653 \h </w:instrText>
+        <w:instrText xml:space="preserve"> PAGEREF _Toc25533 \h </w:instrText>
       </w:r>
       <w:r>
         <w:fldChar w:fldCharType="separate"/>
       </w:r>
       <w:r>
-        <w:t>9</w:t>
+        <w:t>10</w:t>
       </w:r>
       <w:r>
         <w:fldChar w:fldCharType="end"/>
@@ -888,7 +888,7 @@
         <w:rPr>
           <w:rFonts w:ascii="宋体" w:hAnsi="宋体" w:eastAsia="宋体" w:cs="宋体"/>
         </w:rPr>
-        <w:instrText xml:space="preserve"> HYPERLINK \l _Toc5614 </w:instrText>
+        <w:instrText xml:space="preserve"> HYPERLINK \l _Toc1414 </w:instrText>
       </w:r>
       <w:r>
         <w:rPr>
@@ -909,13 +909,13 @@
         <w:fldChar w:fldCharType="begin"/>
       </w:r>
       <w:r>
-        <w:instrText xml:space="preserve"> PAGEREF _Toc5614 \h </w:instrText>
+        <w:instrText xml:space="preserve"> PAGEREF _Toc1414 \h </w:instrText>
       </w:r>
       <w:r>
         <w:fldChar w:fldCharType="separate"/>
       </w:r>
       <w:r>
-        <w:t>10</w:t>
+        <w:t>11</w:t>
       </w:r>
       <w:r>
         <w:fldChar w:fldCharType="end"/>
@@ -950,7 +950,7 @@
         <w:ind w:firstLine="0"/>
         <w:jc w:val="center"/>
       </w:pPr>
-      <w:bookmarkStart w:id="0" w:name="_Toc27086"/>
+      <w:bookmarkStart w:id="0" w:name="_Toc6410"/>
       <w:r>
         <w:rPr>
           <w:rFonts w:ascii="黑体" w:hAnsi="黑体" w:eastAsia="黑体" w:cs="黑体"/>
@@ -975,23 +975,23 @@
           <w:color w:val="000000"/>
           <w:sz w:val="24"/>
         </w:rPr>
-        <w:t>本作品面向本地 AI 工具中无硬编码、但可能经日志、异常和嵌套返回外泄的运行时凭据，构建可追溯的诊断与修复原型。系统使用本地模型提出假设和补丁，由程序依据当前对象上的实际泄露证据授权修改，并在隔离环境中检查凭据通道、认证行为及异常分支。单页界面分别展示模型判断、程序确认、候选验收与任务完成状态，材料可导出并重新执行检查。同一冻结轮次的八个合成案例中，反馈 Agent 修复四个问题例，正常代码均未被实际修改；完整任务为六例，另两例因工具调用格式问题未完成。一个案例保存了失败补丁、真实反馈与再次修复的完整过程。作品的特点是把模型建议与执行权限、验收结论分开，为小型授权工具提供可检查的修复流程。当前结果限于受控 Python 轮廓和固定条件，不代表通用漏洞修复能力。</w:t>
-      </w:r>
-    </w:p>
-    <w:p>
-      <w:pPr>
-        <w:widowControl/>
-        <w:spacing w:before="0" w:after="60" w:line="360" w:lineRule="auto"/>
-        <w:ind w:firstLine="0"/>
-      </w:pPr>
-      <w:r>
-        <w:rPr>
-          <w:rFonts w:ascii="宋体" w:hAnsi="宋体" w:eastAsia="宋体" w:cs="宋体"/>
-          <w:b w:val="0"/>
-          <w:color w:val="000000"/>
-          <w:sz w:val="24"/>
-        </w:rPr>
-        <w:t>关键词：运行时凭据；本地智能体；受控修复；证据绑定；可复检材料</w:t>
+        <w:t>密证 CredProof 面向 AI 工具中的运行时凭据泄露，结合本地大模型补丁生成与程序控制的安全验收，给出候选修复并检查泄露是否消除、必要业务行为是否保持，支持材料导出与复检。系统围绕证据驱动的候选生成与反馈调整、程序控制的修改权限与安全/业务验收、对应修复对象的材料导出与复检三个特点，形成从运行观察到候选验证的完整流程。模型提出假设与补丁，程序依据当前对象的实际证据授权，在隔离环境中检查凭据通道和功能，再由执行器确认任务状态。单页工作台展示原代码、差异、失败反馈与验收结果。同一冻结轮次八个合成案例中，反馈 Agent 完成四个问题例的合格修复，四个正常例均未被实际修改；最终对象通过八例，完整任务六例。代表案例保存了失败补丁经真实反馈修正的过程。作品已形成可运行和可复检的原型，为小型授权 Python 工具提供有依据的修复辅助。</w:t>
+      </w:r>
+    </w:p>
+    <w:p>
+      <w:pPr>
+        <w:widowControl/>
+        <w:spacing w:before="0" w:after="60" w:line="360" w:lineRule="auto"/>
+        <w:ind w:firstLine="0"/>
+      </w:pPr>
+      <w:r>
+        <w:rPr>
+          <w:rFonts w:ascii="宋体" w:hAnsi="宋体" w:eastAsia="宋体" w:cs="宋体"/>
+          <w:b w:val="0"/>
+          <w:color w:val="000000"/>
+          <w:sz w:val="24"/>
+        </w:rPr>
+        <w:t>关键词：运行时凭据；本地智能体；受控修复；证据绑定；材料复检</w:t>
       </w:r>
     </w:p>
     <w:p>
@@ -1007,7 +1007,7 @@
         <w:ind w:firstLine="0"/>
         <w:jc w:val="center"/>
       </w:pPr>
-      <w:bookmarkStart w:id="1" w:name="_Toc21319"/>
+      <w:bookmarkStart w:id="1" w:name="_Toc16836"/>
       <w:r>
         <w:rPr>
           <w:rFonts w:ascii="黑体" w:hAnsi="黑体" w:eastAsia="黑体" w:cs="黑体"/>
@@ -1034,7 +1034,7 @@
           <w:color w:val="000000"/>
           <w:sz w:val="28"/>
         </w:rPr>
-        <w:t>1.1 问题与目标</w:t>
+        <w:t>1.1 作品价值</w:t>
       </w:r>
     </w:p>
     <w:p>
@@ -1050,7 +1050,7 @@
           <w:color w:val="000000"/>
           <w:sz w:val="24"/>
         </w:rPr>
-        <w:t>小型 AI 工具通常从环境变量取得认证凭据，再调用服务。源代码不包含真实密钥，并不意味着执行时不会泄露：参数可能被辅助函数记录，异常细节可能进入日志，调试结果可能把嵌套认证数据返回给调用者。另一方面，模型也可能把公开字段或正常认证调用误认为泄露，提出不必要的修改。</w:t>
+        <w:t>系统结合本地大模型补丁生成与程序控制的安全验收，针对凭据泄露问题给出候选修复，并检查泄露是否消除、必要业务行为是否保持，支持材料导出与复检。密证把这一流程组织为可操作的单页工作台：使用者能够查看泄露依据、候选差异、验证回执和当前任务状态，形成可追溯的修复材料。</w:t>
       </w:r>
     </w:p>
     <w:p>
@@ -1066,7 +1066,7 @@
           <w:color w:val="000000"/>
           <w:sz w:val="24"/>
         </w:rPr>
-        <w:t>密证面向自有或授权、经过预先审查的 Python 工具，回答三个问题：是否在指定条件下真实观察到凭据外泄；候选修改是否保留功能并消除该外泄；当前报告是否仍对应被检查的对象。作品提供本地运行、受限工具调用、候选副本、单页结果展示和可复检材料，帮助使用者检查修复依据和失败原因。</w:t>
+        <w:t>小型 AI 工具常从环境变量读取凭据。源码即使没有硬编码密钥，执行时仍可能经辅助函数日志、异常细节或嵌套返回暴露真实值。修复这类问题需要识别具体传播路径，同时保留正常认证、成功响应和异常处理。密证让模型承担假设与补丁生成，让固定程序承担修改授权和验收，两者协作完成有证据的修复辅助。</w:t>
       </w:r>
     </w:p>
     <w:p>
@@ -1084,7 +1084,7 @@
           <w:color w:val="000000"/>
           <w:sz w:val="28"/>
         </w:rPr>
-        <w:t>1.2 相关工作与作品定位</w:t>
+        <w:t>1.2 三个作品特点</w:t>
       </w:r>
     </w:p>
     <w:p>
@@ -1096,11 +1096,20 @@
       <w:r>
         <w:rPr>
           <w:rFonts w:ascii="宋体" w:hAnsi="宋体" w:eastAsia="宋体" w:cs="宋体"/>
-          <w:b w:val="0"/>
-          <w:color w:val="000000"/>
-          <w:sz w:val="24"/>
-        </w:rPr>
-        <w:t>作品复用 Qwen-Agent 的 Agent 循环、Qwen3-Coder 模型和 Ollama 推理能力，不训练或自称研发基础模型[1–3]。模式扫描、测试驱动修复、摘要绑定和 CI 验收都有既有实践；项目不将这些基础思想称为首创。本次对照 A 是项目自行实现的通用启发式修复程序，B 是一次生成，C 是有工具反馈的 Agent；它们不等于 Gitleaks、TruffleHog 或其他成熟产品的效果。</w:t>
+          <w:b/>
+          <w:color w:val="000000"/>
+          <w:sz w:val="24"/>
+        </w:rPr>
+        <w:t>证据驱动的候选生成与反馈调整。</w:t>
+      </w:r>
+      <w:r>
+        <w:rPr>
+          <w:rFonts w:ascii="宋体" w:hAnsi="宋体" w:eastAsia="宋体" w:cs="宋体"/>
+          <w:b w:val="0"/>
+          <w:color w:val="000000"/>
+          <w:sz w:val="24"/>
+        </w:rPr>
+        <w:t xml:space="preserve"> 模型依据代码和脱敏观察提出补丁，真实验证反馈支持后续调整。</w:t>
       </w:r>
     </w:p>
     <w:p>
@@ -1112,11 +1121,45 @@
       <w:r>
         <w:rPr>
           <w:rFonts w:ascii="宋体" w:hAnsi="宋体" w:eastAsia="宋体" w:cs="宋体"/>
-          <w:b w:val="0"/>
-          <w:color w:val="000000"/>
-          <w:sz w:val="24"/>
-        </w:rPr>
-        <w:t>核心实现是在一个有限任务中，统一组织实际证据、修改权限、必要验收条件和过程展示。模型负责提出候选，固定程序负责授权和验收。规范 CI 也可以实现这些控制，作品的价值在于形成可运行、可查看、可复检的完整小型组件。</w:t>
+          <w:b/>
+          <w:color w:val="000000"/>
+          <w:sz w:val="24"/>
+        </w:rPr>
+        <w:t>程序控制的修改权限与安全/业务验收。</w:t>
+      </w:r>
+      <w:r>
+        <w:rPr>
+          <w:rFonts w:ascii="宋体" w:hAnsi="宋体" w:eastAsia="宋体" w:cs="宋体"/>
+          <w:b w:val="0"/>
+          <w:color w:val="000000"/>
+          <w:sz w:val="24"/>
+        </w:rPr>
+        <w:t xml:space="preserve"> 当前有效证据授权修改，候选需同时满足安全与业务条件，任务状态独立确认。</w:t>
+      </w:r>
+    </w:p>
+    <w:p>
+      <w:pPr>
+        <w:widowControl/>
+        <w:spacing w:before="0" w:after="60" w:line="360" w:lineRule="auto"/>
+        <w:ind w:firstLine="480"/>
+      </w:pPr>
+      <w:r>
+        <w:rPr>
+          <w:rFonts w:ascii="宋体" w:hAnsi="宋体" w:eastAsia="宋体" w:cs="宋体"/>
+          <w:b/>
+          <w:color w:val="000000"/>
+          <w:sz w:val="24"/>
+        </w:rPr>
+        <w:t>对应修复对象的材料导出与复检。</w:t>
+      </w:r>
+      <w:r>
+        <w:rPr>
+          <w:rFonts w:ascii="宋体" w:hAnsi="宋体" w:eastAsia="宋体" w:cs="宋体"/>
+          <w:b w:val="0"/>
+          <w:color w:val="000000"/>
+          <w:sz w:val="24"/>
+        </w:rPr>
+        <w:t xml:space="preserve"> 导出原件、候选、需求规则及记录，重读材料并重新检查当前对象。</w:t>
       </w:r>
     </w:p>
     <w:p>
@@ -1134,7 +1177,7 @@
           <w:color w:val="000000"/>
           <w:sz w:val="28"/>
         </w:rPr>
-        <w:t>1.3 应用场景</w:t>
+        <w:t>1.3 应用场景与技术基础</w:t>
       </w:r>
     </w:p>
     <w:p>
@@ -1150,7 +1193,23 @@
           <w:color w:val="000000"/>
           <w:sz w:val="24"/>
         </w:rPr>
-        <w:t>适用于教学实验、小型本地认证工具，以及组织内部已授权组件的修复流程验证。开发者可先观察当前对象的实际表现，再评估模型建议是否必要、是否改坏功能。现阶段不开放任意仓库上传，不检查真实云账户，不对外部系统发起检测，也不声称已经完成云凭据撤销或轮换。</w:t>
+        <w:t>作品适用于教学实验、团队自有认证工具及内部授权组件。开发者可以定位泄露通道、比较候选差异，把对应材料交给他人复检；正常工具经验证后保持原样。</w:t>
+      </w:r>
+    </w:p>
+    <w:p>
+      <w:pPr>
+        <w:widowControl/>
+        <w:spacing w:before="0" w:after="60" w:line="360" w:lineRule="auto"/>
+        <w:ind w:firstLine="480"/>
+      </w:pPr>
+      <w:r>
+        <w:rPr>
+          <w:rFonts w:ascii="宋体" w:hAnsi="宋体" w:eastAsia="宋体" w:cs="宋体"/>
+          <w:b w:val="0"/>
+          <w:color w:val="000000"/>
+          <w:sz w:val="24"/>
+        </w:rPr>
+        <w:t>系统采用 Qwen3-Coder、Qwen-Agent 和 Ollama[1–3]。项目实现受限工具、证据授权、完成控制、裁判与案例、过程记录、材料复检和工作台，组织运行证据、生成式候选与确定性验收协同工作。</w:t>
       </w:r>
     </w:p>
     <w:p>
@@ -1161,7 +1220,7 @@
         <w:ind w:firstLine="0"/>
         <w:jc w:val="center"/>
       </w:pPr>
-      <w:bookmarkStart w:id="2" w:name="_Toc32427"/>
+      <w:bookmarkStart w:id="2" w:name="_Toc23060"/>
       <w:r>
         <w:rPr>
           <w:rFonts w:ascii="黑体" w:hAnsi="黑体" w:eastAsia="黑体" w:cs="黑体"/>
@@ -1188,7 +1247,7 @@
           <w:color w:val="000000"/>
           <w:sz w:val="28"/>
         </w:rPr>
-        <w:t>2.1 系统组成</w:t>
+        <w:t>2.1 系统组成与数据流程</w:t>
       </w:r>
     </w:p>
     <w:p>
@@ -1204,7 +1263,7 @@
           <w:color w:val="000000"/>
           <w:sz w:val="24"/>
         </w:rPr>
-        <w:t>系统由本地单页及 Python 后端、受控会话、Agent 接口、隔离执行器、固定裁判和材料导出复检模块组成。用户选择白名单案例，页面呈现原代码、当前候选、模型原文、程序证据与独立状态。历史记录明确标识为回放，新推理生成独立目录，不覆盖历史结果。</w:t>
+        <w:t>系统由单页与 Python 后端、受控会话、模型接口、隔离执行器、裁判和复检模块组成。选择案例后固定代码、需求和规则，在成功、拒绝、服务异常三个公开条件下形成初始证据。模型可读取代码、选择触发条件、取得证据、提交候选和请求验证。</w:t>
       </w:r>
     </w:p>
     <w:p>
@@ -1220,7 +1279,7 @@
           <w:color w:val="000000"/>
           <w:sz w:val="24"/>
         </w:rPr>
-        <w:t>会话先固定原始对象和规则，在三个公开认证条件下形成共享初始证据。模型可调用读取代码、运行结构化条件、取得证据、提交补丁、验证候选五类工具，不提供任意 Shell。每个请求、响应、调用实参、工具回执和候选内容保留到记录中。正文中的工具标签不执行，只有经过协议解析与参数校验的原生工具调用才派发。</w:t>
+        <w:t>候选只写入副本。程序核对权限，隔离执行器采集行为，裁判检查安全与功能，再依据必要条件确认任务状态。工作台展示原代码、候选、模型原文、证据与差异，现场推理和历史回放具有独立标识。</w:t>
       </w:r>
     </w:p>
     <w:p>
@@ -1303,7 +1362,7 @@
           <w:color w:val="000000"/>
           <w:sz w:val="28"/>
         </w:rPr>
-        <w:t>2.2 凭据使用契约</w:t>
+        <w:t>2.2 凭据使用与业务契约</w:t>
       </w:r>
     </w:p>
     <w:p>
@@ -1319,7 +1378,7 @@
           <w:color w:val="000000"/>
           <w:sz w:val="24"/>
         </w:rPr>
-        <w:t>被测工具统一实现 tool.run(request, auth_service)。有效请求包含非空 request_id、resource、1 至 5 的整数 units，以及可选布尔 debug。工具从指定环境变量取得随机合成凭据，并且必须对本地 mock 认证调用一次；这条通道允许携带凭据。无效输入不得调用认证，成功、拒绝和服务异常须维持各自约定响应。</w:t>
+        <w:t>被测工具实现 tool.run(request, auth_service)。有效请求具有非空 request_id、resource、1 至 5 的整数 units 和可选布尔 debug。工具从指定环境变量读取执行侧生成的随机合成凭据，并向本地 mock 认证服务调用一次；该认证实参是允许使用凭据的通道。</w:t>
       </w:r>
     </w:p>
     <w:p>
@@ -1335,7 +1394,23 @@
           <w:color w:val="000000"/>
           <w:sz w:val="24"/>
         </w:rPr>
-        <w:t>返回内容与键、异常文本、stdout、stderr、logging 均不得出现执行侧注入的完整凭据。验证器在隔离外按固定矩阵比较功能与禁止通道，给模型的反馈经过脱敏。凭据没有真实账户，不执行在线有效性验证。检测限于完整明文值，不覆盖分段、编码、加密或全部隐蔽通道。</w:t>
+        <w:t>返回内容与键、异常文本、stdout、stderr、logging 属于禁止泄露通道。执行器采集实际输出，裁判按固定矩阵检查完整凭据值。业务检查同时核对认证次数与实参、成功响应、拒绝和服务异常；无效输入不得调用认证。这样，删除认证、常量成功或吞掉异常都不能替代合格修复。</w:t>
+      </w:r>
+    </w:p>
+    <w:p>
+      <w:pPr>
+        <w:widowControl/>
+        <w:spacing w:before="0" w:after="60" w:line="360" w:lineRule="auto"/>
+        <w:ind w:firstLine="480"/>
+      </w:pPr>
+      <w:r>
+        <w:rPr>
+          <w:rFonts w:ascii="宋体" w:hAnsi="宋体" w:eastAsia="宋体" w:cs="宋体"/>
+          <w:b w:val="0"/>
+          <w:color w:val="000000"/>
+          <w:sz w:val="24"/>
+        </w:rPr>
+        <w:t>原始值保留在执行侧，模型只见脱敏观察与失败类别。受控运行接收结构化请求和认证条件，完整验收对所有候选采用相同的 13 项条件。</w:t>
       </w:r>
     </w:p>
     <w:p>
@@ -1353,7 +1428,7 @@
           <w:color w:val="000000"/>
           <w:sz w:val="28"/>
         </w:rPr>
-        <w:t>2.3 修改授权与隔离执行</w:t>
+        <w:t>2.3 程序控制的修改与完成</w:t>
       </w:r>
     </w:p>
     <w:p>
@@ -1369,7 +1444,7 @@
           <w:color w:val="000000"/>
           <w:sz w:val="24"/>
         </w:rPr>
-        <w:t>提交候选前，程序核对原始对象、规则和触发条件的摘要关系，仅当前有效泄露证据可授权修改；没有证据时保留原代码，模型疑点仍完整记录。补丁只写候选副本，不改原工具、原仓库 index、需求、裁判或执行设施。受限语法检查禁止反射、文件读取、任意导入、网络和进程操作等超出轮廓的行为。</w:t>
+        <w:t>会话把原始对象、规则和触发条件关联起来。仅当前有效泄露证据授权写入候选；没有确认依据时保留原代码，并记录模型的疑点。工具调用经过协议解析、参数与路径校验，补丁只能替换候选工具，可信需求、裁判和执行设施保持固定。候选执行前还要满足受限 Python 语法规则。</w:t>
       </w:r>
     </w:p>
     <w:p>
@@ -1385,7 +1460,7 @@
           <w:color w:val="000000"/>
           <w:sz w:val="24"/>
         </w:rPr>
-        <w:t>候选通过既有 WSL/Linux 隔离设施执行，使用命名空间、只读挂载、资源限制及系统调用约束。OS 隔离用于限制候选对宿主的影响，不能据此声称同进程 Python 裁判能抵抗任意恶意内省。可信需求、裁判和操作者仍是系统信任基础。</w:t>
+        <w:t>执行使用 WSL/Linux 隔离设施，通过命名空间、只读挂载、资源限制和系统调用约束控制运行能力。程序记录每项检查的 PASS、FAIL 或 UNKNOWN。FAIL 可以触发预算内的反馈调整；满足当前对象的全部完成条件后，执行器才确认任务完成。请求次数、候选数、上下文和时间均有上限，错误或超时保留到记录中。</w:t>
       </w:r>
     </w:p>
     <w:p>
@@ -1403,7 +1478,7 @@
           <w:color w:val="000000"/>
           <w:sz w:val="28"/>
         </w:rPr>
-        <w:t>2.4 完成控制和可复检材料</w:t>
+        <w:t>2.4 工作台与对象对应的复检</w:t>
       </w:r>
     </w:p>
     <w:p>
@@ -1419,7 +1494,7 @@
           <w:color w:val="000000"/>
           <w:sz w:val="24"/>
         </w:rPr>
-        <w:t>对当前选中对象完成全部必要检查且 PASS，执行器才形成完成状态；FAIL 保留具体问题，必要检查不可用则不能算通过。模型循环结束、模型自述成功、最终原对象碰巧合格，均不自动代表任务完成。框架调用受总次数、候选数、上下文和时间约束，超时或错误停止，不切换云模型。</w:t>
+        <w:t>工作台分别展示模型判断、程序确认和任务状态，可展开真实证据、代码差异及每次验收回执。请求、响应、调用实参与候选一同保存，支持回到具体失败步骤。</w:t>
       </w:r>
     </w:p>
     <w:p>
@@ -1435,7 +1510,7 @@
           <w:color w:val="000000"/>
           <w:sz w:val="24"/>
         </w:rPr>
-        <w:t>材料包包含原始与当前副本、可信需求、配置、报告、轨迹、校验信息及复检依赖源码。复检先判断历史报告与当前材料的一致性，再重新执行固定检查。旧报告失效不强制新对象 FAIL，新对象可能通过；普通哈希仅检查内容一致，不是数字签名或第三方认证。独立复检不需要模型，但需要已经准备和验收的隔离运行设施。</w:t>
+        <w:t>材料包包含原始与当前副本、可信需求、配置、报告、轨迹、校验信息和复检源码。复检无需重新调用模型，而是在已准备的隔离设施上重读当前对象并重新执行固定条件。源文件、候选、规则或材料变化时，旧缓存包和旧复检结论不能继续作为当前结果复用。</w:t>
       </w:r>
     </w:p>
     <w:p>
@@ -1451,7 +1526,7 @@
           <w:color w:val="000000"/>
           <w:sz w:val="24"/>
         </w:rPr>
-        <w:t>当前候选版还核对导出输入及缓存材料：源文件、候选、规则或材料发生变化后，旧包与旧复检不能继续作为当前结果复用。复检分别报告历史报告适用性、历史材料完整性和当前验收；材料完整性为 INTACT、DEGRADED 或 UNKNOWN。清单中的可选轨迹缺失可标为 DEGRADED，不自动把当前独立验收 PASS 改成 FAIL；必要材料缺失则按无法核对处理。INTACT 也不证明未声明的历史事件齐全。这些交付完善不追溯计入下章历史八例成绩。</w:t>
+        <w:t>复检分别报告旧报告适用性、历史材料完整性和当前验收。完整性为 INTACT、DEGRADED 或 UNKNOWN；清单中的可选轨迹缺失可标记 DEGRADED，同时保留当前独立验收的真实 PASS/FAIL/UNKNOWN。旧报告失效与当前对象失败分别处理，因此一个变化后的对象仍可能通过新的检查。</w:t>
       </w:r>
     </w:p>
     <w:p>
@@ -1462,7 +1537,7 @@
         <w:ind w:firstLine="0"/>
         <w:jc w:val="center"/>
       </w:pPr>
-      <w:bookmarkStart w:id="3" w:name="_Toc16645"/>
+      <w:bookmarkStart w:id="3" w:name="_Toc10203"/>
       <w:r>
         <w:rPr>
           <w:rFonts w:ascii="黑体" w:hAnsi="黑体" w:eastAsia="黑体" w:cs="黑体"/>
@@ -1505,7 +1580,7 @@
           <w:color w:val="000000"/>
           <w:sz w:val="24"/>
         </w:rPr>
-        <w:t>本章统一采用 20260929t095000z-holdout8 的完整结果，对应源码快照 b4cb91ef67ae2d14d6cc37f9e18cf6c23e36e8ea[4]。8 个自建模板包含 4 个泄露案例和 4 个正常案例，分别覆盖辅助函数参数日志、拒绝分支输出、异常跨函数传播、嵌套返回，以及正确认证封装、公开错误、独立脱敏结构和公开诊断信息。</w:t>
+        <w:t>本章统一使用 20260929t095000z-holdout8 完整结果，对应源码快照 b4cb91ef67ae2d14d6cc37f9e18cf6c23e36e8ea[4]。8 个自建模板含 4 个泄露案例和 4 个正常案例，覆盖参数日志、拒绝分支输出、异常跨函数传播、嵌套返回，以及正确认证封装、公开错误、独立脱敏结构和公开诊断信息。</w:t>
       </w:r>
     </w:p>
     <w:p>
@@ -1521,23 +1596,7 @@
           <w:color w:val="000000"/>
           <w:sz w:val="24"/>
         </w:rPr>
-        <w:t>模板在运行方法前具有预定义需求、标签和断言，但由开发过程构造，共享部分辅助代码，并非外部独立盲测或八个统计独立样本。此后全部 14 例均作为已知回归案例。每个对象检查固定 13 个条件；三项公开初始诊断由 A/B/C 共享，不计作 Agent 自主发现。</w:t>
-      </w:r>
-    </w:p>
-    <w:p>
-      <w:pPr>
-        <w:widowControl/>
-        <w:spacing w:before="0" w:after="60" w:line="360" w:lineRule="auto"/>
-        <w:ind w:firstLine="480"/>
-      </w:pPr>
-      <w:r>
-        <w:rPr>
-          <w:rFonts w:ascii="宋体" w:hAnsi="宋体" w:eastAsia="宋体" w:cs="宋体"/>
-          <w:b w:val="0"/>
-          <w:color w:val="000000"/>
-          <w:sz w:val="24"/>
-        </w:rPr>
-        <w:t>该轮使用 Qwen-Agent 0.0.34、Ollama 0.34.4、qwen3-coder:30b Q4_K_M 和 16K 上下文。A 为固定程序；B 一次模型生成；C 最多 12 次模型请求、最多 3 个候选，模型和裁判固定。本轮无在线真实账户验证。监督命令退出 0，冻结文件保持一致。新客户端、单页完善和后续两例复测与本章历史成绩分开。</w:t>
+        <w:t>各模板在执行方法前登记需求、标签和断言，每个对象检查 13 项固定条件。A/B/C 共享三项公开初始诊断。A 是本项目固定启发式修复程序；B 为一次模型生成；C 为有工具反馈的 Agent，最多 12 次模型请求、3 个候选。该轮采用 Qwen-Agent 0.0.34、Ollama 0.34.4、qwen3-coder:30b Q4_K_M 和 16K 上下文，监督命令退出 0，冻结文件保持一致。</w:t>
       </w:r>
     </w:p>
     <w:p>
@@ -2266,7 +2325,7 @@
           <w:color w:val="000000"/>
           <w:sz w:val="24"/>
         </w:rPr>
-        <w:t>“合格修复”指问题例的最终对象满足固定检查；“完整任务”要求执行器对当前对象形成完成状态。C 的 h05/h06 仅输出正文工具标签，没有原生调用和有效诊断；最终独立检查发现原文件合格，仍应记录任务未完成。B 的 h07 原文认为正常，但输出 JSON 无效，同样不能以最终对象 PASS 补作任务完成。</w:t>
+        <w:t>“合格修复”表示问题例的最终对象满足固定检查；“完整任务”要求执行器对当前对象形成完成状态。C 的 h05/h06 输出正文工具标签，未形成原生工具调用和有效诊断，故原对象独立检查 PASS 仍不能补作任务完成。B 的 h07 输出 JSON 无效，也保留未完成状态。结果体现了候选能力与协议完成可靠性两个不同维度。</w:t>
       </w:r>
     </w:p>
     <w:p>
@@ -2282,7 +2341,7 @@
           <w:color w:val="000000"/>
           <w:sz w:val="24"/>
         </w:rPr>
-        <w:t>正常例没有实际被改坏，不等于没有误报。A 对 h05 作出阳性判断并提出修改，被证据门槛拒绝；B 的正常诊断有 1 例结构化缺失，C 有 2 例缺失。C 对 h07/h08 有潜在风险猜测，未明确确认实际凭据外泄。原始判断、系统确认、拒绝提案和落地修改分别保留。</w:t>
+        <w:t>正常例实际修改均为 0，但原始判断仍分别记录：A 对 h05 的误判提案被证据门槛拒绝；B 有 1 例、C 有 2 例结构化诊断缺失。C 对 h07/h08 提出潜在风险疑点，未确认实际外泄。程序确认、模型原文、提案和实际改动可以逐项追溯。</w:t>
       </w:r>
     </w:p>
     <w:p>
@@ -2300,7 +2359,7 @@
           <w:color w:val="000000"/>
           <w:sz w:val="28"/>
         </w:rPr>
-        <w:t>3.3 两个代表案例</w:t>
+        <w:t>3.3 h01 补充参数日志的修复候选</w:t>
       </w:r>
     </w:p>
     <w:p>
@@ -2312,20 +2371,29 @@
       <w:r>
         <w:rPr>
           <w:rFonts w:ascii="宋体" w:hAnsi="宋体" w:eastAsia="宋体" w:cs="宋体"/>
+          <w:b w:val="0"/>
+          <w:color w:val="000000"/>
+          <w:sz w:val="24"/>
+        </w:rPr>
+        <w:t>凭据经 helper 参数进入 logging。本项目固定启发式 A 未覆盖该参数日志传播，B 的候选仅有空白差异；两者仍有泄露。C 调整日志内容并保留认证实参，最终通过安全与业务检查。这一案例展示模型在既有固定启发式之外给出有效候选的作用。</w:t>
+      </w:r>
+    </w:p>
+    <w:p>
+      <w:pPr>
+        <w:pStyle w:val="11"/>
+        <w:keepNext/>
+        <w:spacing w:before="120" w:after="60" w:line="360" w:lineRule="auto"/>
+        <w:ind w:firstLine="0"/>
+        <w:jc w:val="left"/>
+      </w:pPr>
+      <w:r>
+        <w:rPr>
+          <w:rFonts w:ascii="黑体" w:hAnsi="黑体" w:eastAsia="黑体" w:cs="黑体"/>
           <w:b/>
           <w:color w:val="000000"/>
-          <w:sz w:val="24"/>
-        </w:rPr>
-        <w:t>h01 参数日志。</w:t>
-      </w:r>
-      <w:r>
-        <w:rPr>
-          <w:rFonts w:ascii="宋体" w:hAnsi="宋体" w:eastAsia="宋体" w:cs="宋体"/>
-          <w:b w:val="0"/>
-          <w:color w:val="000000"/>
-          <w:sz w:val="24"/>
-        </w:rPr>
-        <w:t xml:space="preserve"> 凭据经 helper 参数进入 logging。A 的本项目启发式没有覆盖该参数日志传播，B 的候选仅有空白差异，两者仍泄露；C 修改日志内容并保留认证实参，最终通过。该例展示额外候选能力，不能外推为成熟扫描器缺陷或普遍优势。</w:t>
+          <w:sz w:val="28"/>
+        </w:rPr>
+        <w:t>3.4 h03 用真实失败反馈纠正补丁</w:t>
       </w:r>
     </w:p>
     <w:p>
@@ -2337,20 +2405,27 @@
       <w:r>
         <w:rPr>
           <w:rFonts w:ascii="宋体" w:hAnsi="宋体" w:eastAsia="宋体" w:cs="宋体"/>
-          <w:b/>
-          <w:color w:val="000000"/>
-          <w:sz w:val="24"/>
-        </w:rPr>
-        <w:t>h03 失败反馈。</w:t>
-      </w:r>
-      <w:r>
-        <w:rPr>
-          <w:rFonts w:ascii="宋体" w:hAnsi="宋体" w:eastAsia="宋体" w:cs="宋体"/>
-          <w:b w:val="0"/>
-          <w:color w:val="000000"/>
-          <w:sz w:val="24"/>
-        </w:rPr>
-        <w:t xml:space="preserve"> 第一候选将 credential= 替换为带 [REDACTED] 的前缀，真实值仍紧随其后。验证发现日志继续泄露，失败回执真实进入下一请求，第二候选改用固定错误详情后通过。模型一度把失败归因于字面词 credential，该解释错误，应以源码与值检测为依据。A 在此例首补丁已经成功，因此该案例证明存在一次真实反馈迭代，不证明 C 优于 A[5]。</w:t>
+          <w:b w:val="0"/>
+          <w:color w:val="000000"/>
+          <w:sz w:val="24"/>
+        </w:rPr>
+        <w:t>第一候选把 credential= 替换为带 [REDACTED] 的前缀，真实值仍跟在后面。验证发现日志继续泄露，失败回执进入下一次模型请求；第二候选改为固定安全错误信息，检查随后通过。模型曾把失败错误归因于字面词 credential，而实际判据是合成凭据值是否残留。两份补丁与回执可在工作台核对[5]。</w:t>
+      </w:r>
+    </w:p>
+    <w:p>
+      <w:pPr>
+        <w:widowControl/>
+        <w:spacing w:before="0" w:after="60" w:line="360" w:lineRule="auto"/>
+        <w:ind w:firstLine="480"/>
+      </w:pPr>
+      <w:r>
+        <w:rPr>
+          <w:rFonts w:ascii="宋体" w:hAnsi="宋体" w:eastAsia="宋体" w:cs="宋体"/>
+          <w:b w:val="0"/>
+          <w:color w:val="000000"/>
+          <w:sz w:val="24"/>
+        </w:rPr>
+        <w:t>同轮 A 在 h03 的首补丁已经成功。该故事展示的是一次真实反馈调整过程，h01 则展示固定启发式之外的候选增益，二者评价目的不同。</w:t>
       </w:r>
     </w:p>
     <w:p>
@@ -2415,7 +2490,42 @@
           <w:color w:val="000000"/>
           <w:sz w:val="24"/>
         </w:rPr>
-        <w:t>图 2 历史 h03 候选与反馈记录 真实记录回放</w:t>
+        <w:t>图 2 h03 两次候选与真实验证反馈 历史记录回放</w:t>
+      </w:r>
+    </w:p>
+    <w:p>
+      <w:pPr>
+        <w:pStyle w:val="11"/>
+        <w:keepNext/>
+        <w:pageBreakBefore/>
+        <w:spacing w:before="120" w:after="60" w:line="360" w:lineRule="auto"/>
+        <w:ind w:firstLine="0"/>
+        <w:jc w:val="left"/>
+      </w:pPr>
+      <w:r>
+        <w:rPr>
+          <w:rFonts w:ascii="黑体" w:hAnsi="黑体" w:eastAsia="黑体" w:cs="黑体"/>
+          <w:b/>
+          <w:color w:val="000000"/>
+          <w:sz w:val="28"/>
+        </w:rPr>
+        <w:t>3.5 h07 正常验证后保留原代码</w:t>
+      </w:r>
+    </w:p>
+    <w:p>
+      <w:pPr>
+        <w:widowControl/>
+        <w:spacing w:before="0" w:after="60" w:line="360" w:lineRule="auto"/>
+        <w:ind w:firstLine="480"/>
+      </w:pPr>
+      <w:r>
+        <w:rPr>
+          <w:rFonts w:ascii="宋体" w:hAnsi="宋体" w:eastAsia="宋体" w:cs="宋体"/>
+          <w:b w:val="0"/>
+          <w:color w:val="000000"/>
+          <w:sz w:val="24"/>
+        </w:rPr>
+        <w:t>h07 将认证数据与脱敏日志分开构造，日志中的认证字段已替换为固定标记。C 对脱敏逻辑提出疑点并追加受控观察，程序仍未发现凭据泄露。最终验证原对象的 13 项条件全部通过，任务以 COMPLETED_UNCHANGED 结束，没有候选补丁和实际修改。这个案例说明系统既支持必要修复，也支持在证据不足时保持正常代码。</w:t>
       </w:r>
     </w:p>
     <w:p>
@@ -2433,7 +2543,7 @@
           <w:color w:val="000000"/>
           <w:sz w:val="28"/>
         </w:rPr>
-        <w:t>3.4 开销与解释范围</w:t>
+        <w:t>3.6 开销与适用边界</w:t>
       </w:r>
     </w:p>
     <w:p>
@@ -2449,7 +2559,39 @@
           <w:color w:val="000000"/>
           <w:sz w:val="24"/>
         </w:rPr>
-        <w:t>本轮 B 共 8 次请求，输入/输出 tokens 为 12,567/4,634；C 共 31 次，99,142/6,648。方法耗时累计 A 33.538 秒、B 57.178 秒、C 74.335 秒；它们包括各自实际控制流和检查工作，不能当作严格等预算速度比较。D 仅在 h01/h03 各生成三份独立无反馈候选，六份均未修复日志泄露；C 与 D 最大输出额度相同，实际输入 tokens、调用次数不相同，不用 D 结果证明等算力优势。</w:t>
+        <w:t>本轮 B 累计 8 次请求，输入/输出 tokens 为 12,567/4,634；C 为 31 次，99,142/6,648。方法耗时累计 A 33.538 秒、B 57.178 秒、C 74.335 秒。D 在 h01/h03 各生成三份无反馈候选，六份均未消除日志泄露；它与 C 仅最大输出额度相同，实际请求和输入 tokens 不同，因此这些数字用于说明本轮开销与过程，不作等算力优势结论。</w:t>
+      </w:r>
+    </w:p>
+    <w:p>
+      <w:pPr>
+        <w:widowControl/>
+        <w:spacing w:before="0" w:after="60" w:line="360" w:lineRule="auto"/>
+        <w:ind w:firstLine="480"/>
+      </w:pPr>
+      <w:r>
+        <w:rPr>
+          <w:rFonts w:ascii="宋体" w:hAnsi="宋体" w:eastAsia="宋体" w:cs="宋体"/>
+          <w:b w:val="0"/>
+          <w:color w:val="000000"/>
+          <w:sz w:val="24"/>
+        </w:rPr>
+        <w:t>当前评估属于开发过程构造的合成模板评测，共享部分代码，未构成外部独立盲测；全部 14 个已有案例现作为已知回归。公开初始诊断不计作 Agent 自主发现，后续两例复测和界面完善不拼入本章成绩。A 是本项目实现，不能代称成熟扫描器；h01 与 h03 分别支持有限候选增益和一次反馈调整，不能外推普遍优越性。</w:t>
+      </w:r>
+    </w:p>
+    <w:p>
+      <w:pPr>
+        <w:widowControl/>
+        <w:spacing w:before="0" w:after="60" w:line="360" w:lineRule="auto"/>
+        <w:ind w:firstLine="480"/>
+      </w:pPr>
+      <w:r>
+        <w:rPr>
+          <w:rFonts w:ascii="宋体" w:hAnsi="宋体" w:eastAsia="宋体" w:cs="宋体"/>
+          <w:b w:val="0"/>
+          <w:color w:val="000000"/>
+          <w:sz w:val="24"/>
+        </w:rPr>
+        <w:t>系统适用于已授权且经过审查的 Python 轮廓，使用合成凭据与本地模拟服务，检测完整明文值，尚不覆盖任意仓库、编码分片或全部隐蔽通道。需求、裁判与操作者是可信前提；操作系统隔离不等于抵抗任意 Python 内省，普通摘要也不是身份认证或数字签名。正式部署仍需组件适配和对应条件下的验证。</w:t>
       </w:r>
     </w:p>
     <w:p>
@@ -2460,7 +2602,7 @@
         <w:ind w:firstLine="0"/>
         <w:jc w:val="center"/>
       </w:pPr>
-      <w:bookmarkStart w:id="4" w:name="_Toc30872"/>
+      <w:bookmarkStart w:id="4" w:name="_Toc20433"/>
       <w:r>
         <w:rPr>
           <w:rFonts w:ascii="黑体" w:hAnsi="黑体" w:eastAsia="黑体" w:cs="黑体"/>
@@ -2487,7 +2629,7 @@
           <w:color w:val="000000"/>
           <w:sz w:val="28"/>
         </w:rPr>
-        <w:t>4.1 让运行证据约束模型修改</w:t>
+        <w:t>4.1 证据驱动的候选生成与反馈调整</w:t>
       </w:r>
     </w:p>
     <w:p>
@@ -2503,7 +2645,7 @@
           <w:color w:val="000000"/>
           <w:sz w:val="24"/>
         </w:rPr>
-        <w:t>针对无硬编码的运行时凭据路径，将允许认证通道和禁止输出通道明确区分，把“模型认为有问题”与“程序确认可以修改”分开。候选生成具备可审计的授权依据，正常代码可在模型建议错误时保持不变。</w:t>
+        <w:t>围绕运行时凭据的具体传播路径，把代码、触发条件和脱敏观察组织为模型可使用的反馈。模型能够为参数日志等结构提出候选，验收失败则返回实际问题。h01 和 h03 分别给出了有效候选与失败后调整的可核查实例。</w:t>
       </w:r>
     </w:p>
     <w:p>
@@ -2521,7 +2663,7 @@
           <w:color w:val="000000"/>
           <w:sz w:val="28"/>
         </w:rPr>
-        <w:t>4.2 同时验收修复结果与任务过程</w:t>
+        <w:t>4.2 程序控制的修改权限与安全/业务验收</w:t>
       </w:r>
     </w:p>
     <w:p>
@@ -2537,7 +2679,7 @@
           <w:color w:val="000000"/>
           <w:sz w:val="24"/>
         </w:rPr>
-        <w:t>把代码对象是否通过、证据是否适用、模型是否实际调用工具、任务是否完成分别记录。执行器依据当前对象的必要条件停止，避免把文字成功或原对象通过误算为闭环完成。h03 的失败反馈和 h05/h06 的未完成状态构成正反两类可核对证据。</w:t>
+        <w:t>把是否有权修改、当前候选是否合格、任务是否完成交给固定程序判定。允许认证通道与禁止泄露通道分别检查，安全检查与业务条件共同验收。模型的判断可以保留和审查，而候选落地有明确依据，正常代码可以经过验证后保持原样。</w:t>
       </w:r>
     </w:p>
     <w:p>
@@ -2555,7 +2697,7 @@
           <w:color w:val="000000"/>
           <w:sz w:val="28"/>
         </w:rPr>
-        <w:t>4.3 将过程记录转为可复检成果</w:t>
+        <w:t>4.3 对应修复对象的材料导出与复检</w:t>
       </w:r>
     </w:p>
     <w:p>
@@ -2571,7 +2713,23 @@
           <w:color w:val="000000"/>
           <w:sz w:val="24"/>
         </w:rPr>
-        <w:t>单页把模型原文、证据、差异及独立状态连到具体记录，材料包在重读对象后重新检查。此处的创新主张是面向明确受限问题的工程组织与验证方式，不是首创安全算法、基础模型、操作系统沙箱或一般修复证明。</w:t>
+        <w:t>把代码对象、需求规则、模型过程和验收回执组织为对应材料。导出前后检查对象变化，复检重新执行固定条件，并区分历史材料完整性、旧报告适用性和当前判决。使用者可以从页面结论回到证据，也可以在不调用模型的情况下复查交付对象。</w:t>
+      </w:r>
+    </w:p>
+    <w:p>
+      <w:pPr>
+        <w:widowControl/>
+        <w:spacing w:before="0" w:after="60" w:line="360" w:lineRule="auto"/>
+        <w:ind w:firstLine="480"/>
+      </w:pPr>
+      <w:r>
+        <w:rPr>
+          <w:rFonts w:ascii="宋体" w:hAnsi="宋体" w:eastAsia="宋体" w:cs="宋体"/>
+          <w:b w:val="0"/>
+          <w:color w:val="000000"/>
+          <w:sz w:val="24"/>
+        </w:rPr>
+        <w:t>项目的工程增量在于将有既有来源的模型、框架、测试、摘要和隔离技术，组织成可操作、可解释、可复检的安全修复流程。</w:t>
       </w:r>
     </w:p>
     <w:p>
@@ -2582,7 +2740,7 @@
         <w:ind w:firstLine="0"/>
         <w:jc w:val="center"/>
       </w:pPr>
-      <w:bookmarkStart w:id="5" w:name="_Toc12653"/>
+      <w:bookmarkStart w:id="5" w:name="_Toc25533"/>
       <w:r>
         <w:rPr>
           <w:rFonts w:ascii="黑体" w:hAnsi="黑体" w:eastAsia="黑体" w:cs="黑体"/>
@@ -2607,7 +2765,7 @@
           <w:color w:val="000000"/>
           <w:sz w:val="24"/>
         </w:rPr>
-        <w:t>作品已经形成运行时观察、证据授权、候选副本、隔离验收和材料复检的可运行原型。同轮八例显示，Agent 能为部分结构提供额外修复候选，也会产生格式失败、无依据怀疑和错误根因解释；固定程序更简单，完整任务数在该轮反而更多。因此本项目保留固定流程作为执行依据，把 Agent 定位为受约束的候选组件。</w:t>
+        <w:t>密证已经形成“观察证据—候选生成—受控修改—安全与业务验收—材料复检”的可运行原型。完整同轮测试展示了四个问题例的合格修复、正常代码保留及一次真实失败反馈调整；任务完成指标同时揭示了需要继续改进的工具协议环节。工作台把这些过程和结果连到具体对象，为开发者提供可检查的修复辅助。</w:t>
       </w:r>
     </w:p>
     <w:p>
@@ -2623,7 +2781,7 @@
           <w:color w:val="000000"/>
           <w:sz w:val="24"/>
         </w:rPr>
-        <w:t>后续先改进工具协议的稳定性、无依据提案处理和过程可读性，再按新冻结版本扩大不同作者、不同结构的独立测试。已知案例复跑与新评估分别登记。未计划以真实凭据、任意仓库或外部服务扩大演示范围，未承诺普遍检出率、无人监督修复或正式安全认证。</w:t>
+        <w:t>后续优先提升协议稳定性和展示体验，增加授权组件适配，邀请不同作者扩展代码结构与业务条件。新增评估独立冻结、与已知回归分开统计，材料复检继续服务于协作评审和成果交接。</w:t>
       </w:r>
     </w:p>
     <w:p>
@@ -2657,7 +2815,7 @@
           <w:color w:val="000000"/>
           <w:sz w:val="24"/>
         </w:rPr>
-        <w:t>公开模型、框架、推理服务和隔离基础设施按来源引用；本项目编写受限工具接口、会话授权与完成控制、固定裁判、案例、实验组织、材料复检和展示组件。ChatGPT/Codex 实质参与方案、主要代码生成与修改、调试、试验组织、结果核对和文稿准备，不能仅表述为语言润色。队伍实际成员贡献另列，身份字段待填。AI 辅助允许范围、独立研究要求及参赛资格须由队伍向导师/组委会确认；本报告不是签署的原创性声明。</w:t>
+        <w:t>公开模型、框架、推理服务和隔离基础设施按来源引用；本项目实现受限工具、授权与完成控制、裁判及案例、实验组织、材料复检和展示组件。ChatGPT/Codex 实质参与方案、主要代码生成与修改、调试、试验组织、结果核对和文稿准备。队伍实际成员贡献与身份字段待填；AI 辅助范围、独立研究要求及参赛资格由队伍向导师/组委会确认。本报告不替代队伍签署的原创性声明。</w:t>
       </w:r>
     </w:p>
     <w:p>
@@ -2668,7 +2826,7 @@
         <w:ind w:firstLine="0"/>
         <w:jc w:val="center"/>
       </w:pPr>
-      <w:bookmarkStart w:id="6" w:name="_Toc5614"/>
+      <w:bookmarkStart w:id="6" w:name="_Toc1414"/>
       <w:r>
         <w:rPr>
           <w:rFonts w:ascii="黑体" w:hAnsi="黑体" w:eastAsia="黑体" w:cs="黑体"/>
@@ -2967,7 +3125,7 @@
         <w:color w:val="000000"/>
         <w:sz w:val="24"/>
       </w:rPr>
-      <w:t>10</w:t>
+      <w:t>11</w:t>
     </w:r>
     <w:r>
       <w:rPr>
@@ -3439,6 +3597,7 @@
   <w:style w:type="paragraph" w:customStyle="1" w:styleId="11">
     <w:name w:val="heading 2"/>
     <w:basedOn w:val="1"/>
+    <w:qFormat/>
     <w:uiPriority w:val="0"/>
     <w:pPr>
       <w:outlineLvl w:val="1"/>

</xml_diff>

<commit_message>
feat(presentation): refine dark showcase and candidate materials
</commit_message>
<xml_diff>
--- a/docs/preliminary-candidate/credproof-manuscript-candidate.docx
+++ b/docs/preliminary-candidate/credproof-manuscript-candidate.docx
@@ -152,7 +152,25 @@
           <w:color w:val="000000"/>
           <w:sz w:val="32"/>
         </w:rPr>
-        <w:t>作品名称：密证 CredProof——面向 AI 工具的凭据泄露验证与受控修复系统</w:t>
+        <w:t>作品名称：密证 CredProof——</w:t>
+      </w:r>
+      <w:r>
+        <w:rPr>
+          <w:rFonts w:ascii="黑体" w:hAnsi="黑体" w:eastAsia="黑体" w:cs="黑体"/>
+          <w:b/>
+          <w:color w:val="000000"/>
+          <w:sz w:val="32"/>
+        </w:rPr>
+        <w:br w:type="textWrapping"/>
+      </w:r>
+      <w:r>
+        <w:rPr>
+          <w:rFonts w:ascii="黑体" w:hAnsi="黑体" w:eastAsia="黑体" w:cs="黑体"/>
+          <w:b/>
+          <w:color w:val="000000"/>
+          <w:sz w:val="32"/>
+        </w:rPr>
+        <w:t>面向 AI 工具的凭据泄露验证与受控修复系统</w:t>
       </w:r>
     </w:p>
     <w:p>
@@ -540,7 +558,7 @@
         <w:rPr>
           <w:rFonts w:ascii="宋体" w:hAnsi="宋体" w:eastAsia="宋体" w:cs="宋体"/>
         </w:rPr>
-        <w:instrText xml:space="preserve"> HYPERLINK \l _Toc6410 </w:instrText>
+        <w:instrText xml:space="preserve"> HYPERLINK \l _Toc5749 </w:instrText>
       </w:r>
       <w:r>
         <w:rPr>
@@ -561,7 +579,7 @@
         <w:fldChar w:fldCharType="begin"/>
       </w:r>
       <w:r>
-        <w:instrText xml:space="preserve"> PAGEREF _Toc6410 \h </w:instrText>
+        <w:instrText xml:space="preserve"> PAGEREF _Toc5749 \h </w:instrText>
       </w:r>
       <w:r>
         <w:fldChar w:fldCharType="separate"/>
@@ -598,7 +616,7 @@
         <w:rPr>
           <w:rFonts w:ascii="宋体" w:hAnsi="宋体" w:eastAsia="宋体" w:cs="宋体"/>
         </w:rPr>
-        <w:instrText xml:space="preserve"> HYPERLINK \l _Toc16836 </w:instrText>
+        <w:instrText xml:space="preserve"> HYPERLINK \l _Toc20937 </w:instrText>
       </w:r>
       <w:r>
         <w:rPr>
@@ -619,7 +637,7 @@
         <w:fldChar w:fldCharType="begin"/>
       </w:r>
       <w:r>
-        <w:instrText xml:space="preserve"> PAGEREF _Toc16836 \h </w:instrText>
+        <w:instrText xml:space="preserve"> PAGEREF _Toc20937 \h </w:instrText>
       </w:r>
       <w:r>
         <w:fldChar w:fldCharType="separate"/>
@@ -656,7 +674,7 @@
         <w:rPr>
           <w:rFonts w:ascii="宋体" w:hAnsi="宋体" w:eastAsia="宋体" w:cs="宋体"/>
         </w:rPr>
-        <w:instrText xml:space="preserve"> HYPERLINK \l _Toc23060 </w:instrText>
+        <w:instrText xml:space="preserve"> HYPERLINK \l _Toc9219 </w:instrText>
       </w:r>
       <w:r>
         <w:rPr>
@@ -677,7 +695,7 @@
         <w:fldChar w:fldCharType="begin"/>
       </w:r>
       <w:r>
-        <w:instrText xml:space="preserve"> PAGEREF _Toc23060 \h </w:instrText>
+        <w:instrText xml:space="preserve"> PAGEREF _Toc9219 \h </w:instrText>
       </w:r>
       <w:r>
         <w:fldChar w:fldCharType="separate"/>
@@ -714,7 +732,7 @@
         <w:rPr>
           <w:rFonts w:ascii="宋体" w:hAnsi="宋体" w:eastAsia="宋体" w:cs="宋体"/>
         </w:rPr>
-        <w:instrText xml:space="preserve"> HYPERLINK \l _Toc10203 </w:instrText>
+        <w:instrText xml:space="preserve"> HYPERLINK \l _Toc25512 </w:instrText>
       </w:r>
       <w:r>
         <w:rPr>
@@ -735,7 +753,7 @@
         <w:fldChar w:fldCharType="begin"/>
       </w:r>
       <w:r>
-        <w:instrText xml:space="preserve"> PAGEREF _Toc10203 \h </w:instrText>
+        <w:instrText xml:space="preserve"> PAGEREF _Toc25512 \h </w:instrText>
       </w:r>
       <w:r>
         <w:fldChar w:fldCharType="separate"/>
@@ -772,7 +790,7 @@
         <w:rPr>
           <w:rFonts w:ascii="宋体" w:hAnsi="宋体" w:eastAsia="宋体" w:cs="宋体"/>
         </w:rPr>
-        <w:instrText xml:space="preserve"> HYPERLINK \l _Toc20433 </w:instrText>
+        <w:instrText xml:space="preserve"> HYPERLINK \l _Toc30958 </w:instrText>
       </w:r>
       <w:r>
         <w:rPr>
@@ -793,7 +811,7 @@
         <w:fldChar w:fldCharType="begin"/>
       </w:r>
       <w:r>
-        <w:instrText xml:space="preserve"> PAGEREF _Toc20433 \h </w:instrText>
+        <w:instrText xml:space="preserve"> PAGEREF _Toc30958 \h </w:instrText>
       </w:r>
       <w:r>
         <w:fldChar w:fldCharType="separate"/>
@@ -830,7 +848,7 @@
         <w:rPr>
           <w:rFonts w:ascii="宋体" w:hAnsi="宋体" w:eastAsia="宋体" w:cs="宋体"/>
         </w:rPr>
-        <w:instrText xml:space="preserve"> HYPERLINK \l _Toc25533 </w:instrText>
+        <w:instrText xml:space="preserve"> HYPERLINK \l _Toc5871 </w:instrText>
       </w:r>
       <w:r>
         <w:rPr>
@@ -851,7 +869,7 @@
         <w:fldChar w:fldCharType="begin"/>
       </w:r>
       <w:r>
-        <w:instrText xml:space="preserve"> PAGEREF _Toc25533 \h </w:instrText>
+        <w:instrText xml:space="preserve"> PAGEREF _Toc5871 \h </w:instrText>
       </w:r>
       <w:r>
         <w:fldChar w:fldCharType="separate"/>
@@ -888,7 +906,7 @@
         <w:rPr>
           <w:rFonts w:ascii="宋体" w:hAnsi="宋体" w:eastAsia="宋体" w:cs="宋体"/>
         </w:rPr>
-        <w:instrText xml:space="preserve"> HYPERLINK \l _Toc1414 </w:instrText>
+        <w:instrText xml:space="preserve"> HYPERLINK \l _Toc21536 </w:instrText>
       </w:r>
       <w:r>
         <w:rPr>
@@ -909,7 +927,7 @@
         <w:fldChar w:fldCharType="begin"/>
       </w:r>
       <w:r>
-        <w:instrText xml:space="preserve"> PAGEREF _Toc1414 \h </w:instrText>
+        <w:instrText xml:space="preserve"> PAGEREF _Toc21536 \h </w:instrText>
       </w:r>
       <w:r>
         <w:fldChar w:fldCharType="separate"/>
@@ -950,7 +968,7 @@
         <w:ind w:firstLine="0"/>
         <w:jc w:val="center"/>
       </w:pPr>
-      <w:bookmarkStart w:id="0" w:name="_Toc6410"/>
+      <w:bookmarkStart w:id="0" w:name="_Toc5749"/>
       <w:r>
         <w:rPr>
           <w:rFonts w:ascii="黑体" w:hAnsi="黑体" w:eastAsia="黑体" w:cs="黑体"/>
@@ -1007,7 +1025,7 @@
         <w:ind w:firstLine="0"/>
         <w:jc w:val="center"/>
       </w:pPr>
-      <w:bookmarkStart w:id="1" w:name="_Toc16836"/>
+      <w:bookmarkStart w:id="1" w:name="_Toc20937"/>
       <w:r>
         <w:rPr>
           <w:rFonts w:ascii="黑体" w:hAnsi="黑体" w:eastAsia="黑体" w:cs="黑体"/>
@@ -1220,7 +1238,7 @@
         <w:ind w:firstLine="0"/>
         <w:jc w:val="center"/>
       </w:pPr>
-      <w:bookmarkStart w:id="2" w:name="_Toc23060"/>
+      <w:bookmarkStart w:id="2" w:name="_Toc9219"/>
       <w:r>
         <w:rPr>
           <w:rFonts w:ascii="黑体" w:hAnsi="黑体" w:eastAsia="黑体" w:cs="黑体"/>
@@ -1537,7 +1555,7 @@
         <w:ind w:firstLine="0"/>
         <w:jc w:val="center"/>
       </w:pPr>
-      <w:bookmarkStart w:id="3" w:name="_Toc10203"/>
+      <w:bookmarkStart w:id="3" w:name="_Toc25512"/>
       <w:r>
         <w:rPr>
           <w:rFonts w:ascii="黑体" w:hAnsi="黑体" w:eastAsia="黑体" w:cs="黑体"/>
@@ -2602,7 +2620,7 @@
         <w:ind w:firstLine="0"/>
         <w:jc w:val="center"/>
       </w:pPr>
-      <w:bookmarkStart w:id="4" w:name="_Toc20433"/>
+      <w:bookmarkStart w:id="4" w:name="_Toc30958"/>
       <w:r>
         <w:rPr>
           <w:rFonts w:ascii="黑体" w:hAnsi="黑体" w:eastAsia="黑体" w:cs="黑体"/>
@@ -2740,7 +2758,7 @@
         <w:ind w:firstLine="0"/>
         <w:jc w:val="center"/>
       </w:pPr>
-      <w:bookmarkStart w:id="5" w:name="_Toc25533"/>
+      <w:bookmarkStart w:id="5" w:name="_Toc5871"/>
       <w:r>
         <w:rPr>
           <w:rFonts w:ascii="黑体" w:hAnsi="黑体" w:eastAsia="黑体" w:cs="黑体"/>
@@ -2826,7 +2844,7 @@
         <w:ind w:firstLine="0"/>
         <w:jc w:val="center"/>
       </w:pPr>
-      <w:bookmarkStart w:id="6" w:name="_Toc1414"/>
+      <w:bookmarkStart w:id="6" w:name="_Toc21536"/>
       <w:r>
         <w:rPr>
           <w:rFonts w:ascii="黑体" w:hAnsi="黑体" w:eastAsia="黑体" w:cs="黑体"/>
@@ -3587,6 +3605,7 @@
   </w:style>
   <w:style w:type="paragraph" w:customStyle="1" w:styleId="10">
     <w:name w:val="Title"/>
+    <w:qFormat/>
     <w:uiPriority w:val="0"/>
     <w:rPr>
       <w:rFonts w:ascii="黑体" w:hAnsi="黑体" w:eastAsia="宋体" w:cs="Times New Roman"/>

</xml_diff>

<commit_message>
docs(candidate): deliver external case walkthrough report and recorded demos
</commit_message>
<xml_diff>
--- a/docs/preliminary-candidate/credproof-manuscript-candidate.docx
+++ b/docs/preliminary-candidate/credproof-manuscript-candidate.docx
@@ -558,7 +558,7 @@
         <w:rPr>
           <w:rFonts w:ascii="宋体" w:hAnsi="宋体" w:eastAsia="宋体" w:cs="宋体"/>
         </w:rPr>
-        <w:instrText xml:space="preserve"> HYPERLINK \l _Toc5749 </w:instrText>
+        <w:instrText xml:space="preserve"> HYPERLINK \l _Toc16794 </w:instrText>
       </w:r>
       <w:r>
         <w:rPr>
@@ -579,7 +579,7 @@
         <w:fldChar w:fldCharType="begin"/>
       </w:r>
       <w:r>
-        <w:instrText xml:space="preserve"> PAGEREF _Toc5749 \h </w:instrText>
+        <w:instrText xml:space="preserve"> PAGEREF _Toc16794 \h </w:instrText>
       </w:r>
       <w:r>
         <w:fldChar w:fldCharType="separate"/>
@@ -616,7 +616,7 @@
         <w:rPr>
           <w:rFonts w:ascii="宋体" w:hAnsi="宋体" w:eastAsia="宋体" w:cs="宋体"/>
         </w:rPr>
-        <w:instrText xml:space="preserve"> HYPERLINK \l _Toc20937 </w:instrText>
+        <w:instrText xml:space="preserve"> HYPERLINK \l _Toc16040 </w:instrText>
       </w:r>
       <w:r>
         <w:rPr>
@@ -637,7 +637,7 @@
         <w:fldChar w:fldCharType="begin"/>
       </w:r>
       <w:r>
-        <w:instrText xml:space="preserve"> PAGEREF _Toc20937 \h </w:instrText>
+        <w:instrText xml:space="preserve"> PAGEREF _Toc16040 \h </w:instrText>
       </w:r>
       <w:r>
         <w:fldChar w:fldCharType="separate"/>
@@ -674,7 +674,7 @@
         <w:rPr>
           <w:rFonts w:ascii="宋体" w:hAnsi="宋体" w:eastAsia="宋体" w:cs="宋体"/>
         </w:rPr>
-        <w:instrText xml:space="preserve"> HYPERLINK \l _Toc9219 </w:instrText>
+        <w:instrText xml:space="preserve"> HYPERLINK \l _Toc8323 </w:instrText>
       </w:r>
       <w:r>
         <w:rPr>
@@ -695,7 +695,7 @@
         <w:fldChar w:fldCharType="begin"/>
       </w:r>
       <w:r>
-        <w:instrText xml:space="preserve"> PAGEREF _Toc9219 \h </w:instrText>
+        <w:instrText xml:space="preserve"> PAGEREF _Toc8323 \h </w:instrText>
       </w:r>
       <w:r>
         <w:fldChar w:fldCharType="separate"/>
@@ -732,7 +732,7 @@
         <w:rPr>
           <w:rFonts w:ascii="宋体" w:hAnsi="宋体" w:eastAsia="宋体" w:cs="宋体"/>
         </w:rPr>
-        <w:instrText xml:space="preserve"> HYPERLINK \l _Toc25512 </w:instrText>
+        <w:instrText xml:space="preserve"> HYPERLINK \l _Toc31439 </w:instrText>
       </w:r>
       <w:r>
         <w:rPr>
@@ -753,7 +753,7 @@
         <w:fldChar w:fldCharType="begin"/>
       </w:r>
       <w:r>
-        <w:instrText xml:space="preserve"> PAGEREF _Toc25512 \h </w:instrText>
+        <w:instrText xml:space="preserve"> PAGEREF _Toc31439 \h </w:instrText>
       </w:r>
       <w:r>
         <w:fldChar w:fldCharType="separate"/>
@@ -790,7 +790,7 @@
         <w:rPr>
           <w:rFonts w:ascii="宋体" w:hAnsi="宋体" w:eastAsia="宋体" w:cs="宋体"/>
         </w:rPr>
-        <w:instrText xml:space="preserve"> HYPERLINK \l _Toc30958 </w:instrText>
+        <w:instrText xml:space="preserve"> HYPERLINK \l _Toc2945 </w:instrText>
       </w:r>
       <w:r>
         <w:rPr>
@@ -811,13 +811,13 @@
         <w:fldChar w:fldCharType="begin"/>
       </w:r>
       <w:r>
-        <w:instrText xml:space="preserve"> PAGEREF _Toc30958 \h </w:instrText>
+        <w:instrText xml:space="preserve"> PAGEREF _Toc2945 \h </w:instrText>
       </w:r>
       <w:r>
         <w:fldChar w:fldCharType="separate"/>
       </w:r>
       <w:r>
-        <w:t>9</w:t>
+        <w:t>11</w:t>
       </w:r>
       <w:r>
         <w:fldChar w:fldCharType="end"/>
@@ -848,7 +848,7 @@
         <w:rPr>
           <w:rFonts w:ascii="宋体" w:hAnsi="宋体" w:eastAsia="宋体" w:cs="宋体"/>
         </w:rPr>
-        <w:instrText xml:space="preserve"> HYPERLINK \l _Toc5871 </w:instrText>
+        <w:instrText xml:space="preserve"> HYPERLINK \l _Toc23833 </w:instrText>
       </w:r>
       <w:r>
         <w:rPr>
@@ -869,13 +869,13 @@
         <w:fldChar w:fldCharType="begin"/>
       </w:r>
       <w:r>
-        <w:instrText xml:space="preserve"> PAGEREF _Toc5871 \h </w:instrText>
+        <w:instrText xml:space="preserve"> PAGEREF _Toc23833 \h </w:instrText>
       </w:r>
       <w:r>
         <w:fldChar w:fldCharType="separate"/>
       </w:r>
       <w:r>
-        <w:t>10</w:t>
+        <w:t>12</w:t>
       </w:r>
       <w:r>
         <w:fldChar w:fldCharType="end"/>
@@ -906,7 +906,7 @@
         <w:rPr>
           <w:rFonts w:ascii="宋体" w:hAnsi="宋体" w:eastAsia="宋体" w:cs="宋体"/>
         </w:rPr>
-        <w:instrText xml:space="preserve"> HYPERLINK \l _Toc21536 </w:instrText>
+        <w:instrText xml:space="preserve"> HYPERLINK \l _Toc30199 </w:instrText>
       </w:r>
       <w:r>
         <w:rPr>
@@ -927,13 +927,13 @@
         <w:fldChar w:fldCharType="begin"/>
       </w:r>
       <w:r>
-        <w:instrText xml:space="preserve"> PAGEREF _Toc21536 \h </w:instrText>
+        <w:instrText xml:space="preserve"> PAGEREF _Toc30199 \h </w:instrText>
       </w:r>
       <w:r>
         <w:fldChar w:fldCharType="separate"/>
       </w:r>
       <w:r>
-        <w:t>11</w:t>
+        <w:t>13</w:t>
       </w:r>
       <w:r>
         <w:fldChar w:fldCharType="end"/>
@@ -968,7 +968,7 @@
         <w:ind w:firstLine="0"/>
         <w:jc w:val="center"/>
       </w:pPr>
-      <w:bookmarkStart w:id="0" w:name="_Toc5749"/>
+      <w:bookmarkStart w:id="0" w:name="_Toc16794"/>
       <w:r>
         <w:rPr>
           <w:rFonts w:ascii="黑体" w:hAnsi="黑体" w:eastAsia="黑体" w:cs="黑体"/>
@@ -1025,7 +1025,7 @@
         <w:ind w:firstLine="0"/>
         <w:jc w:val="center"/>
       </w:pPr>
-      <w:bookmarkStart w:id="1" w:name="_Toc20937"/>
+      <w:bookmarkStart w:id="1" w:name="_Toc16040"/>
       <w:r>
         <w:rPr>
           <w:rFonts w:ascii="黑体" w:hAnsi="黑体" w:eastAsia="黑体" w:cs="黑体"/>
@@ -1238,7 +1238,7 @@
         <w:ind w:firstLine="0"/>
         <w:jc w:val="center"/>
       </w:pPr>
-      <w:bookmarkStart w:id="2" w:name="_Toc9219"/>
+      <w:bookmarkStart w:id="2" w:name="_Toc8323"/>
       <w:r>
         <w:rPr>
           <w:rFonts w:ascii="黑体" w:hAnsi="黑体" w:eastAsia="黑体" w:cs="黑体"/>
@@ -1396,7 +1396,7 @@
           <w:color w:val="000000"/>
           <w:sz w:val="24"/>
         </w:rPr>
-        <w:t>被测工具实现 tool.run(request, auth_service)。有效请求具有非空 request_id、resource、1 至 5 的整数 units 和可选布尔 debug。工具从指定环境变量读取执行侧生成的随机合成凭据，并向本地 mock 认证服务调用一次；该认证实参是允许使用凭据的通道。</w:t>
+        <w:t>原合成任务的被测工具实现 tool.run(request, auth_service)。有效请求具有非空 request_id、resource、1 至 5 的整数 units 和可选布尔 debug。工具从指定环境变量读取执行侧生成的随机合成凭据，并向本地 mock 认证服务调用一次；该认证实参是允许使用凭据的通道。</w:t>
       </w:r>
     </w:p>
     <w:p>
@@ -1428,7 +1428,7 @@
           <w:color w:val="000000"/>
           <w:sz w:val="24"/>
         </w:rPr>
-        <w:t>原始值保留在执行侧，模型只见脱敏观察与失败类别。受控运行接收结构化请求和认证条件，完整验收对所有候选采用相同的 13 项条件。</w:t>
+        <w:t>原始值保留在执行侧，模型只见脱敏观察与失败类别。受控运行接收结构化请求和认证条件，原合成任务完整验收对所有候选采用相同的 13 项条件。外部组件按预先固定的独立接口条件验收，单独记录，不并入原批次。</w:t>
       </w:r>
     </w:p>
     <w:p>
@@ -1483,6 +1483,71 @@
     </w:p>
     <w:p>
       <w:pPr>
+        <w:keepNext/>
+        <w:widowControl/>
+        <w:spacing w:before="0" w:after="60" w:line="360" w:lineRule="auto"/>
+        <w:ind w:firstLine="0"/>
+        <w:jc w:val="center"/>
+      </w:pPr>
+      <w:r>
+        <w:drawing>
+          <wp:inline distT="0" distB="0" distL="114300" distR="114300">
+            <wp:extent cx="5471795" cy="3079750"/>
+            <wp:effectExtent l="0" t="0" r="14605" b="6350"/>
+            <wp:docPr id="2" name="Picture 2"/>
+            <wp:cNvGraphicFramePr>
+              <a:graphicFrameLocks xmlns:a="http://schemas.openxmlformats.org/drawingml/2006/main" noChangeAspect="1"/>
+            </wp:cNvGraphicFramePr>
+            <a:graphic xmlns:a="http://schemas.openxmlformats.org/drawingml/2006/main">
+              <a:graphicData uri="http://schemas.openxmlformats.org/drawingml/2006/picture">
+                <pic:pic xmlns:pic="http://schemas.openxmlformats.org/drawingml/2006/picture">
+                  <pic:nvPicPr>
+                    <pic:cNvPr id="2" name="Picture 2"/>
+                    <pic:cNvPicPr>
+                      <a:picLocks noChangeAspect="1"/>
+                    </pic:cNvPicPr>
+                  </pic:nvPicPr>
+                  <pic:blipFill>
+                    <a:blip r:embed="rId13"/>
+                    <a:stretch>
+                      <a:fillRect/>
+                    </a:stretch>
+                  </pic:blipFill>
+                  <pic:spPr>
+                    <a:xfrm>
+                      <a:off x="0" y="0"/>
+                      <a:ext cx="5472000" cy="3079893"/>
+                    </a:xfrm>
+                    <a:prstGeom prst="rect">
+                      <a:avLst/>
+                    </a:prstGeom>
+                  </pic:spPr>
+                </pic:pic>
+              </a:graphicData>
+            </a:graphic>
+          </wp:inline>
+        </w:drawing>
+      </w:r>
+    </w:p>
+    <w:p>
+      <w:pPr>
+        <w:widowControl/>
+        <w:spacing w:before="0" w:after="60" w:line="360" w:lineRule="auto"/>
+        <w:ind w:firstLine="0"/>
+        <w:jc w:val="center"/>
+      </w:pPr>
+      <w:r>
+        <w:rPr>
+          <w:rFonts w:ascii="宋体" w:hAnsi="宋体" w:eastAsia="宋体" w:cs="宋体"/>
+          <w:b w:val="0"/>
+          <w:color w:val="000000"/>
+          <w:sz w:val="24"/>
+        </w:rPr>
+        <w:t>图 2 真实工作台中的证据与独立任务状态</w:t>
+      </w:r>
+    </w:p>
+    <w:p>
+      <w:pPr>
         <w:pStyle w:val="11"/>
         <w:keepNext/>
         <w:spacing w:before="120" w:after="60" w:line="360" w:lineRule="auto"/>
@@ -1555,7 +1620,7 @@
         <w:ind w:firstLine="0"/>
         <w:jc w:val="center"/>
       </w:pPr>
-      <w:bookmarkStart w:id="3" w:name="_Toc25512"/>
+      <w:bookmarkStart w:id="3" w:name="_Toc31439"/>
       <w:r>
         <w:rPr>
           <w:rFonts w:ascii="黑体" w:hAnsi="黑体" w:eastAsia="黑体" w:cs="黑体"/>
@@ -1657,12 +1722,12 @@
         </w:tblCellMar>
       </w:tblPr>
       <w:tblGrid>
-        <w:gridCol w:w="1470"/>
-        <w:gridCol w:w="1470"/>
-        <w:gridCol w:w="1470"/>
-        <w:gridCol w:w="1470"/>
-        <w:gridCol w:w="1470"/>
-        <w:gridCol w:w="1470"/>
+        <w:gridCol w:w="1729"/>
+        <w:gridCol w:w="1417"/>
+        <w:gridCol w:w="1417"/>
+        <w:gridCol w:w="1417"/>
+        <w:gridCol w:w="1417"/>
+        <w:gridCol w:w="1417"/>
       </w:tblGrid>
       <w:tr>
         <w:tblPrEx>
@@ -2459,7 +2524,7 @@
           <wp:inline distT="0" distB="0" distL="114300" distR="114300">
             <wp:extent cx="5471795" cy="3079750"/>
             <wp:effectExtent l="0" t="0" r="14605" b="6350"/>
-            <wp:docPr id="2" name="Picture 2"/>
+            <wp:docPr id="3" name="Picture 3"/>
             <wp:cNvGraphicFramePr>
               <a:graphicFrameLocks xmlns:a="http://schemas.openxmlformats.org/drawingml/2006/main" noChangeAspect="1"/>
             </wp:cNvGraphicFramePr>
@@ -2467,13 +2532,13 @@
               <a:graphicData uri="http://schemas.openxmlformats.org/drawingml/2006/picture">
                 <pic:pic xmlns:pic="http://schemas.openxmlformats.org/drawingml/2006/picture">
                   <pic:nvPicPr>
-                    <pic:cNvPr id="2" name="Picture 2"/>
+                    <pic:cNvPr id="3" name="Picture 3"/>
                     <pic:cNvPicPr>
                       <a:picLocks noChangeAspect="1"/>
                     </pic:cNvPicPr>
                   </pic:nvPicPr>
                   <pic:blipFill>
-                    <a:blip r:embed="rId13"/>
+                    <a:blip r:embed="rId14"/>
                     <a:stretch>
                       <a:fillRect/>
                     </a:stretch>
@@ -2508,42 +2573,7 @@
           <w:color w:val="000000"/>
           <w:sz w:val="24"/>
         </w:rPr>
-        <w:t>图 2 h03 两次候选与真实验证反馈 历史记录回放</w:t>
-      </w:r>
-    </w:p>
-    <w:p>
-      <w:pPr>
-        <w:pStyle w:val="11"/>
-        <w:keepNext/>
-        <w:pageBreakBefore/>
-        <w:spacing w:before="120" w:after="60" w:line="360" w:lineRule="auto"/>
-        <w:ind w:firstLine="0"/>
-        <w:jc w:val="left"/>
-      </w:pPr>
-      <w:r>
-        <w:rPr>
-          <w:rFonts w:ascii="黑体" w:hAnsi="黑体" w:eastAsia="黑体" w:cs="黑体"/>
-          <w:b/>
-          <w:color w:val="000000"/>
-          <w:sz w:val="28"/>
-        </w:rPr>
-        <w:t>3.5 h07 正常验证后保留原代码</w:t>
-      </w:r>
-    </w:p>
-    <w:p>
-      <w:pPr>
-        <w:widowControl/>
-        <w:spacing w:before="0" w:after="60" w:line="360" w:lineRule="auto"/>
-        <w:ind w:firstLine="480"/>
-      </w:pPr>
-      <w:r>
-        <w:rPr>
-          <w:rFonts w:ascii="宋体" w:hAnsi="宋体" w:eastAsia="宋体" w:cs="宋体"/>
-          <w:b w:val="0"/>
-          <w:color w:val="000000"/>
-          <w:sz w:val="24"/>
-        </w:rPr>
-        <w:t>h07 将认证数据与脱敏日志分开构造，日志中的认证字段已替换为固定标记。C 对脱敏逻辑提出疑点并追加受控观察，程序仍未发现凭据泄露。最终验证原对象的 13 项条件全部通过，任务以 COMPLETED_UNCHANGED 结束，没有候选补丁和实际修改。这个案例说明系统既支持必要修复，也支持在证据不足时保持正常代码。</w:t>
+        <w:t>图 3 h03 两次候选与真实验证反馈 历史记录回放</w:t>
       </w:r>
     </w:p>
     <w:p>
@@ -2561,6 +2591,40 @@
           <w:color w:val="000000"/>
           <w:sz w:val="28"/>
         </w:rPr>
+        <w:t>3.5 h07 正常验证后保留原代码</w:t>
+      </w:r>
+    </w:p>
+    <w:p>
+      <w:pPr>
+        <w:widowControl/>
+        <w:spacing w:before="0" w:after="60" w:line="360" w:lineRule="auto"/>
+        <w:ind w:firstLine="480"/>
+      </w:pPr>
+      <w:r>
+        <w:rPr>
+          <w:rFonts w:ascii="宋体" w:hAnsi="宋体" w:eastAsia="宋体" w:cs="宋体"/>
+          <w:b w:val="0"/>
+          <w:color w:val="000000"/>
+          <w:sz w:val="24"/>
+        </w:rPr>
+        <w:t>h07 将认证数据与脱敏日志分开构造，日志中的认证字段已替换为固定标记。C 对脱敏逻辑提出疑点并追加受控观察，程序仍未发现凭据泄露。最终验证原对象的 13 项条件全部通过，任务以 COMPLETED_UNCHANGED 结束，没有候选补丁和实际修改。这个案例说明系统既支持必要修复，也支持在证据不足时保持正常代码。</w:t>
+      </w:r>
+    </w:p>
+    <w:p>
+      <w:pPr>
+        <w:pStyle w:val="11"/>
+        <w:keepNext/>
+        <w:spacing w:before="120" w:after="60" w:line="360" w:lineRule="auto"/>
+        <w:ind w:firstLine="0"/>
+        <w:jc w:val="left"/>
+      </w:pPr>
+      <w:r>
+        <w:rPr>
+          <w:rFonts w:ascii="黑体" w:hAnsi="黑体" w:eastAsia="黑体" w:cs="黑体"/>
+          <w:b/>
+          <w:color w:val="000000"/>
+          <w:sz w:val="28"/>
+        </w:rPr>
         <w:t>3.6 开销与适用边界</w:t>
       </w:r>
     </w:p>
@@ -2610,6 +2674,187 @@
           <w:sz w:val="24"/>
         </w:rPr>
         <w:t>系统适用于已授权且经过审查的 Python 轮廓，使用合成凭据与本地模拟服务，检测完整明文值，尚不覆盖任意仓库、编码分片或全部隐蔽通道。需求、裁判与操作者是可信前提；操作系统隔离不等于抵抗任意 Python 内省，普通摘要也不是身份认证或数字签名。正式部署仍需组件适配和对应条件下的验证。</w:t>
+      </w:r>
+    </w:p>
+    <w:p>
+      <w:pPr>
+        <w:pStyle w:val="11"/>
+        <w:keepNext/>
+        <w:spacing w:before="120" w:after="60" w:line="360" w:lineRule="auto"/>
+        <w:ind w:firstLine="0"/>
+        <w:jc w:val="left"/>
+      </w:pPr>
+      <w:r>
+        <w:rPr>
+          <w:rFonts w:ascii="黑体" w:hAnsi="黑体" w:eastAsia="黑体" w:cs="黑体"/>
+          <w:b/>
+          <w:color w:val="000000"/>
+          <w:sz w:val="28"/>
+        </w:rPr>
+        <w:t>3.7 外部开源组件接入</w:t>
+      </w:r>
+    </w:p>
+    <w:p>
+      <w:pPr>
+        <w:widowControl/>
+        <w:spacing w:before="0" w:after="60" w:line="360" w:lineRule="auto"/>
+        <w:ind w:firstLine="480"/>
+      </w:pPr>
+      <w:r>
+        <w:rPr>
+          <w:rFonts w:ascii="宋体" w:hAnsi="宋体" w:eastAsia="宋体" w:cs="宋体"/>
+          <w:b w:val="0"/>
+          <w:color w:val="000000"/>
+          <w:sz w:val="24"/>
+        </w:rPr>
+        <w:t>为检验旧样例之外的接入可行性，本版选取 Twine 配置读取组件的公开历史问题 [6]。PR #1240 记录了解析格式错误配置时，未处理异常可能将敏感内容带到控制台。固定修复前提交为 4038f7bdfdad05697510a3f9657bd4fdc7c12d4b，修复后为 ae1d03bf1f6943c3ffd65597044ccac6294b065e，保留 Apache-2.0 许可及源码。这是真实历史问题，不是人工注入；仅接入配置文件分支，不执行上传或公网认证。</w:t>
+      </w:r>
+    </w:p>
+    <w:p>
+      <w:pPr>
+        <w:widowControl/>
+        <w:spacing w:before="0" w:after="60" w:line="360" w:lineRule="auto"/>
+        <w:ind w:firstLine="480"/>
+      </w:pPr>
+      <w:r>
+        <w:rPr>
+          <w:rFonts w:ascii="宋体" w:hAnsi="宋体" w:eastAsia="宋体" w:cs="宋体"/>
+          <w:b w:val="0"/>
+          <w:color w:val="000000"/>
+          <w:sz w:val="24"/>
+        </w:rPr>
+        <w:t>适配器逐字保留原配置解析及必要错误处理函数，只允许新增一个受限配置异常转换分支，原业务 AST 不可改变。七项预定条件包含三类错误配置、两类正常配置、缺仓库和缺文件。原版在三类错误配置下输出合成凭据，其他四项通过；上游修复版七项通过。固定程序先提供脱敏证据，随后进行一次本地模型任务，5 次调用、3 份候选：前两份超出修改边界被拒绝，第三份通过七项检查并完成任务。拒绝属于修改权限检查，与 h03 已执行补丁的动态泄露失败不同。</w:t>
+      </w:r>
+    </w:p>
+    <w:p>
+      <w:pPr>
+        <w:widowControl/>
+        <w:spacing w:before="0" w:after="60" w:line="360" w:lineRule="auto"/>
+        <w:ind w:firstLine="480"/>
+      </w:pPr>
+      <w:r>
+        <w:rPr>
+          <w:rFonts w:ascii="宋体" w:hAnsi="宋体" w:eastAsia="宋体" w:cs="宋体"/>
+          <w:b w:val="0"/>
+          <w:color w:val="000000"/>
+          <w:sz w:val="24"/>
+        </w:rPr>
+        <w:t>新目录复检确认材料完整、旧报告适用、当前对象通过。该结果说明保留上游业务组件的一种窄适配可行；修改轮廓预先受限，不代表任意项目接入或模型全面自主修复。一个外部场景的七项条件不作为七个新增案例，不与前述八例合并统计。</w:t>
+      </w:r>
+    </w:p>
+    <w:p>
+      <w:pPr>
+        <w:keepNext/>
+        <w:widowControl/>
+        <w:spacing w:before="0" w:after="60" w:line="360" w:lineRule="auto"/>
+        <w:ind w:firstLine="0"/>
+        <w:jc w:val="center"/>
+      </w:pPr>
+      <w:r>
+        <w:drawing>
+          <wp:inline distT="0" distB="0" distL="114300" distR="114300">
+            <wp:extent cx="5471795" cy="3079750"/>
+            <wp:effectExtent l="0" t="0" r="14605" b="6350"/>
+            <wp:docPr id="4" name="Picture 4"/>
+            <wp:cNvGraphicFramePr>
+              <a:graphicFrameLocks xmlns:a="http://schemas.openxmlformats.org/drawingml/2006/main" noChangeAspect="1"/>
+            </wp:cNvGraphicFramePr>
+            <a:graphic xmlns:a="http://schemas.openxmlformats.org/drawingml/2006/main">
+              <a:graphicData uri="http://schemas.openxmlformats.org/drawingml/2006/picture">
+                <pic:pic xmlns:pic="http://schemas.openxmlformats.org/drawingml/2006/picture">
+                  <pic:nvPicPr>
+                    <pic:cNvPr id="4" name="Picture 4"/>
+                    <pic:cNvPicPr>
+                      <a:picLocks noChangeAspect="1"/>
+                    </pic:cNvPicPr>
+                  </pic:nvPicPr>
+                  <pic:blipFill>
+                    <a:blip r:embed="rId15"/>
+                    <a:stretch>
+                      <a:fillRect/>
+                    </a:stretch>
+                  </pic:blipFill>
+                  <pic:spPr>
+                    <a:xfrm>
+                      <a:off x="0" y="0"/>
+                      <a:ext cx="5472000" cy="3079893"/>
+                    </a:xfrm>
+                    <a:prstGeom prst="rect">
+                      <a:avLst/>
+                    </a:prstGeom>
+                  </pic:spPr>
+                </pic:pic>
+              </a:graphicData>
+            </a:graphic>
+          </wp:inline>
+        </w:drawing>
+      </w:r>
+    </w:p>
+    <w:p>
+      <w:pPr>
+        <w:widowControl/>
+        <w:spacing w:before="0" w:after="60" w:line="360" w:lineRule="auto"/>
+        <w:ind w:firstLine="0"/>
+        <w:jc w:val="center"/>
+      </w:pPr>
+      <w:r>
+        <w:rPr>
+          <w:rFonts w:ascii="宋体" w:hAnsi="宋体" w:eastAsia="宋体" w:cs="宋体"/>
+          <w:b w:val="0"/>
+          <w:color w:val="000000"/>
+          <w:sz w:val="24"/>
+        </w:rPr>
+        <w:t>图 4 当前对象的实际复检记录 不调用模型</w:t>
+      </w:r>
+    </w:p>
+    <w:p>
+      <w:pPr>
+        <w:pStyle w:val="11"/>
+        <w:keepNext/>
+        <w:spacing w:before="120" w:after="60" w:line="360" w:lineRule="auto"/>
+        <w:ind w:firstLine="0"/>
+        <w:jc w:val="left"/>
+      </w:pPr>
+      <w:r>
+        <w:rPr>
+          <w:rFonts w:ascii="黑体" w:hAnsi="黑体" w:eastAsia="黑体" w:cs="黑体"/>
+          <w:b/>
+          <w:color w:val="000000"/>
+          <w:sz w:val="28"/>
+        </w:rPr>
+        <w:t>3.8 分层交付与演示</w:t>
+      </w:r>
+    </w:p>
+    <w:p>
+      <w:pPr>
+        <w:widowControl/>
+        <w:spacing w:before="0" w:after="60" w:line="360" w:lineRule="auto"/>
+        <w:ind w:firstLine="480"/>
+      </w:pPr>
+      <w:r>
+        <w:rPr>
+          <w:rFonts w:ascii="宋体" w:hAnsi="宋体" w:eastAsia="宋体" w:cs="宋体"/>
+          <w:b w:val="0"/>
+          <w:color w:val="000000"/>
+          <w:sz w:val="24"/>
+        </w:rPr>
+        <w:t>查看作品入口仅需普通 Python，读取真实回放，不检查或启动模型；重新验收入口需要既有隔离设施但不调用模型；现场修复入口才需要完整本地推理环境。缺少隔离不降级到宿主执行。三种入口共享当前作品界面，现场失败不会由历史成功结果替换。</w:t>
+      </w:r>
+    </w:p>
+    <w:p>
+      <w:pPr>
+        <w:widowControl/>
+        <w:spacing w:before="0" w:after="60" w:line="360" w:lineRule="auto"/>
+        <w:ind w:firstLine="480"/>
+      </w:pPr>
+      <w:r>
+        <w:rPr>
+          <w:rFonts w:ascii="宋体" w:hAnsi="宋体" w:eastAsia="宋体" w:cs="宋体"/>
+          <w:b w:val="0"/>
+          <w:color w:val="000000"/>
+          <w:sz w:val="24"/>
+        </w:rPr>
+        <w:t>本版在同机新源码目录、新 Python 环境中验证启动、历史查看、实际复检与导出，并生成约三分钟及一分钟字幕实录剪辑。前三例明确标为历史回放，复检段包含新的程序执行及对象摘要。同机验证复用了已准备的 WSL 隔离 runtime，不作为跨机器部署验证。</w:t>
       </w:r>
     </w:p>
     <w:p>
@@ -2620,7 +2865,7 @@
         <w:ind w:firstLine="0"/>
         <w:jc w:val="center"/>
       </w:pPr>
-      <w:bookmarkStart w:id="4" w:name="_Toc30958"/>
+      <w:bookmarkStart w:id="4" w:name="_Toc2945"/>
       <w:r>
         <w:rPr>
           <w:rFonts w:ascii="黑体" w:hAnsi="黑体" w:eastAsia="黑体" w:cs="黑体"/>
@@ -2734,6 +2979,410 @@
         <w:t>把代码对象、需求规则、模型过程和验收回执组织为对应材料。导出前后检查对象变化，复检重新执行固定条件，并区分历史材料完整性、旧报告适用性和当前判决。使用者可以从页面结论回到证据，也可以在不调用模型的情况下复查交付对象。</w:t>
       </w:r>
     </w:p>
+    <w:tbl>
+      <w:tblPr>
+        <w:tblStyle w:val="6"/>
+        <w:tblW w:w="0" w:type="auto"/>
+        <w:jc w:val="center"/>
+        <w:tblBorders>
+          <w:top w:val="single" w:color="D9D9D9" w:sz="4" w:space="0"/>
+          <w:left w:val="single" w:color="D9D9D9" w:sz="4" w:space="0"/>
+          <w:bottom w:val="single" w:color="D9D9D9" w:sz="4" w:space="0"/>
+          <w:right w:val="single" w:color="D9D9D9" w:sz="4" w:space="0"/>
+          <w:insideH w:val="single" w:color="D9D9D9" w:sz="4" w:space="0"/>
+          <w:insideV w:val="single" w:color="D9D9D9" w:sz="4" w:space="0"/>
+        </w:tblBorders>
+        <w:tblLayout w:type="fixed"/>
+        <w:tblCellMar>
+          <w:top w:w="0" w:type="dxa"/>
+          <w:left w:w="108" w:type="dxa"/>
+          <w:bottom w:w="0" w:type="dxa"/>
+          <w:right w:w="108" w:type="dxa"/>
+        </w:tblCellMar>
+      </w:tblPr>
+      <w:tblGrid>
+        <w:gridCol w:w="1984"/>
+        <w:gridCol w:w="3798"/>
+        <w:gridCol w:w="2891"/>
+      </w:tblGrid>
+      <w:tr>
+        <w:tblPrEx>
+          <w:tblBorders>
+            <w:top w:val="single" w:color="D9D9D9" w:sz="4" w:space="0"/>
+            <w:left w:val="single" w:color="D9D9D9" w:sz="4" w:space="0"/>
+            <w:bottom w:val="single" w:color="D9D9D9" w:sz="4" w:space="0"/>
+            <w:right w:val="single" w:color="D9D9D9" w:sz="4" w:space="0"/>
+            <w:insideH w:val="single" w:color="D9D9D9" w:sz="4" w:space="0"/>
+            <w:insideV w:val="single" w:color="D9D9D9" w:sz="4" w:space="0"/>
+          </w:tblBorders>
+          <w:tblCellMar>
+            <w:top w:w="0" w:type="dxa"/>
+            <w:left w:w="108" w:type="dxa"/>
+            <w:bottom w:w="0" w:type="dxa"/>
+            <w:right w:w="108" w:type="dxa"/>
+          </w:tblCellMar>
+        </w:tblPrEx>
+        <w:trPr>
+          <w:cantSplit/>
+          <w:tblHeader/>
+          <w:jc w:val="center"/>
+        </w:trPr>
+        <w:tc>
+          <w:tcPr>
+            <w:tcW w:w="1984" w:type="dxa"/>
+            <w:vAlign w:val="center"/>
+          </w:tcPr>
+          <w:p>
+            <w:pPr>
+              <w:keepNext/>
+              <w:widowControl/>
+              <w:spacing w:before="60" w:after="60" w:line="360" w:lineRule="auto"/>
+              <w:ind w:firstLine="0"/>
+              <w:jc w:val="center"/>
+            </w:pPr>
+            <w:r>
+              <w:rPr>
+                <w:rFonts w:ascii="宋体" w:hAnsi="宋体" w:eastAsia="宋体" w:cs="宋体"/>
+                <w:b/>
+                <w:color w:val="000000"/>
+                <w:sz w:val="24"/>
+              </w:rPr>
+              <w:t>特点对应实现</w:t>
+            </w:r>
+          </w:p>
+        </w:tc>
+        <w:tc>
+          <w:tcPr>
+            <w:tcW w:w="3798" w:type="dxa"/>
+            <w:vAlign w:val="center"/>
+          </w:tcPr>
+          <w:p>
+            <w:pPr>
+              <w:keepNext/>
+              <w:widowControl/>
+              <w:spacing w:before="60" w:after="60" w:line="360" w:lineRule="auto"/>
+              <w:ind w:firstLine="0"/>
+              <w:jc w:val="center"/>
+            </w:pPr>
+            <w:r>
+              <w:rPr>
+                <w:rFonts w:ascii="宋体" w:hAnsi="宋体" w:eastAsia="宋体" w:cs="宋体"/>
+                <w:b/>
+                <w:color w:val="000000"/>
+                <w:sz w:val="24"/>
+              </w:rPr>
+              <w:t>关键代码</w:t>
+            </w:r>
+          </w:p>
+        </w:tc>
+        <w:tc>
+          <w:tcPr>
+            <w:tcW w:w="2891" w:type="dxa"/>
+            <w:vAlign w:val="center"/>
+          </w:tcPr>
+          <w:p>
+            <w:pPr>
+              <w:keepNext/>
+              <w:widowControl/>
+              <w:spacing w:before="60" w:after="60" w:line="360" w:lineRule="auto"/>
+              <w:ind w:firstLine="0"/>
+              <w:jc w:val="center"/>
+            </w:pPr>
+            <w:r>
+              <w:rPr>
+                <w:rFonts w:ascii="宋体" w:hAnsi="宋体" w:eastAsia="宋体" w:cs="宋体"/>
+                <w:b/>
+                <w:color w:val="000000"/>
+                <w:sz w:val="24"/>
+              </w:rPr>
+              <w:t>依据</w:t>
+            </w:r>
+          </w:p>
+        </w:tc>
+      </w:tr>
+      <w:tr>
+        <w:tblPrEx>
+          <w:tblBorders>
+            <w:top w:val="single" w:color="D9D9D9" w:sz="4" w:space="0"/>
+            <w:left w:val="single" w:color="D9D9D9" w:sz="4" w:space="0"/>
+            <w:bottom w:val="single" w:color="D9D9D9" w:sz="4" w:space="0"/>
+            <w:right w:val="single" w:color="D9D9D9" w:sz="4" w:space="0"/>
+            <w:insideH w:val="single" w:color="D9D9D9" w:sz="4" w:space="0"/>
+            <w:insideV w:val="single" w:color="D9D9D9" w:sz="4" w:space="0"/>
+          </w:tblBorders>
+          <w:tblCellMar>
+            <w:top w:w="0" w:type="dxa"/>
+            <w:left w:w="108" w:type="dxa"/>
+            <w:bottom w:w="0" w:type="dxa"/>
+            <w:right w:w="108" w:type="dxa"/>
+          </w:tblCellMar>
+        </w:tblPrEx>
+        <w:trPr>
+          <w:cantSplit/>
+          <w:jc w:val="center"/>
+        </w:trPr>
+        <w:tc>
+          <w:tcPr>
+            <w:tcW w:w="1984" w:type="dxa"/>
+            <w:vAlign w:val="center"/>
+          </w:tcPr>
+          <w:p>
+            <w:pPr>
+              <w:keepNext/>
+              <w:widowControl/>
+              <w:spacing w:before="60" w:after="60" w:line="360" w:lineRule="auto"/>
+              <w:ind w:firstLine="0"/>
+              <w:jc w:val="center"/>
+            </w:pPr>
+            <w:r>
+              <w:rPr>
+                <w:rFonts w:ascii="宋体" w:hAnsi="宋体" w:eastAsia="宋体" w:cs="宋体"/>
+                <w:b w:val="0"/>
+                <w:color w:val="000000"/>
+                <w:sz w:val="24"/>
+              </w:rPr>
+              <w:t>证据与反馈</w:t>
+            </w:r>
+          </w:p>
+        </w:tc>
+        <w:tc>
+          <w:tcPr>
+            <w:tcW w:w="3798" w:type="dxa"/>
+            <w:vAlign w:val="center"/>
+          </w:tcPr>
+          <w:p>
+            <w:pPr>
+              <w:keepNext/>
+              <w:widowControl/>
+              <w:spacing w:before="60" w:after="60" w:line="360" w:lineRule="auto"/>
+              <w:ind w:firstLine="0"/>
+              <w:jc w:val="center"/>
+            </w:pPr>
+            <w:r>
+              <w:rPr>
+                <w:rFonts w:ascii="宋体" w:hAnsi="宋体" w:eastAsia="宋体" w:cs="宋体"/>
+                <w:b w:val="0"/>
+                <w:color w:val="000000"/>
+                <w:sz w:val="24"/>
+              </w:rPr>
+              <w:t>reliability.GovernedSession；model_client.LocalAgentClient</w:t>
+            </w:r>
+          </w:p>
+        </w:tc>
+        <w:tc>
+          <w:tcPr>
+            <w:tcW w:w="2891" w:type="dxa"/>
+            <w:vAlign w:val="center"/>
+          </w:tcPr>
+          <w:p>
+            <w:pPr>
+              <w:keepNext/>
+              <w:widowControl/>
+              <w:spacing w:before="60" w:after="60" w:line="360" w:lineRule="auto"/>
+              <w:ind w:firstLine="0"/>
+              <w:jc w:val="center"/>
+            </w:pPr>
+            <w:r>
+              <w:rPr>
+                <w:rFonts w:ascii="宋体" w:hAnsi="宋体" w:eastAsia="宋体" w:cs="宋体"/>
+                <w:b w:val="0"/>
+                <w:color w:val="000000"/>
+                <w:sz w:val="24"/>
+              </w:rPr>
+              <w:t>h01 有限候选增量；h03 真实反馈调整</w:t>
+            </w:r>
+          </w:p>
+        </w:tc>
+      </w:tr>
+      <w:tr>
+        <w:tblPrEx>
+          <w:tblBorders>
+            <w:top w:val="single" w:color="D9D9D9" w:sz="4" w:space="0"/>
+            <w:left w:val="single" w:color="D9D9D9" w:sz="4" w:space="0"/>
+            <w:bottom w:val="single" w:color="D9D9D9" w:sz="4" w:space="0"/>
+            <w:right w:val="single" w:color="D9D9D9" w:sz="4" w:space="0"/>
+            <w:insideH w:val="single" w:color="D9D9D9" w:sz="4" w:space="0"/>
+            <w:insideV w:val="single" w:color="D9D9D9" w:sz="4" w:space="0"/>
+          </w:tblBorders>
+          <w:tblCellMar>
+            <w:top w:w="0" w:type="dxa"/>
+            <w:left w:w="108" w:type="dxa"/>
+            <w:bottom w:w="0" w:type="dxa"/>
+            <w:right w:w="108" w:type="dxa"/>
+          </w:tblCellMar>
+        </w:tblPrEx>
+        <w:trPr>
+          <w:cantSplit/>
+          <w:jc w:val="center"/>
+        </w:trPr>
+        <w:tc>
+          <w:tcPr>
+            <w:tcW w:w="1984" w:type="dxa"/>
+            <w:vAlign w:val="center"/>
+          </w:tcPr>
+          <w:p>
+            <w:pPr>
+              <w:keepNext/>
+              <w:widowControl/>
+              <w:spacing w:before="60" w:after="60" w:line="360" w:lineRule="auto"/>
+              <w:ind w:firstLine="0"/>
+              <w:jc w:val="center"/>
+            </w:pPr>
+            <w:r>
+              <w:rPr>
+                <w:rFonts w:ascii="宋体" w:hAnsi="宋体" w:eastAsia="宋体" w:cs="宋体"/>
+                <w:b w:val="0"/>
+                <w:color w:val="000000"/>
+                <w:sz w:val="24"/>
+              </w:rPr>
+              <w:t>程序控制验收</w:t>
+            </w:r>
+          </w:p>
+        </w:tc>
+        <w:tc>
+          <w:tcPr>
+            <w:tcW w:w="3798" w:type="dxa"/>
+            <w:vAlign w:val="center"/>
+          </w:tcPr>
+          <w:p>
+            <w:pPr>
+              <w:keepNext/>
+              <w:widowControl/>
+              <w:spacing w:before="60" w:after="60" w:line="360" w:lineRule="auto"/>
+              <w:ind w:firstLine="0"/>
+              <w:jc w:val="center"/>
+            </w:pPr>
+            <w:r>
+              <w:rPr>
+                <w:rFonts w:ascii="宋体" w:hAnsi="宋体" w:eastAsia="宋体" w:cs="宋体"/>
+                <w:b w:val="0"/>
+                <w:color w:val="000000"/>
+                <w:sz w:val="24"/>
+              </w:rPr>
+              <w:t>judge.judge_trial；isolation.run_isolated；external_twine.boundary</w:t>
+            </w:r>
+          </w:p>
+        </w:tc>
+        <w:tc>
+          <w:tcPr>
+            <w:tcW w:w="2891" w:type="dxa"/>
+            <w:vAlign w:val="center"/>
+          </w:tcPr>
+          <w:p>
+            <w:pPr>
+              <w:keepNext/>
+              <w:widowControl/>
+              <w:spacing w:before="60" w:after="60" w:line="360" w:lineRule="auto"/>
+              <w:ind w:firstLine="0"/>
+              <w:jc w:val="center"/>
+            </w:pPr>
+            <w:r>
+              <w:rPr>
+                <w:rFonts w:ascii="宋体" w:hAnsi="宋体" w:eastAsia="宋体" w:cs="宋体"/>
+                <w:b w:val="0"/>
+                <w:color w:val="000000"/>
+                <w:sz w:val="24"/>
+              </w:rPr>
+              <w:t>h07 正常保留；Twine 越界候选被拒绝</w:t>
+            </w:r>
+          </w:p>
+        </w:tc>
+      </w:tr>
+      <w:tr>
+        <w:tblPrEx>
+          <w:tblBorders>
+            <w:top w:val="single" w:color="D9D9D9" w:sz="4" w:space="0"/>
+            <w:left w:val="single" w:color="D9D9D9" w:sz="4" w:space="0"/>
+            <w:bottom w:val="single" w:color="D9D9D9" w:sz="4" w:space="0"/>
+            <w:right w:val="single" w:color="D9D9D9" w:sz="4" w:space="0"/>
+            <w:insideH w:val="single" w:color="D9D9D9" w:sz="4" w:space="0"/>
+            <w:insideV w:val="single" w:color="D9D9D9" w:sz="4" w:space="0"/>
+          </w:tblBorders>
+          <w:tblCellMar>
+            <w:top w:w="0" w:type="dxa"/>
+            <w:left w:w="108" w:type="dxa"/>
+            <w:bottom w:w="0" w:type="dxa"/>
+            <w:right w:w="108" w:type="dxa"/>
+          </w:tblCellMar>
+        </w:tblPrEx>
+        <w:trPr>
+          <w:cantSplit/>
+          <w:jc w:val="center"/>
+        </w:trPr>
+        <w:tc>
+          <w:tcPr>
+            <w:tcW w:w="1984" w:type="dxa"/>
+            <w:vAlign w:val="center"/>
+          </w:tcPr>
+          <w:p>
+            <w:pPr>
+              <w:keepNext w:val="0"/>
+              <w:widowControl/>
+              <w:spacing w:before="60" w:after="60" w:line="360" w:lineRule="auto"/>
+              <w:ind w:firstLine="0"/>
+              <w:jc w:val="center"/>
+            </w:pPr>
+            <w:r>
+              <w:rPr>
+                <w:rFonts w:ascii="宋体" w:hAnsi="宋体" w:eastAsia="宋体" w:cs="宋体"/>
+                <w:b w:val="0"/>
+                <w:color w:val="000000"/>
+                <w:sz w:val="24"/>
+              </w:rPr>
+              <w:t>对象材料复检</w:t>
+            </w:r>
+          </w:p>
+        </w:tc>
+        <w:tc>
+          <w:tcPr>
+            <w:tcW w:w="3798" w:type="dxa"/>
+            <w:vAlign w:val="center"/>
+          </w:tcPr>
+          <w:p>
+            <w:pPr>
+              <w:keepNext w:val="0"/>
+              <w:widowControl/>
+              <w:spacing w:before="60" w:after="60" w:line="360" w:lineRule="auto"/>
+              <w:ind w:firstLine="0"/>
+              <w:jc w:val="center"/>
+            </w:pPr>
+            <w:r>
+              <w:rPr>
+                <w:rFonts w:ascii="宋体" w:hAnsi="宋体" w:eastAsia="宋体" w:cs="宋体"/>
+                <w:b w:val="0"/>
+                <w:color w:val="000000"/>
+                <w:sz w:val="24"/>
+              </w:rPr>
+              <w:t>web._require_current_material；bundle.recheck_bundle</w:t>
+            </w:r>
+          </w:p>
+        </w:tc>
+        <w:tc>
+          <w:tcPr>
+            <w:tcW w:w="2891" w:type="dxa"/>
+            <w:vAlign w:val="center"/>
+          </w:tcPr>
+          <w:p>
+            <w:pPr>
+              <w:keepNext w:val="0"/>
+              <w:widowControl/>
+              <w:spacing w:before="60" w:after="60" w:line="360" w:lineRule="auto"/>
+              <w:ind w:firstLine="0"/>
+              <w:jc w:val="center"/>
+            </w:pPr>
+            <w:r>
+              <w:rPr>
+                <w:rFonts w:ascii="宋体" w:hAnsi="宋体" w:eastAsia="宋体" w:cs="宋体"/>
+                <w:b w:val="0"/>
+                <w:color w:val="000000"/>
+                <w:sz w:val="24"/>
+              </w:rPr>
+              <w:t>导出绑定回归；当前对象的新复检</w:t>
+            </w:r>
+          </w:p>
+        </w:tc>
+      </w:tr>
+    </w:tbl>
     <w:p>
       <w:pPr>
         <w:widowControl/>
@@ -2758,7 +3407,7 @@
         <w:ind w:firstLine="0"/>
         <w:jc w:val="center"/>
       </w:pPr>
-      <w:bookmarkStart w:id="5" w:name="_Toc5871"/>
+      <w:bookmarkStart w:id="5" w:name="_Toc23833"/>
       <w:r>
         <w:rPr>
           <w:rFonts w:ascii="黑体" w:hAnsi="黑体" w:eastAsia="黑体" w:cs="黑体"/>
@@ -2844,7 +3493,7 @@
         <w:ind w:firstLine="0"/>
         <w:jc w:val="center"/>
       </w:pPr>
-      <w:bookmarkStart w:id="6" w:name="_Toc21536"/>
+      <w:bookmarkStart w:id="6" w:name="_Toc30199"/>
       <w:r>
         <w:rPr>
           <w:rFonts w:ascii="黑体" w:hAnsi="黑体" w:eastAsia="黑体" w:cs="黑体"/>
@@ -2939,6 +3588,23 @@
           <w:sz w:val="24"/>
         </w:rPr>
         <w:t>[5] 本项目. h03 原始候选与反馈记录[DS]. 2026-09-29. 首候选；第二候选；失败进入下一请求。</w:t>
+      </w:r>
+    </w:p>
+    <w:p>
+      <w:pPr>
+        <w:widowControl/>
+        <w:spacing w:before="0" w:after="60" w:line="360" w:lineRule="auto"/>
+        <w:ind w:firstLine="0"/>
+        <w:jc w:val="left"/>
+      </w:pPr>
+      <w:r>
+        <w:rPr>
+          <w:rFonts w:ascii="宋体" w:hAnsi="宋体" w:eastAsia="宋体" w:cs="宋体"/>
+          <w:b w:val="0"/>
+          <w:color w:val="000000"/>
+          <w:sz w:val="24"/>
+        </w:rPr>
+        <w:t>[6] PyPA Twine. bugfix utils catch configparser Error. PR #1240, merged 2025-04-11. https://github.com/pypa/twine/pull/1240. 固定来源、许可证、原组件和完整单次运行记录随候选材料提供。</w:t>
       </w:r>
     </w:p>
     <w:sectPr>
@@ -3143,7 +3809,7 @@
         <w:color w:val="000000"/>
         <w:sz w:val="24"/>
       </w:rPr>
-      <w:t>11</w:t>
+      <w:t>13</w:t>
     </w:r>
     <w:r>
       <w:rPr>
@@ -3605,7 +4271,6 @@
   </w:style>
   <w:style w:type="paragraph" w:customStyle="1" w:styleId="10">
     <w:name w:val="Title"/>
-    <w:qFormat/>
     <w:uiPriority w:val="0"/>
     <w:rPr>
       <w:rFonts w:ascii="黑体" w:hAnsi="黑体" w:eastAsia="宋体" w:cs="Times New Roman"/>
@@ -3616,7 +4281,6 @@
   <w:style w:type="paragraph" w:customStyle="1" w:styleId="11">
     <w:name w:val="heading 2"/>
     <w:basedOn w:val="1"/>
-    <w:qFormat/>
     <w:uiPriority w:val="0"/>
     <w:pPr>
       <w:outlineLvl w:val="1"/>

</xml_diff>

<commit_message>
docs(candidate): restructure value and innovation evidence
</commit_message>
<xml_diff>
--- a/docs/preliminary-candidate/credproof-manuscript-candidate.docx
+++ b/docs/preliminary-candidate/credproof-manuscript-candidate.docx
@@ -558,7 +558,7 @@
         <w:rPr>
           <w:rFonts w:ascii="宋体" w:hAnsi="宋体" w:eastAsia="宋体" w:cs="宋体"/>
         </w:rPr>
-        <w:instrText xml:space="preserve"> HYPERLINK \l _Toc16794 </w:instrText>
+        <w:instrText xml:space="preserve"> HYPERLINK \l _Toc3161 </w:instrText>
       </w:r>
       <w:r>
         <w:rPr>
@@ -579,7 +579,7 @@
         <w:fldChar w:fldCharType="begin"/>
       </w:r>
       <w:r>
-        <w:instrText xml:space="preserve"> PAGEREF _Toc16794 \h </w:instrText>
+        <w:instrText xml:space="preserve"> PAGEREF _Toc3161 \h </w:instrText>
       </w:r>
       <w:r>
         <w:fldChar w:fldCharType="separate"/>
@@ -616,7 +616,7 @@
         <w:rPr>
           <w:rFonts w:ascii="宋体" w:hAnsi="宋体" w:eastAsia="宋体" w:cs="宋体"/>
         </w:rPr>
-        <w:instrText xml:space="preserve"> HYPERLINK \l _Toc16040 </w:instrText>
+        <w:instrText xml:space="preserve"> HYPERLINK \l _Toc27002 </w:instrText>
       </w:r>
       <w:r>
         <w:rPr>
@@ -637,7 +637,7 @@
         <w:fldChar w:fldCharType="begin"/>
       </w:r>
       <w:r>
-        <w:instrText xml:space="preserve"> PAGEREF _Toc16040 \h </w:instrText>
+        <w:instrText xml:space="preserve"> PAGEREF _Toc27002 \h </w:instrText>
       </w:r>
       <w:r>
         <w:fldChar w:fldCharType="separate"/>
@@ -674,7 +674,7 @@
         <w:rPr>
           <w:rFonts w:ascii="宋体" w:hAnsi="宋体" w:eastAsia="宋体" w:cs="宋体"/>
         </w:rPr>
-        <w:instrText xml:space="preserve"> HYPERLINK \l _Toc8323 </w:instrText>
+        <w:instrText xml:space="preserve"> HYPERLINK \l _Toc1375 </w:instrText>
       </w:r>
       <w:r>
         <w:rPr>
@@ -695,7 +695,7 @@
         <w:fldChar w:fldCharType="begin"/>
       </w:r>
       <w:r>
-        <w:instrText xml:space="preserve"> PAGEREF _Toc8323 \h </w:instrText>
+        <w:instrText xml:space="preserve"> PAGEREF _Toc1375 \h </w:instrText>
       </w:r>
       <w:r>
         <w:fldChar w:fldCharType="separate"/>
@@ -732,7 +732,7 @@
         <w:rPr>
           <w:rFonts w:ascii="宋体" w:hAnsi="宋体" w:eastAsia="宋体" w:cs="宋体"/>
         </w:rPr>
-        <w:instrText xml:space="preserve"> HYPERLINK \l _Toc31439 </w:instrText>
+        <w:instrText xml:space="preserve"> HYPERLINK \l _Toc2249 </w:instrText>
       </w:r>
       <w:r>
         <w:rPr>
@@ -753,7 +753,7 @@
         <w:fldChar w:fldCharType="begin"/>
       </w:r>
       <w:r>
-        <w:instrText xml:space="preserve"> PAGEREF _Toc31439 \h </w:instrText>
+        <w:instrText xml:space="preserve"> PAGEREF _Toc2249 \h </w:instrText>
       </w:r>
       <w:r>
         <w:fldChar w:fldCharType="separate"/>
@@ -790,7 +790,7 @@
         <w:rPr>
           <w:rFonts w:ascii="宋体" w:hAnsi="宋体" w:eastAsia="宋体" w:cs="宋体"/>
         </w:rPr>
-        <w:instrText xml:space="preserve"> HYPERLINK \l _Toc2945 </w:instrText>
+        <w:instrText xml:space="preserve"> HYPERLINK \l _Toc26221 </w:instrText>
       </w:r>
       <w:r>
         <w:rPr>
@@ -811,13 +811,13 @@
         <w:fldChar w:fldCharType="begin"/>
       </w:r>
       <w:r>
-        <w:instrText xml:space="preserve"> PAGEREF _Toc2945 \h </w:instrText>
+        <w:instrText xml:space="preserve"> PAGEREF _Toc26221 \h </w:instrText>
       </w:r>
       <w:r>
         <w:fldChar w:fldCharType="separate"/>
       </w:r>
       <w:r>
-        <w:t>11</w:t>
+        <w:t>10</w:t>
       </w:r>
       <w:r>
         <w:fldChar w:fldCharType="end"/>
@@ -848,7 +848,7 @@
         <w:rPr>
           <w:rFonts w:ascii="宋体" w:hAnsi="宋体" w:eastAsia="宋体" w:cs="宋体"/>
         </w:rPr>
-        <w:instrText xml:space="preserve"> HYPERLINK \l _Toc23833 </w:instrText>
+        <w:instrText xml:space="preserve"> HYPERLINK \l _Toc3656 </w:instrText>
       </w:r>
       <w:r>
         <w:rPr>
@@ -869,13 +869,13 @@
         <w:fldChar w:fldCharType="begin"/>
       </w:r>
       <w:r>
-        <w:instrText xml:space="preserve"> PAGEREF _Toc23833 \h </w:instrText>
+        <w:instrText xml:space="preserve"> PAGEREF _Toc3656 \h </w:instrText>
       </w:r>
       <w:r>
         <w:fldChar w:fldCharType="separate"/>
       </w:r>
       <w:r>
-        <w:t>12</w:t>
+        <w:t>11</w:t>
       </w:r>
       <w:r>
         <w:fldChar w:fldCharType="end"/>
@@ -906,7 +906,7 @@
         <w:rPr>
           <w:rFonts w:ascii="宋体" w:hAnsi="宋体" w:eastAsia="宋体" w:cs="宋体"/>
         </w:rPr>
-        <w:instrText xml:space="preserve"> HYPERLINK \l _Toc30199 </w:instrText>
+        <w:instrText xml:space="preserve"> HYPERLINK \l _Toc11030 </w:instrText>
       </w:r>
       <w:r>
         <w:rPr>
@@ -927,13 +927,13 @@
         <w:fldChar w:fldCharType="begin"/>
       </w:r>
       <w:r>
-        <w:instrText xml:space="preserve"> PAGEREF _Toc30199 \h </w:instrText>
+        <w:instrText xml:space="preserve"> PAGEREF _Toc11030 \h </w:instrText>
       </w:r>
       <w:r>
         <w:fldChar w:fldCharType="separate"/>
       </w:r>
       <w:r>
-        <w:t>13</w:t>
+        <w:t>12</w:t>
       </w:r>
       <w:r>
         <w:fldChar w:fldCharType="end"/>
@@ -968,7 +968,7 @@
         <w:ind w:firstLine="0"/>
         <w:jc w:val="center"/>
       </w:pPr>
-      <w:bookmarkStart w:id="0" w:name="_Toc16794"/>
+      <w:bookmarkStart w:id="0" w:name="_Toc3161"/>
       <w:r>
         <w:rPr>
           <w:rFonts w:ascii="黑体" w:hAnsi="黑体" w:eastAsia="黑体" w:cs="黑体"/>
@@ -993,7 +993,7 @@
           <w:color w:val="000000"/>
           <w:sz w:val="24"/>
         </w:rPr>
-        <w:t>密证 CredProof 面向 AI 工具中的运行时凭据泄露，结合本地大模型补丁生成与程序控制的安全验收，给出候选修复并检查泄露是否消除、必要业务行为是否保持，支持材料导出与复检。系统围绕证据驱动的候选生成与反馈调整、程序控制的修改权限与安全/业务验收、对应修复对象的材料导出与复检三个特点，形成从运行观察到候选验证的完整流程。模型提出假设与补丁，程序依据当前对象的实际证据授权，在隔离环境中检查凭据通道和功能，再由执行器确认任务状态。单页工作台展示原代码、差异、失败反馈与验收结果。同一冻结轮次八个合成案例中，反馈 Agent 完成四个问题例的合格修复，四个正常例均未被实际修改；最终对象通过八例，完整任务六例。代表案例保存了失败补丁经真实反馈修正的过程。作品已形成可运行和可复检的原型，为小型授权 Python 工具提供有依据的修复辅助。</w:t>
+        <w:t>当 AI 工具从环境变量读取凭据时，源码没有硬编码密钥，也可能在异常返回、日志或辅助函数中暴露运行时真实值。密证 CredProof 面向维护自有或获授权 Python 工具的开发者与安全人员，在发现这类线索后，把受控执行证据、候选补丁、安全与业务验收以及对应对象复检材料串成一条可交付流程。固定程序先确认触发条件和泄露通道，本地模型阅读代码与脱敏观察、提出候选，程序再判断是否允许修改和是否满足必要条件。h01 展示模型补足固定启发式未覆盖的参数日志修复；h03 展示第一份“看似脱敏”补丁因真实值仍在而被拒，反馈进入后续请求后第二份补丁通过；h07 展示无实际泄露证据时原代码保持不变。冻结八例中，C-Agent 完成四个问题例的合格修复，四个正常例实际修改为 0/4，完整任务为 6/8；失败和未完成记录保留。另有一个 Twine 公开历史问题的窄组件接入，第三份候选通过七项固定条件，不并入八例分母。密证交付的不只是一份补丁，还包括能回到具体对象重新检查的依据。</w:t>
       </w:r>
     </w:p>
     <w:p>
@@ -1009,7 +1009,7 @@
           <w:color w:val="000000"/>
           <w:sz w:val="24"/>
         </w:rPr>
-        <w:t>关键词：运行时凭据；本地智能体；受控修复；证据绑定；材料复检</w:t>
+        <w:t>关键词：运行时凭据；本地智能体；受控修复；证据反馈；材料复检</w:t>
       </w:r>
     </w:p>
     <w:p>
@@ -1025,7 +1025,7 @@
         <w:ind w:firstLine="0"/>
         <w:jc w:val="center"/>
       </w:pPr>
-      <w:bookmarkStart w:id="1" w:name="_Toc16040"/>
+      <w:bookmarkStart w:id="1" w:name="_Toc27002"/>
       <w:r>
         <w:rPr>
           <w:rFonts w:ascii="黑体" w:hAnsi="黑体" w:eastAsia="黑体" w:cs="黑体"/>
@@ -1068,7 +1068,7 @@
           <w:color w:val="000000"/>
           <w:sz w:val="24"/>
         </w:rPr>
-        <w:t>系统结合本地大模型补丁生成与程序控制的安全验收，针对凭据泄露问题给出候选修复，并检查泄露是否消除、必要业务行为是否保持，支持材料导出与复检。密证把这一流程组织为可操作的单页工作台：使用者能够查看泄露依据、候选差异、验证回执和当前任务状态，形成可追溯的修复材料。</w:t>
+        <w:t>密证服务于维护自有或获授权 Python 工具、AI 工具及相关组件的开发者和安全人员。使用时刻是：工具已经出现凭据可能进入异常返回、日志或其他禁止输出通道的迹象，需要确认问题、修改代码，并判断候选补丁是否可以交付。</w:t>
       </w:r>
     </w:p>
     <w:p>
@@ -1084,7 +1084,41 @@
           <w:color w:val="000000"/>
           <w:sz w:val="24"/>
         </w:rPr>
-        <w:t>小型 AI 工具常从环境变量读取凭据。源码即使没有硬编码密钥，执行时仍可能经辅助函数日志、异常细节或嵌套返回暴露真实值。修复这类问题需要识别具体传播路径，同时保留正常认证、成功响应和异常处理。密证让模型承担假设与补丁生成，让固定程序承担修改授权和验收，两者协作完成有证据的修复辅助。</w:t>
+        <w:t>使用者实际要处理五件事：找到触发条件和传播路径，区分合法认证与禁止泄露，修改并保持必要业务行为，判断候选是否真的消除了暴露，把对应材料交给下一位复查者。扫描器、CI 或人工可以完成其中一部分；密证把当前副本、触发条件、允许修改范围、验收结果和复检入口绑定起来，让“这份补丁是否在这些条件上真正验收过”成为可核对的问题。</w:t>
+      </w:r>
+    </w:p>
+    <w:p>
+      <w:pPr>
+        <w:widowControl/>
+        <w:spacing w:before="0" w:after="60" w:line="360" w:lineRule="auto"/>
+        <w:ind w:firstLine="480"/>
+      </w:pPr>
+      <w:r>
+        <w:rPr>
+          <w:rFonts w:ascii="宋体" w:hAnsi="宋体" w:eastAsia="宋体" w:cs="宋体"/>
+          <w:b w:val="0"/>
+          <w:color w:val="000000"/>
+          <w:sz w:val="24"/>
+        </w:rPr>
+        <w:t>一句话记忆点是：</w:t>
+      </w:r>
+      <w:r>
+        <w:rPr>
+          <w:rFonts w:ascii="宋体" w:hAnsi="宋体" w:eastAsia="宋体" w:cs="宋体"/>
+          <w:b/>
+          <w:color w:val="000000"/>
+          <w:sz w:val="24"/>
+        </w:rPr>
+        <w:t>让 AI 提出修复，让程序决定是否接受，让开发者能够复查。</w:t>
+      </w:r>
+      <w:r>
+        <w:rPr>
+          <w:rFonts w:ascii="宋体" w:hAnsi="宋体" w:eastAsia="宋体" w:cs="宋体"/>
+          <w:b w:val="0"/>
+          <w:color w:val="000000"/>
+          <w:sz w:val="24"/>
+        </w:rPr>
+        <w:t xml:space="preserve"> 本项目不隐藏前置准备成本：人工仍需提供授权范围、适配入口、可信需求和必要业务条件；本地模型只在这些边界内提出候选，固定程序负责证据、权限和判定。</w:t>
       </w:r>
     </w:p>
     <w:p>
@@ -1118,16 +1152,16 @@
           <w:color w:val="000000"/>
           <w:sz w:val="24"/>
         </w:rPr>
-        <w:t>证据驱动的候选生成与反馈调整。</w:t>
-      </w:r>
-      <w:r>
-        <w:rPr>
-          <w:rFonts w:ascii="宋体" w:hAnsi="宋体" w:eastAsia="宋体" w:cs="宋体"/>
-          <w:b w:val="0"/>
-          <w:color w:val="000000"/>
-          <w:sz w:val="24"/>
-        </w:rPr>
-        <w:t xml:space="preserve"> 模型依据代码和脱敏观察提出补丁，真实验证反馈支持后续调整。</w:t>
+        <w:t>证据反馈驱动的候选修复。</w:t>
+      </w:r>
+      <w:r>
+        <w:rPr>
+          <w:rFonts w:ascii="宋体" w:hAnsi="宋体" w:eastAsia="宋体" w:cs="宋体"/>
+          <w:b w:val="0"/>
+          <w:color w:val="000000"/>
+          <w:sz w:val="24"/>
+        </w:rPr>
+        <w:t xml:space="preserve"> 固定程序先执行受控触发，模型读取代码与脱敏观察，提出候选；失败回执可进入后续请求。h01 支持固定启发式之外的有限增量，h03 支持一次真实反馈调整。两例的作用不同，不合并成更大的成功故事。</w:t>
       </w:r>
     </w:p>
     <w:p>
@@ -1143,16 +1177,16 @@
           <w:color w:val="000000"/>
           <w:sz w:val="24"/>
         </w:rPr>
-        <w:t>程序控制的修改权限与安全/业务验收。</w:t>
-      </w:r>
-      <w:r>
-        <w:rPr>
-          <w:rFonts w:ascii="宋体" w:hAnsi="宋体" w:eastAsia="宋体" w:cs="宋体"/>
-          <w:b w:val="0"/>
-          <w:color w:val="000000"/>
-          <w:sz w:val="24"/>
-        </w:rPr>
-        <w:t xml:space="preserve"> 当前有效证据授权修改，候选需同时满足安全与业务条件，任务状态独立确认。</w:t>
+        <w:t>程序实施修改授权和安全/业务联合验收。</w:t>
+      </w:r>
+      <w:r>
+        <w:rPr>
+          <w:rFonts w:ascii="宋体" w:hAnsi="宋体" w:eastAsia="宋体" w:cs="宋体"/>
+          <w:b w:val="0"/>
+          <w:color w:val="000000"/>
+          <w:sz w:val="24"/>
+        </w:rPr>
+        <w:t xml:space="preserve"> 模型不能修改需求、裁判或原工作区。当前副本有有效泄露证据且候选在允许范围内，才进入检查；安全通道、认证行为、成功响应、拒绝和异常条件共同决定结果。h07 中没有确认泄露，原代码保持不变。</w:t>
       </w:r>
     </w:p>
     <w:p>
@@ -1168,16 +1202,16 @@
           <w:color w:val="000000"/>
           <w:sz w:val="24"/>
         </w:rPr>
-        <w:t>对应修复对象的材料导出与复检。</w:t>
-      </w:r>
-      <w:r>
-        <w:rPr>
-          <w:rFonts w:ascii="宋体" w:hAnsi="宋体" w:eastAsia="宋体" w:cs="宋体"/>
-          <w:b w:val="0"/>
-          <w:color w:val="000000"/>
-          <w:sz w:val="24"/>
-        </w:rPr>
-        <w:t xml:space="preserve"> 导出原件、候选、需求规则及记录，重读材料并重新检查当前对象。</w:t>
+        <w:t>对应对象的材料交付与独立复检。</w:t>
+      </w:r>
+      <w:r>
+        <w:rPr>
+          <w:rFonts w:ascii="宋体" w:hAnsi="宋体" w:eastAsia="宋体" w:cs="宋体"/>
+          <w:b w:val="0"/>
+          <w:color w:val="000000"/>
+          <w:sz w:val="24"/>
+        </w:rPr>
+        <w:t xml:space="preserve"> 导出原件、当前候选、规则和轨迹；复检重新读取材料并区分旧报告适用性、历史材料完整性和当前 PASS/FAIL/UNKNOWN。对象或规则变化时不沿用旧缓存结论。</w:t>
       </w:r>
     </w:p>
     <w:p>
@@ -1211,7 +1245,7 @@
           <w:color w:val="000000"/>
           <w:sz w:val="24"/>
         </w:rPr>
-        <w:t>作品适用于教学实验、团队自有认证工具及内部授权组件。开发者可以定位泄露通道、比较候选差异，把对应材料交给他人复检；正常工具经验证后保持原样。</w:t>
+        <w:t>作品适用于教学实验、团队自有认证工具及内部授权组件。开发者可以定位泄露通道、比较候选差异，把对应材料交给他人复检；正常工具经验证后保持原样。当前范围是已登记、已适配的受控 Python 工具，使用合成凭据、本地模拟服务和既有隔离环境，不扫描真实账户或公网目标。</w:t>
       </w:r>
     </w:p>
     <w:p>
@@ -1227,7 +1261,7 @@
           <w:color w:val="000000"/>
           <w:sz w:val="24"/>
         </w:rPr>
-        <w:t>系统采用 Qwen3-Coder、Qwen-Agent 和 Ollama[1–3]。项目实现受限工具、证据授权、完成控制、裁判与案例、过程记录、材料复检和工作台，组织运行证据、生成式候选与确定性验收协同工作。</w:t>
+        <w:t>系统采用 Qwen3-Coder、Qwen-Agent 和 Ollama[1–3]。这些是公开复用基础；项目自行实现受限工具、证据授权、完成控制、裁判与案例、过程记录、对象绑定复检和工作台。人工、固定程序与模型的职责在第二章明确区分。</w:t>
       </w:r>
     </w:p>
     <w:p>
@@ -1238,7 +1272,7 @@
         <w:ind w:firstLine="0"/>
         <w:jc w:val="center"/>
       </w:pPr>
-      <w:bookmarkStart w:id="2" w:name="_Toc8323"/>
+      <w:bookmarkStart w:id="2" w:name="_Toc1375"/>
       <w:r>
         <w:rPr>
           <w:rFonts w:ascii="黑体" w:hAnsi="黑体" w:eastAsia="黑体" w:cs="黑体"/>
@@ -1281,7 +1315,7 @@
           <w:color w:val="000000"/>
           <w:sz w:val="24"/>
         </w:rPr>
-        <w:t>系统由单页与 Python 后端、受控会话、模型接口、隔离执行器、裁判和复检模块组成。选择案例后固定代码、需求和规则，在成功、拒绝、服务异常三个公开条件下形成初始证据。模型可读取代码、选择触发条件、取得证据、提交候选和请求验证。</w:t>
+        <w:t>系统由单页与 Python 后端、受控会话、模型接口、隔离执行器、裁判和复检模块组成。人工先固定代码、需求、允许修改范围和规则；固定程序用成功、拒绝和服务异常条件形成初始证据；模型读取代码和脱敏观察，提出假设、选择结构化工具、提交候选并请求验证。</w:t>
       </w:r>
     </w:p>
     <w:p>
@@ -1297,74 +1331,413 @@
           <w:color w:val="000000"/>
           <w:sz w:val="24"/>
         </w:rPr>
-        <w:t>候选只写入副本。程序核对权限，隔离执行器采集行为，裁判检查安全与功能，再依据必要条件确认任务状态。工作台展示原代码、候选、模型原文、证据与差异，现场推理和历史回放具有独立标识。</w:t>
-      </w:r>
-    </w:p>
-    <w:p>
-      <w:pPr>
-        <w:keepNext/>
-        <w:widowControl/>
-        <w:spacing w:before="0" w:after="60" w:line="360" w:lineRule="auto"/>
-        <w:ind w:firstLine="0"/>
+        <w:t>候选只写入副本。程序核对权限，隔离执行器采集行为，裁判检查安全与功能，再依据必要条件确认任务状态。工作台把模型分析、程序确认和任务状态分开显示，历史回放、确定性复检和现场推理有独立标识。</w:t>
+      </w:r>
+    </w:p>
+    <w:tbl>
+      <w:tblPr>
+        <w:tblStyle w:val="6"/>
+        <w:tblW w:w="0" w:type="auto"/>
         <w:jc w:val="center"/>
-      </w:pPr>
-      <w:r>
-        <w:drawing>
-          <wp:inline distT="0" distB="0" distL="114300" distR="114300">
-            <wp:extent cx="5471795" cy="3757295"/>
-            <wp:effectExtent l="0" t="0" r="14605" b="14605"/>
-            <wp:docPr id="1" name="Picture 1"/>
-            <wp:cNvGraphicFramePr>
-              <a:graphicFrameLocks xmlns:a="http://schemas.openxmlformats.org/drawingml/2006/main" noChangeAspect="1"/>
-            </wp:cNvGraphicFramePr>
-            <a:graphic xmlns:a="http://schemas.openxmlformats.org/drawingml/2006/main">
-              <a:graphicData uri="http://schemas.openxmlformats.org/drawingml/2006/picture">
-                <pic:pic xmlns:pic="http://schemas.openxmlformats.org/drawingml/2006/picture">
-                  <pic:nvPicPr>
-                    <pic:cNvPr id="1" name="Picture 1"/>
-                    <pic:cNvPicPr>
-                      <a:picLocks noChangeAspect="1"/>
-                    </pic:cNvPicPr>
-                  </pic:nvPicPr>
-                  <pic:blipFill>
-                    <a:blip r:embed="rId12"/>
-                    <a:stretch>
-                      <a:fillRect/>
-                    </a:stretch>
-                  </pic:blipFill>
-                  <pic:spPr>
-                    <a:xfrm>
-                      <a:off x="0" y="0"/>
-                      <a:ext cx="5472000" cy="3757440"/>
-                    </a:xfrm>
-                    <a:prstGeom prst="rect">
-                      <a:avLst/>
-                    </a:prstGeom>
-                  </pic:spPr>
-                </pic:pic>
-              </a:graphicData>
-            </a:graphic>
-          </wp:inline>
-        </w:drawing>
-      </w:r>
-    </w:p>
-    <w:p>
-      <w:pPr>
-        <w:widowControl/>
-        <w:spacing w:before="0" w:after="60" w:line="360" w:lineRule="auto"/>
-        <w:ind w:firstLine="0"/>
-        <w:jc w:val="center"/>
-      </w:pPr>
-      <w:r>
-        <w:rPr>
-          <w:rFonts w:ascii="宋体" w:hAnsi="宋体" w:eastAsia="宋体" w:cs="宋体"/>
-          <w:b w:val="0"/>
-          <w:color w:val="000000"/>
-          <w:sz w:val="24"/>
-        </w:rPr>
-        <w:t>图 1 运行证据约束下的候选修复与验收流程</w:t>
-      </w:r>
-    </w:p>
+        <w:tblBorders>
+          <w:top w:val="single" w:color="D9D9D9" w:sz="4" w:space="0"/>
+          <w:left w:val="single" w:color="D9D9D9" w:sz="4" w:space="0"/>
+          <w:bottom w:val="single" w:color="D9D9D9" w:sz="4" w:space="0"/>
+          <w:right w:val="single" w:color="D9D9D9" w:sz="4" w:space="0"/>
+          <w:insideH w:val="single" w:color="D9D9D9" w:sz="4" w:space="0"/>
+          <w:insideV w:val="single" w:color="D9D9D9" w:sz="4" w:space="0"/>
+        </w:tblBorders>
+        <w:tblLayout w:type="fixed"/>
+        <w:tblCellMar>
+          <w:top w:w="0" w:type="dxa"/>
+          <w:left w:w="108" w:type="dxa"/>
+          <w:bottom w:w="0" w:type="dxa"/>
+          <w:right w:w="108" w:type="dxa"/>
+        </w:tblCellMar>
+      </w:tblPr>
+      <w:tblGrid>
+        <w:gridCol w:w="1984"/>
+        <w:gridCol w:w="3798"/>
+        <w:gridCol w:w="2891"/>
+      </w:tblGrid>
+      <w:tr>
+        <w:tblPrEx>
+          <w:tblBorders>
+            <w:top w:val="single" w:color="D9D9D9" w:sz="4" w:space="0"/>
+            <w:left w:val="single" w:color="D9D9D9" w:sz="4" w:space="0"/>
+            <w:bottom w:val="single" w:color="D9D9D9" w:sz="4" w:space="0"/>
+            <w:right w:val="single" w:color="D9D9D9" w:sz="4" w:space="0"/>
+            <w:insideH w:val="single" w:color="D9D9D9" w:sz="4" w:space="0"/>
+            <w:insideV w:val="single" w:color="D9D9D9" w:sz="4" w:space="0"/>
+          </w:tblBorders>
+          <w:tblCellMar>
+            <w:top w:w="0" w:type="dxa"/>
+            <w:left w:w="108" w:type="dxa"/>
+            <w:bottom w:w="0" w:type="dxa"/>
+            <w:right w:w="108" w:type="dxa"/>
+          </w:tblCellMar>
+        </w:tblPrEx>
+        <w:trPr>
+          <w:cantSplit/>
+          <w:tblHeader/>
+          <w:jc w:val="center"/>
+        </w:trPr>
+        <w:tc>
+          <w:tcPr>
+            <w:tcW w:w="1984" w:type="dxa"/>
+            <w:vAlign w:val="center"/>
+          </w:tcPr>
+          <w:p>
+            <w:pPr>
+              <w:keepNext/>
+              <w:widowControl/>
+              <w:spacing w:before="60" w:after="60" w:line="360" w:lineRule="auto"/>
+              <w:ind w:firstLine="0"/>
+              <w:jc w:val="center"/>
+            </w:pPr>
+            <w:r>
+              <w:rPr>
+                <w:rFonts w:ascii="宋体" w:hAnsi="宋体" w:eastAsia="宋体" w:cs="宋体"/>
+                <w:b/>
+                <w:color w:val="000000"/>
+                <w:sz w:val="24"/>
+              </w:rPr>
+              <w:t>角色</w:t>
+            </w:r>
+          </w:p>
+        </w:tc>
+        <w:tc>
+          <w:tcPr>
+            <w:tcW w:w="3798" w:type="dxa"/>
+            <w:vAlign w:val="center"/>
+          </w:tcPr>
+          <w:p>
+            <w:pPr>
+              <w:keepNext/>
+              <w:widowControl/>
+              <w:spacing w:before="60" w:after="60" w:line="360" w:lineRule="auto"/>
+              <w:ind w:firstLine="0"/>
+              <w:jc w:val="center"/>
+            </w:pPr>
+            <w:r>
+              <w:rPr>
+                <w:rFonts w:ascii="宋体" w:hAnsi="宋体" w:eastAsia="宋体" w:cs="宋体"/>
+                <w:b/>
+                <w:color w:val="000000"/>
+                <w:sz w:val="24"/>
+              </w:rPr>
+              <w:t>负责什么</w:t>
+            </w:r>
+          </w:p>
+        </w:tc>
+        <w:tc>
+          <w:tcPr>
+            <w:tcW w:w="2891" w:type="dxa"/>
+            <w:vAlign w:val="center"/>
+          </w:tcPr>
+          <w:p>
+            <w:pPr>
+              <w:keepNext/>
+              <w:widowControl/>
+              <w:spacing w:before="60" w:after="60" w:line="360" w:lineRule="auto"/>
+              <w:ind w:firstLine="0"/>
+              <w:jc w:val="center"/>
+            </w:pPr>
+            <w:r>
+              <w:rPr>
+                <w:rFonts w:ascii="宋体" w:hAnsi="宋体" w:eastAsia="宋体" w:cs="宋体"/>
+                <w:b/>
+                <w:color w:val="000000"/>
+                <w:sz w:val="24"/>
+              </w:rPr>
+              <w:t>不负责什么</w:t>
+            </w:r>
+          </w:p>
+        </w:tc>
+      </w:tr>
+      <w:tr>
+        <w:tblPrEx>
+          <w:tblBorders>
+            <w:top w:val="single" w:color="D9D9D9" w:sz="4" w:space="0"/>
+            <w:left w:val="single" w:color="D9D9D9" w:sz="4" w:space="0"/>
+            <w:bottom w:val="single" w:color="D9D9D9" w:sz="4" w:space="0"/>
+            <w:right w:val="single" w:color="D9D9D9" w:sz="4" w:space="0"/>
+            <w:insideH w:val="single" w:color="D9D9D9" w:sz="4" w:space="0"/>
+            <w:insideV w:val="single" w:color="D9D9D9" w:sz="4" w:space="0"/>
+          </w:tblBorders>
+          <w:tblCellMar>
+            <w:top w:w="0" w:type="dxa"/>
+            <w:left w:w="108" w:type="dxa"/>
+            <w:bottom w:w="0" w:type="dxa"/>
+            <w:right w:w="108" w:type="dxa"/>
+          </w:tblCellMar>
+        </w:tblPrEx>
+        <w:trPr>
+          <w:cantSplit/>
+          <w:jc w:val="center"/>
+        </w:trPr>
+        <w:tc>
+          <w:tcPr>
+            <w:tcW w:w="1984" w:type="dxa"/>
+            <w:vAlign w:val="center"/>
+          </w:tcPr>
+          <w:p>
+            <w:pPr>
+              <w:keepNext/>
+              <w:widowControl/>
+              <w:spacing w:before="60" w:after="60" w:line="360" w:lineRule="auto"/>
+              <w:ind w:firstLine="0"/>
+              <w:jc w:val="center"/>
+            </w:pPr>
+            <w:r>
+              <w:rPr>
+                <w:rFonts w:ascii="宋体" w:hAnsi="宋体" w:eastAsia="宋体" w:cs="宋体"/>
+                <w:b w:val="0"/>
+                <w:color w:val="000000"/>
+                <w:sz w:val="24"/>
+              </w:rPr>
+              <w:t>人工</w:t>
+            </w:r>
+          </w:p>
+        </w:tc>
+        <w:tc>
+          <w:tcPr>
+            <w:tcW w:w="3798" w:type="dxa"/>
+            <w:vAlign w:val="center"/>
+          </w:tcPr>
+          <w:p>
+            <w:pPr>
+              <w:keepNext/>
+              <w:widowControl/>
+              <w:spacing w:before="60" w:after="60" w:line="360" w:lineRule="auto"/>
+              <w:ind w:firstLine="0"/>
+              <w:jc w:val="center"/>
+            </w:pPr>
+            <w:r>
+              <w:rPr>
+                <w:rFonts w:ascii="宋体" w:hAnsi="宋体" w:eastAsia="宋体" w:cs="宋体"/>
+                <w:b w:val="0"/>
+                <w:color w:val="000000"/>
+                <w:sz w:val="24"/>
+              </w:rPr>
+              <w:t>授权范围、输入输出契约、必要业务条件和最终发布决定</w:t>
+            </w:r>
+          </w:p>
+        </w:tc>
+        <w:tc>
+          <w:tcPr>
+            <w:tcW w:w="2891" w:type="dxa"/>
+            <w:vAlign w:val="center"/>
+          </w:tcPr>
+          <w:p>
+            <w:pPr>
+              <w:keepNext/>
+              <w:widowControl/>
+              <w:spacing w:before="60" w:after="60" w:line="360" w:lineRule="auto"/>
+              <w:ind w:firstLine="0"/>
+              <w:jc w:val="center"/>
+            </w:pPr>
+            <w:r>
+              <w:rPr>
+                <w:rFonts w:ascii="宋体" w:hAnsi="宋体" w:eastAsia="宋体" w:cs="宋体"/>
+                <w:b w:val="0"/>
+                <w:color w:val="000000"/>
+                <w:sz w:val="24"/>
+              </w:rPr>
+              <w:t>不把模型猜测直接当作漏洞结论</w:t>
+            </w:r>
+          </w:p>
+        </w:tc>
+      </w:tr>
+      <w:tr>
+        <w:tblPrEx>
+          <w:tblBorders>
+            <w:top w:val="single" w:color="D9D9D9" w:sz="4" w:space="0"/>
+            <w:left w:val="single" w:color="D9D9D9" w:sz="4" w:space="0"/>
+            <w:bottom w:val="single" w:color="D9D9D9" w:sz="4" w:space="0"/>
+            <w:right w:val="single" w:color="D9D9D9" w:sz="4" w:space="0"/>
+            <w:insideH w:val="single" w:color="D9D9D9" w:sz="4" w:space="0"/>
+            <w:insideV w:val="single" w:color="D9D9D9" w:sz="4" w:space="0"/>
+          </w:tblBorders>
+          <w:tblCellMar>
+            <w:top w:w="0" w:type="dxa"/>
+            <w:left w:w="108" w:type="dxa"/>
+            <w:bottom w:w="0" w:type="dxa"/>
+            <w:right w:w="108" w:type="dxa"/>
+          </w:tblCellMar>
+        </w:tblPrEx>
+        <w:trPr>
+          <w:cantSplit/>
+          <w:jc w:val="center"/>
+        </w:trPr>
+        <w:tc>
+          <w:tcPr>
+            <w:tcW w:w="1984" w:type="dxa"/>
+            <w:vAlign w:val="center"/>
+          </w:tcPr>
+          <w:p>
+            <w:pPr>
+              <w:keepNext/>
+              <w:widowControl/>
+              <w:spacing w:before="60" w:after="60" w:line="360" w:lineRule="auto"/>
+              <w:ind w:firstLine="0"/>
+              <w:jc w:val="center"/>
+            </w:pPr>
+            <w:r>
+              <w:rPr>
+                <w:rFonts w:ascii="宋体" w:hAnsi="宋体" w:eastAsia="宋体" w:cs="宋体"/>
+                <w:b w:val="0"/>
+                <w:color w:val="000000"/>
+                <w:sz w:val="24"/>
+              </w:rPr>
+              <w:t>固定程序</w:t>
+            </w:r>
+          </w:p>
+        </w:tc>
+        <w:tc>
+          <w:tcPr>
+            <w:tcW w:w="3798" w:type="dxa"/>
+            <w:vAlign w:val="center"/>
+          </w:tcPr>
+          <w:p>
+            <w:pPr>
+              <w:keepNext/>
+              <w:widowControl/>
+              <w:spacing w:before="60" w:after="60" w:line="360" w:lineRule="auto"/>
+              <w:ind w:firstLine="0"/>
+              <w:jc w:val="center"/>
+            </w:pPr>
+            <w:r>
+              <w:rPr>
+                <w:rFonts w:ascii="宋体" w:hAnsi="宋体" w:eastAsia="宋体" w:cs="宋体"/>
+                <w:b w:val="0"/>
+                <w:color w:val="000000"/>
+                <w:sz w:val="24"/>
+              </w:rPr>
+              <w:t>初始证据、工具协议、路径权限、隔离执行、安全/业务判定、材料绑定</w:t>
+            </w:r>
+          </w:p>
+        </w:tc>
+        <w:tc>
+          <w:tcPr>
+            <w:tcW w:w="2891" w:type="dxa"/>
+            <w:vAlign w:val="center"/>
+          </w:tcPr>
+          <w:p>
+            <w:pPr>
+              <w:keepNext/>
+              <w:widowControl/>
+              <w:spacing w:before="60" w:after="60" w:line="360" w:lineRule="auto"/>
+              <w:ind w:firstLine="0"/>
+              <w:jc w:val="center"/>
+            </w:pPr>
+            <w:r>
+              <w:rPr>
+                <w:rFonts w:ascii="宋体" w:hAnsi="宋体" w:eastAsia="宋体" w:cs="宋体"/>
+                <w:b w:val="0"/>
+                <w:color w:val="000000"/>
+                <w:sz w:val="24"/>
+              </w:rPr>
+              <w:t>不替模型理解任意代码</w:t>
+            </w:r>
+          </w:p>
+        </w:tc>
+      </w:tr>
+      <w:tr>
+        <w:tblPrEx>
+          <w:tblBorders>
+            <w:top w:val="single" w:color="D9D9D9" w:sz="4" w:space="0"/>
+            <w:left w:val="single" w:color="D9D9D9" w:sz="4" w:space="0"/>
+            <w:bottom w:val="single" w:color="D9D9D9" w:sz="4" w:space="0"/>
+            <w:right w:val="single" w:color="D9D9D9" w:sz="4" w:space="0"/>
+            <w:insideH w:val="single" w:color="D9D9D9" w:sz="4" w:space="0"/>
+            <w:insideV w:val="single" w:color="D9D9D9" w:sz="4" w:space="0"/>
+          </w:tblBorders>
+          <w:tblCellMar>
+            <w:top w:w="0" w:type="dxa"/>
+            <w:left w:w="108" w:type="dxa"/>
+            <w:bottom w:w="0" w:type="dxa"/>
+            <w:right w:w="108" w:type="dxa"/>
+          </w:tblCellMar>
+        </w:tblPrEx>
+        <w:trPr>
+          <w:cantSplit/>
+          <w:jc w:val="center"/>
+        </w:trPr>
+        <w:tc>
+          <w:tcPr>
+            <w:tcW w:w="1984" w:type="dxa"/>
+            <w:vAlign w:val="center"/>
+          </w:tcPr>
+          <w:p>
+            <w:pPr>
+              <w:keepNext w:val="0"/>
+              <w:widowControl/>
+              <w:spacing w:before="60" w:after="60" w:line="360" w:lineRule="auto"/>
+              <w:ind w:firstLine="0"/>
+              <w:jc w:val="center"/>
+            </w:pPr>
+            <w:r>
+              <w:rPr>
+                <w:rFonts w:ascii="宋体" w:hAnsi="宋体" w:eastAsia="宋体" w:cs="宋体"/>
+                <w:b w:val="0"/>
+                <w:color w:val="000000"/>
+                <w:sz w:val="24"/>
+              </w:rPr>
+              <w:t>本地模型</w:t>
+            </w:r>
+          </w:p>
+        </w:tc>
+        <w:tc>
+          <w:tcPr>
+            <w:tcW w:w="3798" w:type="dxa"/>
+            <w:vAlign w:val="center"/>
+          </w:tcPr>
+          <w:p>
+            <w:pPr>
+              <w:keepNext w:val="0"/>
+              <w:widowControl/>
+              <w:spacing w:before="60" w:after="60" w:line="360" w:lineRule="auto"/>
+              <w:ind w:firstLine="0"/>
+              <w:jc w:val="center"/>
+            </w:pPr>
+            <w:r>
+              <w:rPr>
+                <w:rFonts w:ascii="宋体" w:hAnsi="宋体" w:eastAsia="宋体" w:cs="宋体"/>
+                <w:b w:val="0"/>
+                <w:color w:val="000000"/>
+                <w:sz w:val="24"/>
+              </w:rPr>
+              <w:t>代码理解、触发假设、工具选择和候选补丁</w:t>
+            </w:r>
+          </w:p>
+        </w:tc>
+        <w:tc>
+          <w:tcPr>
+            <w:tcW w:w="2891" w:type="dxa"/>
+            <w:vAlign w:val="center"/>
+          </w:tcPr>
+          <w:p>
+            <w:pPr>
+              <w:keepNext w:val="0"/>
+              <w:widowControl/>
+              <w:spacing w:before="60" w:after="60" w:line="360" w:lineRule="auto"/>
+              <w:ind w:firstLine="0"/>
+              <w:jc w:val="center"/>
+            </w:pPr>
+            <w:r>
+              <w:rPr>
+                <w:rFonts w:ascii="宋体" w:hAnsi="宋体" w:eastAsia="宋体" w:cs="宋体"/>
+                <w:b w:val="0"/>
+                <w:color w:val="000000"/>
+                <w:sz w:val="24"/>
+              </w:rPr>
+              <w:t>不修改裁判、需求或隔离设施，不直接指定 PASS</w:t>
+            </w:r>
+          </w:p>
+        </w:tc>
+      </w:tr>
+    </w:tbl>
     <w:p>
       <w:pPr>
         <w:pStyle w:val="11"/>
@@ -1483,71 +1856,6 @@
     </w:p>
     <w:p>
       <w:pPr>
-        <w:keepNext/>
-        <w:widowControl/>
-        <w:spacing w:before="0" w:after="60" w:line="360" w:lineRule="auto"/>
-        <w:ind w:firstLine="0"/>
-        <w:jc w:val="center"/>
-      </w:pPr>
-      <w:r>
-        <w:drawing>
-          <wp:inline distT="0" distB="0" distL="114300" distR="114300">
-            <wp:extent cx="5471795" cy="3079750"/>
-            <wp:effectExtent l="0" t="0" r="14605" b="6350"/>
-            <wp:docPr id="2" name="Picture 2"/>
-            <wp:cNvGraphicFramePr>
-              <a:graphicFrameLocks xmlns:a="http://schemas.openxmlformats.org/drawingml/2006/main" noChangeAspect="1"/>
-            </wp:cNvGraphicFramePr>
-            <a:graphic xmlns:a="http://schemas.openxmlformats.org/drawingml/2006/main">
-              <a:graphicData uri="http://schemas.openxmlformats.org/drawingml/2006/picture">
-                <pic:pic xmlns:pic="http://schemas.openxmlformats.org/drawingml/2006/picture">
-                  <pic:nvPicPr>
-                    <pic:cNvPr id="2" name="Picture 2"/>
-                    <pic:cNvPicPr>
-                      <a:picLocks noChangeAspect="1"/>
-                    </pic:cNvPicPr>
-                  </pic:nvPicPr>
-                  <pic:blipFill>
-                    <a:blip r:embed="rId13"/>
-                    <a:stretch>
-                      <a:fillRect/>
-                    </a:stretch>
-                  </pic:blipFill>
-                  <pic:spPr>
-                    <a:xfrm>
-                      <a:off x="0" y="0"/>
-                      <a:ext cx="5472000" cy="3079893"/>
-                    </a:xfrm>
-                    <a:prstGeom prst="rect">
-                      <a:avLst/>
-                    </a:prstGeom>
-                  </pic:spPr>
-                </pic:pic>
-              </a:graphicData>
-            </a:graphic>
-          </wp:inline>
-        </w:drawing>
-      </w:r>
-    </w:p>
-    <w:p>
-      <w:pPr>
-        <w:widowControl/>
-        <w:spacing w:before="0" w:after="60" w:line="360" w:lineRule="auto"/>
-        <w:ind w:firstLine="0"/>
-        <w:jc w:val="center"/>
-      </w:pPr>
-      <w:r>
-        <w:rPr>
-          <w:rFonts w:ascii="宋体" w:hAnsi="宋体" w:eastAsia="宋体" w:cs="宋体"/>
-          <w:b w:val="0"/>
-          <w:color w:val="000000"/>
-          <w:sz w:val="24"/>
-        </w:rPr>
-        <w:t>图 2 真实工作台中的证据与独立任务状态</w:t>
-      </w:r>
-    </w:p>
-    <w:p>
-      <w:pPr>
         <w:pStyle w:val="11"/>
         <w:keepNext/>
         <w:spacing w:before="120" w:after="60" w:line="360" w:lineRule="auto"/>
@@ -1620,7 +1928,7 @@
         <w:ind w:firstLine="0"/>
         <w:jc w:val="center"/>
       </w:pPr>
-      <w:bookmarkStart w:id="3" w:name="_Toc31439"/>
+      <w:bookmarkStart w:id="3" w:name="_Toc2249"/>
       <w:r>
         <w:rPr>
           <w:rFonts w:ascii="黑体" w:hAnsi="黑体" w:eastAsia="黑体" w:cs="黑体"/>
@@ -2513,71 +2821,6 @@
     </w:p>
     <w:p>
       <w:pPr>
-        <w:keepNext/>
-        <w:widowControl/>
-        <w:spacing w:before="0" w:after="60" w:line="360" w:lineRule="auto"/>
-        <w:ind w:firstLine="0"/>
-        <w:jc w:val="center"/>
-      </w:pPr>
-      <w:r>
-        <w:drawing>
-          <wp:inline distT="0" distB="0" distL="114300" distR="114300">
-            <wp:extent cx="5471795" cy="3079750"/>
-            <wp:effectExtent l="0" t="0" r="14605" b="6350"/>
-            <wp:docPr id="3" name="Picture 3"/>
-            <wp:cNvGraphicFramePr>
-              <a:graphicFrameLocks xmlns:a="http://schemas.openxmlformats.org/drawingml/2006/main" noChangeAspect="1"/>
-            </wp:cNvGraphicFramePr>
-            <a:graphic xmlns:a="http://schemas.openxmlformats.org/drawingml/2006/main">
-              <a:graphicData uri="http://schemas.openxmlformats.org/drawingml/2006/picture">
-                <pic:pic xmlns:pic="http://schemas.openxmlformats.org/drawingml/2006/picture">
-                  <pic:nvPicPr>
-                    <pic:cNvPr id="3" name="Picture 3"/>
-                    <pic:cNvPicPr>
-                      <a:picLocks noChangeAspect="1"/>
-                    </pic:cNvPicPr>
-                  </pic:nvPicPr>
-                  <pic:blipFill>
-                    <a:blip r:embed="rId14"/>
-                    <a:stretch>
-                      <a:fillRect/>
-                    </a:stretch>
-                  </pic:blipFill>
-                  <pic:spPr>
-                    <a:xfrm>
-                      <a:off x="0" y="0"/>
-                      <a:ext cx="5472000" cy="3079893"/>
-                    </a:xfrm>
-                    <a:prstGeom prst="rect">
-                      <a:avLst/>
-                    </a:prstGeom>
-                  </pic:spPr>
-                </pic:pic>
-              </a:graphicData>
-            </a:graphic>
-          </wp:inline>
-        </w:drawing>
-      </w:r>
-    </w:p>
-    <w:p>
-      <w:pPr>
-        <w:widowControl/>
-        <w:spacing w:before="0" w:after="60" w:line="360" w:lineRule="auto"/>
-        <w:ind w:firstLine="0"/>
-        <w:jc w:val="center"/>
-      </w:pPr>
-      <w:r>
-        <w:rPr>
-          <w:rFonts w:ascii="宋体" w:hAnsi="宋体" w:eastAsia="宋体" w:cs="宋体"/>
-          <w:b w:val="0"/>
-          <w:color w:val="000000"/>
-          <w:sz w:val="24"/>
-        </w:rPr>
-        <w:t>图 3 h03 两次候选与真实验证反馈 历史记录回放</w:t>
-      </w:r>
-    </w:p>
-    <w:p>
-      <w:pPr>
         <w:pStyle w:val="11"/>
         <w:keepNext/>
         <w:spacing w:before="120" w:after="60" w:line="360" w:lineRule="auto"/>
@@ -2707,7 +2950,7 @@
           <w:color w:val="000000"/>
           <w:sz w:val="24"/>
         </w:rPr>
-        <w:t>为检验旧样例之外的接入可行性，本版选取 Twine 配置读取组件的公开历史问题 [6]。PR #1240 记录了解析格式错误配置时，未处理异常可能将敏感内容带到控制台。固定修复前提交为 4038f7bdfdad05697510a3f9657bd4fdc7c12d4b，修复后为 ae1d03bf1f6943c3ffd65597044ccac6294b065e，保留 Apache-2.0 许可及源码。这是真实历史问题，不是人工注入；仅接入配置文件分支，不执行上传或公网认证。</w:t>
+        <w:t>为检验旧样例之外的接入可行性，本版选取 PyPA Twine 配置读取组件的公开历史问题[6]。PR #1240 记录了解析格式错误配置时，未处理异常可能将敏感内容带到控制台。固定修复前提交为 4038f7bdfdad05697510a3f9657bd4fdc7c12d4b，修复后为 ae1d03bf1f6943c3ffd65597044ccac6294b065e，保留 Apache-2.0 许可及原文件。这是真实历史问题，不是人工注入；本项目不把它声称为新发现、上游采纳或企业部署。</w:t>
       </w:r>
     </w:p>
     <w:p>
@@ -2723,7 +2966,7 @@
           <w:color w:val="000000"/>
           <w:sz w:val="24"/>
         </w:rPr>
-        <w:t>适配器逐字保留原配置解析及必要错误处理函数，只允许新增一个受限配置异常转换分支，原业务 AST 不可改变。七项预定条件包含三类错误配置、两类正常配置、缺仓库和缺文件。原版在三类错误配置下输出合成凭据，其他四项通过；上游修复版七项通过。固定程序先提供脱敏证据，随后进行一次本地模型任务，5 次调用、3 份候选：前两份超出修改边界被拒绝，第三份通过七项检查并完成任务。拒绝属于修改权限检查，与 h03 已执行补丁的动态泄露失败不同。</w:t>
+        <w:t>适配器只执行 get_repository_from_config 的配置文件分支，保留 get_config、URL 规范化、异常类和原有业务逻辑；只允许新增一个解析异常转换分支，不执行上传或公网认证。七项条件包括三类格式错误、两类正常配置、缺仓库和缺文件。修复前版本在三类格式错误下把合成凭据带入 stderr，其他四项通过；上游修复版七项通过。</w:t>
       </w:r>
     </w:p>
     <w:p>
@@ -2739,72 +2982,23 @@
           <w:color w:val="000000"/>
           <w:sz w:val="24"/>
         </w:rPr>
-        <w:t>新目录复检确认材料完整、旧报告适用、当前对象通过。该结果说明保留上游业务组件的一种窄适配可行；修改轮廓预先受限，不代表任意项目接入或模型全面自主修复。一个外部场景的七项条件不作为七个新增案例，不与前述八例合并统计。</w:t>
-      </w:r>
-    </w:p>
-    <w:p>
-      <w:pPr>
-        <w:keepNext/>
-        <w:widowControl/>
-        <w:spacing w:before="0" w:after="60" w:line="360" w:lineRule="auto"/>
-        <w:ind w:firstLine="0"/>
-        <w:jc w:val="center"/>
-      </w:pPr>
-      <w:r>
-        <w:drawing>
-          <wp:inline distT="0" distB="0" distL="114300" distR="114300">
-            <wp:extent cx="5471795" cy="3079750"/>
-            <wp:effectExtent l="0" t="0" r="14605" b="6350"/>
-            <wp:docPr id="4" name="Picture 4"/>
-            <wp:cNvGraphicFramePr>
-              <a:graphicFrameLocks xmlns:a="http://schemas.openxmlformats.org/drawingml/2006/main" noChangeAspect="1"/>
-            </wp:cNvGraphicFramePr>
-            <a:graphic xmlns:a="http://schemas.openxmlformats.org/drawingml/2006/main">
-              <a:graphicData uri="http://schemas.openxmlformats.org/drawingml/2006/picture">
-                <pic:pic xmlns:pic="http://schemas.openxmlformats.org/drawingml/2006/picture">
-                  <pic:nvPicPr>
-                    <pic:cNvPr id="4" name="Picture 4"/>
-                    <pic:cNvPicPr>
-                      <a:picLocks noChangeAspect="1"/>
-                    </pic:cNvPicPr>
-                  </pic:nvPicPr>
-                  <pic:blipFill>
-                    <a:blip r:embed="rId15"/>
-                    <a:stretch>
-                      <a:fillRect/>
-                    </a:stretch>
-                  </pic:blipFill>
-                  <pic:spPr>
-                    <a:xfrm>
-                      <a:off x="0" y="0"/>
-                      <a:ext cx="5472000" cy="3079893"/>
-                    </a:xfrm>
-                    <a:prstGeom prst="rect">
-                      <a:avLst/>
-                    </a:prstGeom>
-                  </pic:spPr>
-                </pic:pic>
-              </a:graphicData>
-            </a:graphic>
-          </wp:inline>
-        </w:drawing>
-      </w:r>
-    </w:p>
-    <w:p>
-      <w:pPr>
-        <w:widowControl/>
-        <w:spacing w:before="0" w:after="60" w:line="360" w:lineRule="auto"/>
-        <w:ind w:firstLine="0"/>
-        <w:jc w:val="center"/>
-      </w:pPr>
-      <w:r>
-        <w:rPr>
-          <w:rFonts w:ascii="宋体" w:hAnsi="宋体" w:eastAsia="宋体" w:cs="宋体"/>
-          <w:b w:val="0"/>
-          <w:color w:val="000000"/>
-          <w:sz w:val="24"/>
-        </w:rPr>
-        <w:t>图 4 当前对象的实际复检记录 不调用模型</w:t>
+        <w:t>一次本地模型任务共 5 次调用、3 份候选。第一份追加两个 handler，第二份使用超出固定轮廓的元组异常类型，二者在执行前因修改权限边界被拒；第三份只追加 configparser.Error 到安全 InvalidConfiguration 的转换，进入隔离后七项条件全部通过。格式不合法、越界候选和已执行后仍有泄露是三个不同状态，不能都写成“修复失败”。</w:t>
+      </w:r>
+    </w:p>
+    <w:p>
+      <w:pPr>
+        <w:widowControl/>
+        <w:spacing w:before="0" w:after="60" w:line="360" w:lineRule="auto"/>
+        <w:ind w:firstLine="480"/>
+      </w:pPr>
+      <w:r>
+        <w:rPr>
+          <w:rFonts w:ascii="宋体" w:hAnsi="宋体" w:eastAsia="宋体" w:cs="宋体"/>
+          <w:b w:val="0"/>
+          <w:color w:val="000000"/>
+          <w:sz w:val="24"/>
+        </w:rPr>
+        <w:t>新目录复检重新读取材料并确认当前对象通过。这个结果支持“保留上游业务组件的窄适配可行”，不支持任意项目接入、通用自主修复或优于固定规则的结论；一个外部组件的七项条件不增加八例统计分母。</w:t>
       </w:r>
     </w:p>
     <w:p>
@@ -2865,7 +3059,7 @@
         <w:ind w:firstLine="0"/>
         <w:jc w:val="center"/>
       </w:pPr>
-      <w:bookmarkStart w:id="4" w:name="_Toc2945"/>
+      <w:bookmarkStart w:id="4" w:name="_Toc26221"/>
       <w:r>
         <w:rPr>
           <w:rFonts w:ascii="黑体" w:hAnsi="黑体" w:eastAsia="黑体" w:cs="黑体"/>
@@ -2908,7 +3102,23 @@
           <w:color w:val="000000"/>
           <w:sz w:val="24"/>
         </w:rPr>
-        <w:t>围绕运行时凭据的具体传播路径，把代码、触发条件和脱敏观察组织为模型可使用的反馈。模型能够为参数日志等结构提出候选，验收失败则返回实际问题。h01 和 h03 分别给出了有效候选与失败后调整的可核查实例。</w:t>
+        <w:t>具体困难是：一次性补丁可能只改表面文本，无法说明真实值是否消失。密证的设计是让固定程序先执行已登记触发，把脱敏观察和失败回执交给模型；模型可以在预算内调整候选，程序再次检查。h03 的候选1仍输出真实值，回执进入后续请求后候选2改为固定安全错误信息并通过；h01 则展示参数日志这一固定启发式遗漏的有限增量。</w:t>
+      </w:r>
+    </w:p>
+    <w:p>
+      <w:pPr>
+        <w:widowControl/>
+        <w:spacing w:before="0" w:after="60" w:line="360" w:lineRule="auto"/>
+        <w:ind w:firstLine="480"/>
+      </w:pPr>
+      <w:r>
+        <w:rPr>
+          <w:rFonts w:ascii="宋体" w:hAnsi="宋体" w:eastAsia="宋体" w:cs="宋体"/>
+          <w:b w:val="0"/>
+          <w:color w:val="000000"/>
+          <w:sz w:val="24"/>
+        </w:rPr>
+        <w:t>本项目实现的是受控工具协议、反馈记录和候选状态，不是新的模型训练或通用修复算法。相比一次性模型修复，它多了一次基于当前执行结果的候选调整路径；相比完全固定脚本，它允许在已登记结构内利用代码语义提出不同候选。两种基线都可能在部分案例中成功，本轮没有证明普遍优势。</w:t>
       </w:r>
     </w:p>
     <w:p>
@@ -2942,7 +3152,23 @@
           <w:color w:val="000000"/>
           <w:sz w:val="24"/>
         </w:rPr>
-        <w:t>把是否有权修改、当前候选是否合格、任务是否完成交给固定程序判定。允许认证通道与禁止泄露通道分别检查，安全检查与业务条件共同验收。模型的判断可以保留和审查，而候选落地有明确依据，正常代码可以经过验证后保持原样。</w:t>
+        <w:t>具体困难是：模型建议不能自行获得写入和“通过”权限，安全修复也不能通过删除业务行为换取绿色结果。密证让执行侧固定当前副本、可信需求、允许修改范围、禁止输出通道和必要业务检查。只有有效泄露证据授权修改，候选通过协议和边界检查后，才进入隔离执行；裁判同时检查泄露是否消除、认证调用、成功响应、拒绝、异常和修改边界。</w:t>
+      </w:r>
+    </w:p>
+    <w:p>
+      <w:pPr>
+        <w:widowControl/>
+        <w:spacing w:before="0" w:after="60" w:line="360" w:lineRule="auto"/>
+        <w:ind w:firstLine="480"/>
+      </w:pPr>
+      <w:r>
+        <w:rPr>
+          <w:rFonts w:ascii="宋体" w:hAnsi="宋体" w:eastAsia="宋体" w:cs="宋体"/>
+          <w:b w:val="0"/>
+          <w:color w:val="000000"/>
+          <w:sz w:val="24"/>
+        </w:rPr>
+        <w:t>h07 中模型有疑点但没有实际泄露证据，原对象保持不变；Twine 前两候选在执行前因越界被拒，第三候选才进入七项检查。这些证据说明程序实施了权限与联合验收，不说明模型没有误报，也不把普通状态控制或隔离技术称为首创。</w:t>
       </w:r>
     </w:p>
     <w:p>
@@ -2976,7 +3202,23 @@
           <w:color w:val="000000"/>
           <w:sz w:val="24"/>
         </w:rPr>
-        <w:t>把代码对象、需求规则、模型过程和验收回执组织为对应材料。导出前后检查对象变化，复检重新执行固定条件，并区分历史材料完整性、旧报告适用性和当前判决。使用者可以从页面结论回到证据，也可以在不调用模型的情况下复查交付对象。</w:t>
+        <w:t>具体困难是：保存一个 PASS 字段不能保证它仍对应当前代码、规则和检查条件。密证导出原件、当前候选、需求、规则、轨迹和绑定信息；复检重新读取这些材料并执行必要检查，分别报告旧报告适用性、历史材料完整性和当前结果。对象变化时不复用旧缓存结论，材料缺失会显式显示而不伪装成“证据齐全”。</w:t>
+      </w:r>
+    </w:p>
+    <w:p>
+      <w:pPr>
+        <w:widowControl/>
+        <w:spacing w:before="0" w:after="60" w:line="360" w:lineRule="auto"/>
+        <w:ind w:firstLine="480"/>
+      </w:pPr>
+      <w:r>
+        <w:rPr>
+          <w:rFonts w:ascii="宋体" w:hAnsi="宋体" w:eastAsia="宋体" w:cs="宋体"/>
+          <w:b w:val="0"/>
+          <w:color w:val="000000"/>
+          <w:sz w:val="24"/>
+        </w:rPr>
+        <w:t>相关实现位于 agent_pilot/web.py 的材料绑定和 agent_pilot/bundle.py 的复检逻辑。对象变化定向回归、h01/h03/h07 材料和 Twine 新目录复检共同支持这一交付主张。普通哈希只能检测相对清单的变化，不是第三方认证或不可伪造证明。</w:t>
       </w:r>
     </w:p>
     <w:tbl>
@@ -3047,7 +3289,7 @@
                 <w:color w:val="000000"/>
                 <w:sz w:val="24"/>
               </w:rPr>
-              <w:t>特点对应实现</w:t>
+              <w:t>特点</w:t>
             </w:r>
           </w:p>
         </w:tc>
@@ -3095,7 +3337,7 @@
                 <w:color w:val="000000"/>
                 <w:sz w:val="24"/>
               </w:rPr>
-              <w:t>依据</w:t>
+              <w:t>主要依据</w:t>
             </w:r>
           </w:p>
         </w:tc>
@@ -3141,7 +3383,7 @@
                 <w:color w:val="000000"/>
                 <w:sz w:val="24"/>
               </w:rPr>
-              <w:t>证据与反馈</w:t>
+              <w:t>证据反馈</w:t>
             </w:r>
           </w:p>
         </w:tc>
@@ -3165,7 +3407,7 @@
                 <w:color w:val="000000"/>
                 <w:sz w:val="24"/>
               </w:rPr>
-              <w:t>reliability.GovernedSession；model_client.LocalAgentClient</w:t>
+              <w:t>reliability.GovernedSession、model_client.LocalAgentClient</w:t>
             </w:r>
           </w:p>
         </w:tc>
@@ -3259,7 +3501,7 @@
                 <w:color w:val="000000"/>
                 <w:sz w:val="24"/>
               </w:rPr>
-              <w:t>judge.judge_trial；isolation.run_isolated；external_twine.boundary</w:t>
+              <w:t>judge.judge_trial、isolation.run_isolated、external_twine.boundary</w:t>
             </w:r>
           </w:p>
         </w:tc>
@@ -3283,7 +3525,7 @@
                 <w:color w:val="000000"/>
                 <w:sz w:val="24"/>
               </w:rPr>
-              <w:t>h07 正常保留；Twine 越界候选被拒绝</w:t>
+              <w:t>h07 正常保留；Twine 越界候选被拒</w:t>
             </w:r>
           </w:p>
         </w:tc>
@@ -3353,7 +3595,7 @@
                 <w:color w:val="000000"/>
                 <w:sz w:val="24"/>
               </w:rPr>
-              <w:t>web._require_current_material；bundle.recheck_bundle</w:t>
+              <w:t>web._require_current_material、bundle.recheck_bundle</w:t>
             </w:r>
           </w:p>
         </w:tc>
@@ -3377,7 +3619,7 @@
                 <w:color w:val="000000"/>
                 <w:sz w:val="24"/>
               </w:rPr>
-              <w:t>导出绑定回归；当前对象的新复检</w:t>
+              <w:t>对象变化回归；当前对象的新复检</w:t>
             </w:r>
           </w:p>
         </w:tc>
@@ -3385,29 +3627,13 @@
     </w:tbl>
     <w:p>
       <w:pPr>
-        <w:widowControl/>
-        <w:spacing w:before="0" w:after="60" w:line="360" w:lineRule="auto"/>
-        <w:ind w:firstLine="480"/>
-      </w:pPr>
-      <w:r>
-        <w:rPr>
-          <w:rFonts w:ascii="宋体" w:hAnsi="宋体" w:eastAsia="宋体" w:cs="宋体"/>
-          <w:b w:val="0"/>
-          <w:color w:val="000000"/>
-          <w:sz w:val="24"/>
-        </w:rPr>
-        <w:t>项目的工程增量在于将有既有来源的模型、框架、测试、摘要和隔离技术，组织成可操作、可解释、可复检的安全修复流程。</w:t>
-      </w:r>
-    </w:p>
-    <w:p>
-      <w:pPr>
         <w:pStyle w:val="2"/>
         <w:keepNext/>
         <w:spacing w:before="160" w:after="100" w:line="360" w:lineRule="auto"/>
         <w:ind w:firstLine="0"/>
         <w:jc w:val="center"/>
       </w:pPr>
-      <w:bookmarkStart w:id="5" w:name="_Toc23833"/>
+      <w:bookmarkStart w:id="5" w:name="_Toc3656"/>
       <w:r>
         <w:rPr>
           <w:rFonts w:ascii="黑体" w:hAnsi="黑体" w:eastAsia="黑体" w:cs="黑体"/>
@@ -3432,7 +3658,7 @@
           <w:color w:val="000000"/>
           <w:sz w:val="24"/>
         </w:rPr>
-        <w:t>密证已经形成“观察证据—候选生成—受控修改—安全与业务验收—材料复检”的可运行原型。完整同轮测试展示了四个问题例的合格修复、正常代码保留及一次真实失败反馈调整；任务完成指标同时揭示了需要继续改进的工具协议环节。工作台把这些过程和结果连到具体对象，为开发者提供可检查的修复辅助。</w:t>
+        <w:t>密证已经形成“观察证据—候选生成—受控修改—安全与业务验收—材料复检”的可运行原型。它不是把所有安全工作交给模型，而是让模型在明确边界内处理代码理解和候选生成，让固定程序保留证据、权限和判定。完整同轮测试展示了四个问题例的合格修复、正常代码保留及一次真实失败反馈调整；任务完成指标同时揭示了工具协议仍需改进。Twine 外部接入说明了一条窄组件适配路径，未被写成泛化成绩。</w:t>
       </w:r>
     </w:p>
     <w:p>
@@ -3448,7 +3674,23 @@
           <w:color w:val="000000"/>
           <w:sz w:val="24"/>
         </w:rPr>
-        <w:t>后续优先提升协议稳定性和展示体验，增加授权组件适配，邀请不同作者扩展代码结构与业务条件。新增评估独立冻结、与已知回归分开统计，材料复检继续服务于协作评审和成果交接。</w:t>
+        <w:t>作品对使用者的直接交付是：一份有实际执行依据的候选补丁、对应的安全与业务检查、以及可以由下一位开发者重新验收的材料。人工时间节省、企业部署收益、跨机器适配和任意代码库泛化尚未测量。本轮另准备了供 2—3 位未参与开发者执行的探索性体验包，但尚无真人结果，不把待执行材料写成用户研究结论。</w:t>
+      </w:r>
+    </w:p>
+    <w:p>
+      <w:pPr>
+        <w:widowControl/>
+        <w:spacing w:before="0" w:after="60" w:line="360" w:lineRule="auto"/>
+        <w:ind w:firstLine="480"/>
+      </w:pPr>
+      <w:r>
+        <w:rPr>
+          <w:rFonts w:ascii="宋体" w:hAnsi="宋体" w:eastAsia="宋体" w:cs="宋体"/>
+          <w:b w:val="0"/>
+          <w:color w:val="000000"/>
+          <w:sz w:val="24"/>
+        </w:rPr>
+        <w:t>后续优先提升协议稳定性和授权组件覆盖，邀请不同作者构造新案例，并把新评估与已知回归分开统计。</w:t>
       </w:r>
     </w:p>
     <w:p>
@@ -3493,7 +3735,7 @@
         <w:ind w:firstLine="0"/>
         <w:jc w:val="center"/>
       </w:pPr>
-      <w:bookmarkStart w:id="6" w:name="_Toc30199"/>
+      <w:bookmarkStart w:id="6" w:name="_Toc11030"/>
       <w:r>
         <w:rPr>
           <w:rFonts w:ascii="黑体" w:hAnsi="黑体" w:eastAsia="黑体" w:cs="黑体"/>
@@ -4271,6 +4513,7 @@
   </w:style>
   <w:style w:type="paragraph" w:customStyle="1" w:styleId="10">
     <w:name w:val="Title"/>
+    <w:qFormat/>
     <w:uiPriority w:val="0"/>
     <w:rPr>
       <w:rFonts w:ascii="黑体" w:hAnsi="黑体" w:eastAsia="宋体" w:cs="Times New Roman"/>

</xml_diff>

<commit_message>
docs(candidate): tie claims to evidence and user value
</commit_message>
<xml_diff>
--- a/docs/preliminary-candidate/credproof-manuscript-candidate.docx
+++ b/docs/preliminary-candidate/credproof-manuscript-candidate.docx
@@ -558,7 +558,7 @@
         <w:rPr>
           <w:rFonts w:ascii="宋体" w:hAnsi="宋体" w:eastAsia="宋体" w:cs="宋体"/>
         </w:rPr>
-        <w:instrText xml:space="preserve"> HYPERLINK \l _Toc3161 </w:instrText>
+        <w:instrText xml:space="preserve"> HYPERLINK \l _Toc18758 </w:instrText>
       </w:r>
       <w:r>
         <w:rPr>
@@ -579,7 +579,7 @@
         <w:fldChar w:fldCharType="begin"/>
       </w:r>
       <w:r>
-        <w:instrText xml:space="preserve"> PAGEREF _Toc3161 \h </w:instrText>
+        <w:instrText xml:space="preserve"> PAGEREF _Toc18758 \h </w:instrText>
       </w:r>
       <w:r>
         <w:fldChar w:fldCharType="separate"/>
@@ -616,7 +616,7 @@
         <w:rPr>
           <w:rFonts w:ascii="宋体" w:hAnsi="宋体" w:eastAsia="宋体" w:cs="宋体"/>
         </w:rPr>
-        <w:instrText xml:space="preserve"> HYPERLINK \l _Toc27002 </w:instrText>
+        <w:instrText xml:space="preserve"> HYPERLINK \l _Toc24465 </w:instrText>
       </w:r>
       <w:r>
         <w:rPr>
@@ -637,7 +637,7 @@
         <w:fldChar w:fldCharType="begin"/>
       </w:r>
       <w:r>
-        <w:instrText xml:space="preserve"> PAGEREF _Toc27002 \h </w:instrText>
+        <w:instrText xml:space="preserve"> PAGEREF _Toc24465 \h </w:instrText>
       </w:r>
       <w:r>
         <w:fldChar w:fldCharType="separate"/>
@@ -674,7 +674,7 @@
         <w:rPr>
           <w:rFonts w:ascii="宋体" w:hAnsi="宋体" w:eastAsia="宋体" w:cs="宋体"/>
         </w:rPr>
-        <w:instrText xml:space="preserve"> HYPERLINK \l _Toc1375 </w:instrText>
+        <w:instrText xml:space="preserve"> HYPERLINK \l _Toc3943 </w:instrText>
       </w:r>
       <w:r>
         <w:rPr>
@@ -695,7 +695,7 @@
         <w:fldChar w:fldCharType="begin"/>
       </w:r>
       <w:r>
-        <w:instrText xml:space="preserve"> PAGEREF _Toc1375 \h </w:instrText>
+        <w:instrText xml:space="preserve"> PAGEREF _Toc3943 \h </w:instrText>
       </w:r>
       <w:r>
         <w:fldChar w:fldCharType="separate"/>
@@ -732,7 +732,7 @@
         <w:rPr>
           <w:rFonts w:ascii="宋体" w:hAnsi="宋体" w:eastAsia="宋体" w:cs="宋体"/>
         </w:rPr>
-        <w:instrText xml:space="preserve"> HYPERLINK \l _Toc2249 </w:instrText>
+        <w:instrText xml:space="preserve"> HYPERLINK \l _Toc3312 </w:instrText>
       </w:r>
       <w:r>
         <w:rPr>
@@ -753,13 +753,13 @@
         <w:fldChar w:fldCharType="begin"/>
       </w:r>
       <w:r>
-        <w:instrText xml:space="preserve"> PAGEREF _Toc2249 \h </w:instrText>
+        <w:instrText xml:space="preserve"> PAGEREF _Toc3312 \h </w:instrText>
       </w:r>
       <w:r>
         <w:fldChar w:fldCharType="separate"/>
       </w:r>
       <w:r>
-        <w:t>7</w:t>
+        <w:t>8</w:t>
       </w:r>
       <w:r>
         <w:fldChar w:fldCharType="end"/>
@@ -790,7 +790,7 @@
         <w:rPr>
           <w:rFonts w:ascii="宋体" w:hAnsi="宋体" w:eastAsia="宋体" w:cs="宋体"/>
         </w:rPr>
-        <w:instrText xml:space="preserve"> HYPERLINK \l _Toc26221 </w:instrText>
+        <w:instrText xml:space="preserve"> HYPERLINK \l _Toc32170 </w:instrText>
       </w:r>
       <w:r>
         <w:rPr>
@@ -811,13 +811,13 @@
         <w:fldChar w:fldCharType="begin"/>
       </w:r>
       <w:r>
-        <w:instrText xml:space="preserve"> PAGEREF _Toc26221 \h </w:instrText>
+        <w:instrText xml:space="preserve"> PAGEREF _Toc32170 \h </w:instrText>
       </w:r>
       <w:r>
         <w:fldChar w:fldCharType="separate"/>
       </w:r>
       <w:r>
-        <w:t>10</w:t>
+        <w:t>12</w:t>
       </w:r>
       <w:r>
         <w:fldChar w:fldCharType="end"/>
@@ -848,7 +848,7 @@
         <w:rPr>
           <w:rFonts w:ascii="宋体" w:hAnsi="宋体" w:eastAsia="宋体" w:cs="宋体"/>
         </w:rPr>
-        <w:instrText xml:space="preserve"> HYPERLINK \l _Toc3656 </w:instrText>
+        <w:instrText xml:space="preserve"> HYPERLINK \l _Toc32303 </w:instrText>
       </w:r>
       <w:r>
         <w:rPr>
@@ -869,13 +869,13 @@
         <w:fldChar w:fldCharType="begin"/>
       </w:r>
       <w:r>
-        <w:instrText xml:space="preserve"> PAGEREF _Toc3656 \h </w:instrText>
+        <w:instrText xml:space="preserve"> PAGEREF _Toc32303 \h </w:instrText>
       </w:r>
       <w:r>
         <w:fldChar w:fldCharType="separate"/>
       </w:r>
       <w:r>
-        <w:t>11</w:t>
+        <w:t>14</w:t>
       </w:r>
       <w:r>
         <w:fldChar w:fldCharType="end"/>
@@ -906,7 +906,7 @@
         <w:rPr>
           <w:rFonts w:ascii="宋体" w:hAnsi="宋体" w:eastAsia="宋体" w:cs="宋体"/>
         </w:rPr>
-        <w:instrText xml:space="preserve"> HYPERLINK \l _Toc11030 </w:instrText>
+        <w:instrText xml:space="preserve"> HYPERLINK \l _Toc6258 </w:instrText>
       </w:r>
       <w:r>
         <w:rPr>
@@ -927,13 +927,13 @@
         <w:fldChar w:fldCharType="begin"/>
       </w:r>
       <w:r>
-        <w:instrText xml:space="preserve"> PAGEREF _Toc11030 \h </w:instrText>
+        <w:instrText xml:space="preserve"> PAGEREF _Toc6258 \h </w:instrText>
       </w:r>
       <w:r>
         <w:fldChar w:fldCharType="separate"/>
       </w:r>
       <w:r>
-        <w:t>12</w:t>
+        <w:t>15</w:t>
       </w:r>
       <w:r>
         <w:fldChar w:fldCharType="end"/>
@@ -968,7 +968,7 @@
         <w:ind w:firstLine="0"/>
         <w:jc w:val="center"/>
       </w:pPr>
-      <w:bookmarkStart w:id="0" w:name="_Toc3161"/>
+      <w:bookmarkStart w:id="0" w:name="_Toc18758"/>
       <w:r>
         <w:rPr>
           <w:rFonts w:ascii="黑体" w:hAnsi="黑体" w:eastAsia="黑体" w:cs="黑体"/>
@@ -993,7 +993,7 @@
           <w:color w:val="000000"/>
           <w:sz w:val="24"/>
         </w:rPr>
-        <w:t>当 AI 工具从环境变量读取凭据时，源码没有硬编码密钥，也可能在异常返回、日志或辅助函数中暴露运行时真实值。密证 CredProof 面向维护自有或获授权 Python 工具的开发者与安全人员，在发现这类线索后，把受控执行证据、候选补丁、安全与业务验收以及对应对象复检材料串成一条可交付流程。固定程序先确认触发条件和泄露通道，本地模型阅读代码与脱敏观察、提出候选，程序再判断是否允许修改和是否满足必要条件。h01 展示模型补足固定启发式未覆盖的参数日志修复；h03 展示第一份“看似脱敏”补丁因真实值仍在而被拒，反馈进入后续请求后第二份补丁通过；h07 展示无实际泄露证据时原代码保持不变。冻结八例中，C-Agent 完成四个问题例的合格修复，四个正常例实际修改为 0/4，完整任务为 6/8；失败和未完成记录保留。另有一个 Twine 公开历史问题的窄组件接入，第三份候选通过七项固定条件，不并入八例分母。密证交付的不只是一份补丁，还包括能回到具体对象重新检查的依据。</w:t>
+        <w:t>凭据没有写进源码，也可能在工具执行时流入日志和异常返回。密证 CredProof 面向维护自有或授权 Python 工具的开发者，将泄露线索转化为可交付复查的候选修复。人工固定需求和允许范围，程序生成受控证据，本地模型提出补丁，程序联合检查泄露、业务行为与修改边界。h01 展示模型补足本项目固定启发式遗漏的参数日志；h03 展示脱敏前缀未移除真实值，失败反馈后第二候选通过；h07 保留未发现泄露的原代码。冻结八例中，Agent 取得四个问题例的合格补丁，完整任务六例，未完成记录保留。另对 Twine 一个公开历史问题进行窄组件复现与修复验证，独立导出材料并复检。作品提供的不只是补丁，还有对应副本和条件的验收依据，帮助开发者判断是否接受修复。</w:t>
       </w:r>
     </w:p>
     <w:p>
@@ -1025,7 +1025,7 @@
         <w:ind w:firstLine="0"/>
         <w:jc w:val="center"/>
       </w:pPr>
-      <w:bookmarkStart w:id="1" w:name="_Toc27002"/>
+      <w:bookmarkStart w:id="1" w:name="_Toc24465"/>
       <w:r>
         <w:rPr>
           <w:rFonts w:ascii="黑体" w:hAnsi="黑体" w:eastAsia="黑体" w:cs="黑体"/>
@@ -1096,15 +1096,6 @@
       <w:r>
         <w:rPr>
           <w:rFonts w:ascii="宋体" w:hAnsi="宋体" w:eastAsia="宋体" w:cs="宋体"/>
-          <w:b w:val="0"/>
-          <w:color w:val="000000"/>
-          <w:sz w:val="24"/>
-        </w:rPr>
-        <w:t>一句话记忆点是：</w:t>
-      </w:r>
-      <w:r>
-        <w:rPr>
-          <w:rFonts w:ascii="宋体" w:hAnsi="宋体" w:eastAsia="宋体" w:cs="宋体"/>
           <w:b/>
           <w:color w:val="000000"/>
           <w:sz w:val="24"/>
@@ -1118,7 +1109,7 @@
           <w:color w:val="000000"/>
           <w:sz w:val="24"/>
         </w:rPr>
-        <w:t xml:space="preserve"> 本项目不隐藏前置准备成本：人工仍需提供授权范围、适配入口、可信需求和必要业务条件；本地模型只在这些边界内提出候选，固定程序负责证据、权限和判定。</w:t>
+        <w:t xml:space="preserve"> 人工适配是使用前提：人工仍需提供授权范围、适配入口、可信需求和必要业务条件；本地模型只在这些边界内提出候选，固定程序负责证据、权限和判定。</w:t>
       </w:r>
     </w:p>
     <w:p>
@@ -1272,7 +1263,7 @@
         <w:ind w:firstLine="0"/>
         <w:jc w:val="center"/>
       </w:pPr>
-      <w:bookmarkStart w:id="2" w:name="_Toc1375"/>
+      <w:bookmarkStart w:id="2" w:name="_Toc3943"/>
       <w:r>
         <w:rPr>
           <w:rFonts w:ascii="黑体" w:hAnsi="黑体" w:eastAsia="黑体" w:cs="黑体"/>
@@ -1740,6 +1731,71 @@
     </w:tbl>
     <w:p>
       <w:pPr>
+        <w:keepNext/>
+        <w:widowControl/>
+        <w:spacing w:before="0" w:after="60" w:line="360" w:lineRule="auto"/>
+        <w:ind w:firstLine="0"/>
+        <w:jc w:val="center"/>
+      </w:pPr>
+      <w:r>
+        <w:drawing>
+          <wp:inline distT="0" distB="0" distL="114300" distR="114300">
+            <wp:extent cx="5471795" cy="3757295"/>
+            <wp:effectExtent l="0" t="0" r="14605" b="14605"/>
+            <wp:docPr id="1" name="Picture 1"/>
+            <wp:cNvGraphicFramePr>
+              <a:graphicFrameLocks xmlns:a="http://schemas.openxmlformats.org/drawingml/2006/main" noChangeAspect="1"/>
+            </wp:cNvGraphicFramePr>
+            <a:graphic xmlns:a="http://schemas.openxmlformats.org/drawingml/2006/main">
+              <a:graphicData uri="http://schemas.openxmlformats.org/drawingml/2006/picture">
+                <pic:pic xmlns:pic="http://schemas.openxmlformats.org/drawingml/2006/picture">
+                  <pic:nvPicPr>
+                    <pic:cNvPr id="1" name="Picture 1"/>
+                    <pic:cNvPicPr>
+                      <a:picLocks noChangeAspect="1"/>
+                    </pic:cNvPicPr>
+                  </pic:nvPicPr>
+                  <pic:blipFill>
+                    <a:blip r:embed="rId12"/>
+                    <a:stretch>
+                      <a:fillRect/>
+                    </a:stretch>
+                  </pic:blipFill>
+                  <pic:spPr>
+                    <a:xfrm>
+                      <a:off x="0" y="0"/>
+                      <a:ext cx="5472000" cy="3757440"/>
+                    </a:xfrm>
+                    <a:prstGeom prst="rect">
+                      <a:avLst/>
+                    </a:prstGeom>
+                  </pic:spPr>
+                </pic:pic>
+              </a:graphicData>
+            </a:graphic>
+          </wp:inline>
+        </w:drawing>
+      </w:r>
+    </w:p>
+    <w:p>
+      <w:pPr>
+        <w:widowControl/>
+        <w:spacing w:before="0" w:after="60" w:line="360" w:lineRule="auto"/>
+        <w:ind w:firstLine="0"/>
+        <w:jc w:val="center"/>
+      </w:pPr>
+      <w:r>
+        <w:rPr>
+          <w:rFonts w:ascii="宋体" w:hAnsi="宋体" w:eastAsia="宋体" w:cs="宋体"/>
+          <w:b w:val="0"/>
+          <w:color w:val="000000"/>
+          <w:sz w:val="24"/>
+        </w:rPr>
+        <w:t>图 1 运行证据约束下的候选修复与验收流程</w:t>
+      </w:r>
+    </w:p>
+    <w:p>
+      <w:pPr>
         <w:pStyle w:val="11"/>
         <w:keepNext/>
         <w:spacing w:before="120" w:after="60" w:line="360" w:lineRule="auto"/>
@@ -1856,6 +1912,71 @@
     </w:p>
     <w:p>
       <w:pPr>
+        <w:keepNext/>
+        <w:widowControl/>
+        <w:spacing w:before="0" w:after="60" w:line="360" w:lineRule="auto"/>
+        <w:ind w:firstLine="0"/>
+        <w:jc w:val="center"/>
+      </w:pPr>
+      <w:r>
+        <w:drawing>
+          <wp:inline distT="0" distB="0" distL="114300" distR="114300">
+            <wp:extent cx="5471795" cy="3079750"/>
+            <wp:effectExtent l="0" t="0" r="14605" b="6350"/>
+            <wp:docPr id="2" name="Picture 2"/>
+            <wp:cNvGraphicFramePr>
+              <a:graphicFrameLocks xmlns:a="http://schemas.openxmlformats.org/drawingml/2006/main" noChangeAspect="1"/>
+            </wp:cNvGraphicFramePr>
+            <a:graphic xmlns:a="http://schemas.openxmlformats.org/drawingml/2006/main">
+              <a:graphicData uri="http://schemas.openxmlformats.org/drawingml/2006/picture">
+                <pic:pic xmlns:pic="http://schemas.openxmlformats.org/drawingml/2006/picture">
+                  <pic:nvPicPr>
+                    <pic:cNvPr id="2" name="Picture 2"/>
+                    <pic:cNvPicPr>
+                      <a:picLocks noChangeAspect="1"/>
+                    </pic:cNvPicPr>
+                  </pic:nvPicPr>
+                  <pic:blipFill>
+                    <a:blip r:embed="rId13"/>
+                    <a:stretch>
+                      <a:fillRect/>
+                    </a:stretch>
+                  </pic:blipFill>
+                  <pic:spPr>
+                    <a:xfrm>
+                      <a:off x="0" y="0"/>
+                      <a:ext cx="5472000" cy="3079893"/>
+                    </a:xfrm>
+                    <a:prstGeom prst="rect">
+                      <a:avLst/>
+                    </a:prstGeom>
+                  </pic:spPr>
+                </pic:pic>
+              </a:graphicData>
+            </a:graphic>
+          </wp:inline>
+        </w:drawing>
+      </w:r>
+    </w:p>
+    <w:p>
+      <w:pPr>
+        <w:widowControl/>
+        <w:spacing w:before="0" w:after="60" w:line="360" w:lineRule="auto"/>
+        <w:ind w:firstLine="0"/>
+        <w:jc w:val="center"/>
+      </w:pPr>
+      <w:r>
+        <w:rPr>
+          <w:rFonts w:ascii="宋体" w:hAnsi="宋体" w:eastAsia="宋体" w:cs="宋体"/>
+          <w:b w:val="0"/>
+          <w:color w:val="000000"/>
+          <w:sz w:val="24"/>
+        </w:rPr>
+        <w:t>图 2 真实工作台中的证据与独立任务状态</w:t>
+      </w:r>
+    </w:p>
+    <w:p>
+      <w:pPr>
         <w:pStyle w:val="11"/>
         <w:keepNext/>
         <w:spacing w:before="120" w:after="60" w:line="360" w:lineRule="auto"/>
@@ -1928,7 +2049,7 @@
         <w:ind w:firstLine="0"/>
         <w:jc w:val="center"/>
       </w:pPr>
-      <w:bookmarkStart w:id="3" w:name="_Toc2249"/>
+      <w:bookmarkStart w:id="3" w:name="_Toc3312"/>
       <w:r>
         <w:rPr>
           <w:rFonts w:ascii="黑体" w:hAnsi="黑体" w:eastAsia="黑体" w:cs="黑体"/>
@@ -2038,22 +2159,6 @@
         <w:gridCol w:w="1417"/>
       </w:tblGrid>
       <w:tr>
-        <w:tblPrEx>
-          <w:tblBorders>
-            <w:top w:val="single" w:color="D9D9D9" w:sz="4" w:space="0"/>
-            <w:left w:val="single" w:color="D9D9D9" w:sz="4" w:space="0"/>
-            <w:bottom w:val="single" w:color="D9D9D9" w:sz="4" w:space="0"/>
-            <w:right w:val="single" w:color="D9D9D9" w:sz="4" w:space="0"/>
-            <w:insideH w:val="single" w:color="D9D9D9" w:sz="4" w:space="0"/>
-            <w:insideV w:val="single" w:color="D9D9D9" w:sz="4" w:space="0"/>
-          </w:tblBorders>
-          <w:tblCellMar>
-            <w:top w:w="0" w:type="dxa"/>
-            <w:left w:w="108" w:type="dxa"/>
-            <w:bottom w:w="0" w:type="dxa"/>
-            <w:right w:w="108" w:type="dxa"/>
-          </w:tblCellMar>
-        </w:tblPrEx>
         <w:trPr>
           <w:cantSplit/>
           <w:tblHeader/>
@@ -2766,7 +2871,7 @@
           <w:color w:val="000000"/>
           <w:sz w:val="24"/>
         </w:rPr>
-        <w:t>凭据经 helper 参数进入 logging。本项目固定启发式 A 未覆盖该参数日志传播，B 的候选仅有空白差异；两者仍有泄露。C 调整日志内容并保留认证实参，最终通过安全与业务检查。这一案例展示模型在既有固定启发式之外给出有效候选的作用。</w:t>
+        <w:t>凭据经 helper 参数进入 logging。本项目固定启发式 A 的污点集合没有把调用实参 credential 传递到 helper 形参 supplied，其日志根对象识别也未覆盖链式 getLogger(...).info；A 最终未修好。B 的候选仅有空白差异，也仍泄露。C 为日志另建 redacted 值，authenticate(supplied, resource) 保持原实参，最终通过安全与业务检查。这一案例展示模型在既有固定启发式之外给出有效候选的作用。</w:t>
       </w:r>
     </w:p>
     <w:p>
@@ -2821,6 +2926,71 @@
     </w:p>
     <w:p>
       <w:pPr>
+        <w:keepNext/>
+        <w:widowControl/>
+        <w:spacing w:before="0" w:after="60" w:line="360" w:lineRule="auto"/>
+        <w:ind w:firstLine="0"/>
+        <w:jc w:val="center"/>
+      </w:pPr>
+      <w:r>
+        <w:drawing>
+          <wp:inline distT="0" distB="0" distL="114300" distR="114300">
+            <wp:extent cx="5471795" cy="3079750"/>
+            <wp:effectExtent l="0" t="0" r="14605" b="6350"/>
+            <wp:docPr id="3" name="Picture 3"/>
+            <wp:cNvGraphicFramePr>
+              <a:graphicFrameLocks xmlns:a="http://schemas.openxmlformats.org/drawingml/2006/main" noChangeAspect="1"/>
+            </wp:cNvGraphicFramePr>
+            <a:graphic xmlns:a="http://schemas.openxmlformats.org/drawingml/2006/main">
+              <a:graphicData uri="http://schemas.openxmlformats.org/drawingml/2006/picture">
+                <pic:pic xmlns:pic="http://schemas.openxmlformats.org/drawingml/2006/picture">
+                  <pic:nvPicPr>
+                    <pic:cNvPr id="3" name="Picture 3"/>
+                    <pic:cNvPicPr>
+                      <a:picLocks noChangeAspect="1"/>
+                    </pic:cNvPicPr>
+                  </pic:nvPicPr>
+                  <pic:blipFill>
+                    <a:blip r:embed="rId14"/>
+                    <a:stretch>
+                      <a:fillRect/>
+                    </a:stretch>
+                  </pic:blipFill>
+                  <pic:spPr>
+                    <a:xfrm>
+                      <a:off x="0" y="0"/>
+                      <a:ext cx="5472000" cy="3079893"/>
+                    </a:xfrm>
+                    <a:prstGeom prst="rect">
+                      <a:avLst/>
+                    </a:prstGeom>
+                  </pic:spPr>
+                </pic:pic>
+              </a:graphicData>
+            </a:graphic>
+          </wp:inline>
+        </w:drawing>
+      </w:r>
+    </w:p>
+    <w:p>
+      <w:pPr>
+        <w:widowControl/>
+        <w:spacing w:before="0" w:after="60" w:line="360" w:lineRule="auto"/>
+        <w:ind w:firstLine="0"/>
+        <w:jc w:val="center"/>
+      </w:pPr>
+      <w:r>
+        <w:rPr>
+          <w:rFonts w:ascii="宋体" w:hAnsi="宋体" w:eastAsia="宋体" w:cs="宋体"/>
+          <w:b w:val="0"/>
+          <w:color w:val="000000"/>
+          <w:sz w:val="24"/>
+        </w:rPr>
+        <w:t>图 3 h03 两次候选与真实验证反馈 历史记录回放</w:t>
+      </w:r>
+    </w:p>
+    <w:p>
+      <w:pPr>
         <w:pStyle w:val="11"/>
         <w:keepNext/>
         <w:spacing w:before="120" w:after="60" w:line="360" w:lineRule="auto"/>
@@ -2982,7 +3152,7 @@
           <w:color w:val="000000"/>
           <w:sz w:val="24"/>
         </w:rPr>
-        <w:t>一次本地模型任务共 5 次调用、3 份候选。第一份追加两个 handler，第二份使用超出固定轮廓的元组异常类型，二者在执行前因修改权限边界被拒；第三份只追加 configparser.Error 到安全 InvalidConfiguration 的转换，进入隔离后七项条件全部通过。格式不合法、越界候选和已执行后仍有泄露是三个不同状态，不能都写成“修复失败”。</w:t>
+        <w:t>一次本地模型任务共 5 次调用、3 份候选。第一份追加两个 handler，第二份使用超出固定轮廓的元组异常类型，二者在执行前因修改权限边界被拒；第三份只追加 configparser.Error 到安全 InvalidConfiguration 的转换，进入隔离后七项条件全部通过。三份候选均为合法 Python；前两份未进入动态验收，不能据此断言它们仍泄露。边界拒绝与 h03 已执行后的泄露 FAIL 分开统计。</w:t>
       </w:r>
     </w:p>
     <w:p>
@@ -2999,226 +3169,6 @@
           <w:sz w:val="24"/>
         </w:rPr>
         <w:t>新目录复检重新读取材料并确认当前对象通过。这个结果支持“保留上游业务组件的窄适配可行”，不支持任意项目接入、通用自主修复或优于固定规则的结论；一个外部组件的七项条件不增加八例统计分母。</w:t>
-      </w:r>
-    </w:p>
-    <w:p>
-      <w:pPr>
-        <w:pStyle w:val="11"/>
-        <w:keepNext/>
-        <w:spacing w:before="120" w:after="60" w:line="360" w:lineRule="auto"/>
-        <w:ind w:firstLine="0"/>
-        <w:jc w:val="left"/>
-      </w:pPr>
-      <w:r>
-        <w:rPr>
-          <w:rFonts w:ascii="黑体" w:hAnsi="黑体" w:eastAsia="黑体" w:cs="黑体"/>
-          <w:b/>
-          <w:color w:val="000000"/>
-          <w:sz w:val="28"/>
-        </w:rPr>
-        <w:t>3.8 分层交付与演示</w:t>
-      </w:r>
-    </w:p>
-    <w:p>
-      <w:pPr>
-        <w:widowControl/>
-        <w:spacing w:before="0" w:after="60" w:line="360" w:lineRule="auto"/>
-        <w:ind w:firstLine="480"/>
-      </w:pPr>
-      <w:r>
-        <w:rPr>
-          <w:rFonts w:ascii="宋体" w:hAnsi="宋体" w:eastAsia="宋体" w:cs="宋体"/>
-          <w:b w:val="0"/>
-          <w:color w:val="000000"/>
-          <w:sz w:val="24"/>
-        </w:rPr>
-        <w:t>查看作品入口仅需普通 Python，读取真实回放，不检查或启动模型；重新验收入口需要既有隔离设施但不调用模型；现场修复入口才需要完整本地推理环境。缺少隔离不降级到宿主执行。三种入口共享当前作品界面，现场失败不会由历史成功结果替换。</w:t>
-      </w:r>
-    </w:p>
-    <w:p>
-      <w:pPr>
-        <w:widowControl/>
-        <w:spacing w:before="0" w:after="60" w:line="360" w:lineRule="auto"/>
-        <w:ind w:firstLine="480"/>
-      </w:pPr>
-      <w:r>
-        <w:rPr>
-          <w:rFonts w:ascii="宋体" w:hAnsi="宋体" w:eastAsia="宋体" w:cs="宋体"/>
-          <w:b w:val="0"/>
-          <w:color w:val="000000"/>
-          <w:sz w:val="24"/>
-        </w:rPr>
-        <w:t>本版在同机新源码目录、新 Python 环境中验证启动、历史查看、实际复检与导出，并生成约三分钟及一分钟字幕实录剪辑。前三例明确标为历史回放，复检段包含新的程序执行及对象摘要。同机验证复用了已准备的 WSL 隔离 runtime，不作为跨机器部署验证。</w:t>
-      </w:r>
-    </w:p>
-    <w:p>
-      <w:pPr>
-        <w:pStyle w:val="2"/>
-        <w:keepNext/>
-        <w:spacing w:before="160" w:after="100" w:line="360" w:lineRule="auto"/>
-        <w:ind w:firstLine="0"/>
-        <w:jc w:val="center"/>
-      </w:pPr>
-      <w:bookmarkStart w:id="4" w:name="_Toc26221"/>
-      <w:r>
-        <w:rPr>
-          <w:rFonts w:ascii="黑体" w:hAnsi="黑体" w:eastAsia="黑体" w:cs="黑体"/>
-          <w:b/>
-          <w:color w:val="000000"/>
-          <w:sz w:val="32"/>
-        </w:rPr>
-        <w:t>第四章 创新性说明</w:t>
-      </w:r>
-      <w:bookmarkEnd w:id="4"/>
-    </w:p>
-    <w:p>
-      <w:pPr>
-        <w:pStyle w:val="11"/>
-        <w:keepNext/>
-        <w:spacing w:before="120" w:after="60" w:line="360" w:lineRule="auto"/>
-        <w:ind w:firstLine="0"/>
-        <w:jc w:val="left"/>
-      </w:pPr>
-      <w:r>
-        <w:rPr>
-          <w:rFonts w:ascii="黑体" w:hAnsi="黑体" w:eastAsia="黑体" w:cs="黑体"/>
-          <w:b/>
-          <w:color w:val="000000"/>
-          <w:sz w:val="28"/>
-        </w:rPr>
-        <w:t>4.1 证据驱动的候选生成与反馈调整</w:t>
-      </w:r>
-    </w:p>
-    <w:p>
-      <w:pPr>
-        <w:widowControl/>
-        <w:spacing w:before="0" w:after="60" w:line="360" w:lineRule="auto"/>
-        <w:ind w:firstLine="480"/>
-      </w:pPr>
-      <w:r>
-        <w:rPr>
-          <w:rFonts w:ascii="宋体" w:hAnsi="宋体" w:eastAsia="宋体" w:cs="宋体"/>
-          <w:b w:val="0"/>
-          <w:color w:val="000000"/>
-          <w:sz w:val="24"/>
-        </w:rPr>
-        <w:t>具体困难是：一次性补丁可能只改表面文本，无法说明真实值是否消失。密证的设计是让固定程序先执行已登记触发，把脱敏观察和失败回执交给模型；模型可以在预算内调整候选，程序再次检查。h03 的候选1仍输出真实值，回执进入后续请求后候选2改为固定安全错误信息并通过；h01 则展示参数日志这一固定启发式遗漏的有限增量。</w:t>
-      </w:r>
-    </w:p>
-    <w:p>
-      <w:pPr>
-        <w:widowControl/>
-        <w:spacing w:before="0" w:after="60" w:line="360" w:lineRule="auto"/>
-        <w:ind w:firstLine="480"/>
-      </w:pPr>
-      <w:r>
-        <w:rPr>
-          <w:rFonts w:ascii="宋体" w:hAnsi="宋体" w:eastAsia="宋体" w:cs="宋体"/>
-          <w:b w:val="0"/>
-          <w:color w:val="000000"/>
-          <w:sz w:val="24"/>
-        </w:rPr>
-        <w:t>本项目实现的是受控工具协议、反馈记录和候选状态，不是新的模型训练或通用修复算法。相比一次性模型修复，它多了一次基于当前执行结果的候选调整路径；相比完全固定脚本，它允许在已登记结构内利用代码语义提出不同候选。两种基线都可能在部分案例中成功，本轮没有证明普遍优势。</w:t>
-      </w:r>
-    </w:p>
-    <w:p>
-      <w:pPr>
-        <w:pStyle w:val="11"/>
-        <w:keepNext/>
-        <w:spacing w:before="120" w:after="60" w:line="360" w:lineRule="auto"/>
-        <w:ind w:firstLine="0"/>
-        <w:jc w:val="left"/>
-      </w:pPr>
-      <w:r>
-        <w:rPr>
-          <w:rFonts w:ascii="黑体" w:hAnsi="黑体" w:eastAsia="黑体" w:cs="黑体"/>
-          <w:b/>
-          <w:color w:val="000000"/>
-          <w:sz w:val="28"/>
-        </w:rPr>
-        <w:t>4.2 程序控制的修改权限与安全/业务验收</w:t>
-      </w:r>
-    </w:p>
-    <w:p>
-      <w:pPr>
-        <w:widowControl/>
-        <w:spacing w:before="0" w:after="60" w:line="360" w:lineRule="auto"/>
-        <w:ind w:firstLine="480"/>
-      </w:pPr>
-      <w:r>
-        <w:rPr>
-          <w:rFonts w:ascii="宋体" w:hAnsi="宋体" w:eastAsia="宋体" w:cs="宋体"/>
-          <w:b w:val="0"/>
-          <w:color w:val="000000"/>
-          <w:sz w:val="24"/>
-        </w:rPr>
-        <w:t>具体困难是：模型建议不能自行获得写入和“通过”权限，安全修复也不能通过删除业务行为换取绿色结果。密证让执行侧固定当前副本、可信需求、允许修改范围、禁止输出通道和必要业务检查。只有有效泄露证据授权修改，候选通过协议和边界检查后，才进入隔离执行；裁判同时检查泄露是否消除、认证调用、成功响应、拒绝、异常和修改边界。</w:t>
-      </w:r>
-    </w:p>
-    <w:p>
-      <w:pPr>
-        <w:widowControl/>
-        <w:spacing w:before="0" w:after="60" w:line="360" w:lineRule="auto"/>
-        <w:ind w:firstLine="480"/>
-      </w:pPr>
-      <w:r>
-        <w:rPr>
-          <w:rFonts w:ascii="宋体" w:hAnsi="宋体" w:eastAsia="宋体" w:cs="宋体"/>
-          <w:b w:val="0"/>
-          <w:color w:val="000000"/>
-          <w:sz w:val="24"/>
-        </w:rPr>
-        <w:t>h07 中模型有疑点但没有实际泄露证据，原对象保持不变；Twine 前两候选在执行前因越界被拒，第三候选才进入七项检查。这些证据说明程序实施了权限与联合验收，不说明模型没有误报，也不把普通状态控制或隔离技术称为首创。</w:t>
-      </w:r>
-    </w:p>
-    <w:p>
-      <w:pPr>
-        <w:pStyle w:val="11"/>
-        <w:keepNext/>
-        <w:spacing w:before="120" w:after="60" w:line="360" w:lineRule="auto"/>
-        <w:ind w:firstLine="0"/>
-        <w:jc w:val="left"/>
-      </w:pPr>
-      <w:r>
-        <w:rPr>
-          <w:rFonts w:ascii="黑体" w:hAnsi="黑体" w:eastAsia="黑体" w:cs="黑体"/>
-          <w:b/>
-          <w:color w:val="000000"/>
-          <w:sz w:val="28"/>
-        </w:rPr>
-        <w:t>4.3 对应修复对象的材料导出与复检</w:t>
-      </w:r>
-    </w:p>
-    <w:p>
-      <w:pPr>
-        <w:widowControl/>
-        <w:spacing w:before="0" w:after="60" w:line="360" w:lineRule="auto"/>
-        <w:ind w:firstLine="480"/>
-      </w:pPr>
-      <w:r>
-        <w:rPr>
-          <w:rFonts w:ascii="宋体" w:hAnsi="宋体" w:eastAsia="宋体" w:cs="宋体"/>
-          <w:b w:val="0"/>
-          <w:color w:val="000000"/>
-          <w:sz w:val="24"/>
-        </w:rPr>
-        <w:t>具体困难是：保存一个 PASS 字段不能保证它仍对应当前代码、规则和检查条件。密证导出原件、当前候选、需求、规则、轨迹和绑定信息；复检重新读取这些材料并执行必要检查，分别报告旧报告适用性、历史材料完整性和当前结果。对象变化时不复用旧缓存结论，材料缺失会显式显示而不伪装成“证据齐全”。</w:t>
-      </w:r>
-    </w:p>
-    <w:p>
-      <w:pPr>
-        <w:widowControl/>
-        <w:spacing w:before="0" w:after="60" w:line="360" w:lineRule="auto"/>
-        <w:ind w:firstLine="480"/>
-      </w:pPr>
-      <w:r>
-        <w:rPr>
-          <w:rFonts w:ascii="宋体" w:hAnsi="宋体" w:eastAsia="宋体" w:cs="宋体"/>
-          <w:b w:val="0"/>
-          <w:color w:val="000000"/>
-          <w:sz w:val="24"/>
-        </w:rPr>
-        <w:t>相关实现位于 agent_pilot/web.py 的材料绑定和 agent_pilot/bundle.py 的复检逻辑。对象变化定向回归、h01/h03/h07 材料和 Twine 新目录复检共同支持这一交付主张。普通哈希只能检测相对清单的变化，不是第三方认证或不可伪造证明。</w:t>
       </w:r>
     </w:p>
     <w:tbl>
@@ -3289,7 +3239,7 @@
                 <w:color w:val="000000"/>
                 <w:sz w:val="24"/>
               </w:rPr>
-              <w:t>特点</w:t>
+              <w:t>条件组</w:t>
             </w:r>
           </w:p>
         </w:tc>
@@ -3313,7 +3263,7 @@
                 <w:color w:val="000000"/>
                 <w:sz w:val="24"/>
               </w:rPr>
-              <w:t>关键代码</w:t>
+              <w:t>实际检查</w:t>
             </w:r>
           </w:p>
         </w:tc>
@@ -3337,7 +3287,7 @@
                 <w:color w:val="000000"/>
                 <w:sz w:val="24"/>
               </w:rPr>
-              <w:t>主要依据</w:t>
+              <w:t>原件 / 最终候选</w:t>
             </w:r>
           </w:p>
         </w:tc>
@@ -3383,7 +3333,7 @@
                 <w:color w:val="000000"/>
                 <w:sz w:val="24"/>
               </w:rPr>
-              <w:t>证据反馈</w:t>
+              <w:t>bare-token、no-section-password、section-bare-token</w:t>
             </w:r>
           </w:p>
         </w:tc>
@@ -3407,7 +3357,7 @@
                 <w:color w:val="000000"/>
                 <w:sz w:val="24"/>
               </w:rPr>
-              <w:t>reliability.GovernedSession、model_client.LocalAgentClient</w:t>
+              <w:t>三种格式错误不得在 stdout、stderr、logging 暴露值；仍返回配置领域错误</w:t>
             </w:r>
           </w:p>
         </w:tc>
@@ -3431,7 +3381,7 @@
                 <w:color w:val="000000"/>
                 <w:sz w:val="24"/>
               </w:rPr>
-              <w:t>h01 有限候选增量；h03 真实反馈调整</w:t>
+              <w:t>3 项 FAIL / 3 项 PASS</w:t>
             </w:r>
           </w:p>
         </w:tc>
@@ -3477,7 +3427,7 @@
                 <w:color w:val="000000"/>
                 <w:sz w:val="24"/>
               </w:rPr>
-              <w:t>程序控制验收</w:t>
+              <w:t>valid-pypi、valid-custom</w:t>
             </w:r>
           </w:p>
         </w:tc>
@@ -3501,7 +3451,7 @@
                 <w:color w:val="000000"/>
                 <w:sz w:val="24"/>
               </w:rPr>
-              <w:t>judge.judge_trial、isolation.run_isolated、external_twine.boundary</w:t>
+              <w:t>仓库 URL、用户和内部凭据原值保持，禁止输出通道无泄露</w:t>
             </w:r>
           </w:p>
         </w:tc>
@@ -3525,7 +3475,7 @@
                 <w:color w:val="000000"/>
                 <w:sz w:val="24"/>
               </w:rPr>
-              <w:t>h07 正常保留；Twine 越界候选被拒</w:t>
+              <w:t>2 项 PASS / 2 项 PASS</w:t>
             </w:r>
           </w:p>
         </w:tc>
@@ -3571,7 +3521,7 @@
                 <w:color w:val="000000"/>
                 <w:sz w:val="24"/>
               </w:rPr>
-              <w:t>对象材料复检</w:t>
+              <w:t>missing-repository、missing-file</w:t>
             </w:r>
           </w:p>
         </w:tc>
@@ -3595,7 +3545,7 @@
                 <w:color w:val="000000"/>
                 <w:sz w:val="24"/>
               </w:rPr>
-              <w:t>web._require_current_material、bundle.recheck_bundle</w:t>
+              <w:t>缺仓库与缺文件保留原有领域错误行为，禁止通道无泄露</w:t>
             </w:r>
           </w:p>
         </w:tc>
@@ -3619,12 +3569,127 @@
                 <w:color w:val="000000"/>
                 <w:sz w:val="24"/>
               </w:rPr>
-              <w:t>对象变化回归；当前对象的新复检</w:t>
+              <w:t>2 项 PASS / 2 项 PASS</w:t>
             </w:r>
           </w:p>
         </w:tc>
       </w:tr>
     </w:tbl>
+    <w:p>
+      <w:pPr>
+        <w:keepNext/>
+        <w:widowControl/>
+        <w:spacing w:before="0" w:after="60" w:line="360" w:lineRule="auto"/>
+        <w:ind w:firstLine="0"/>
+        <w:jc w:val="center"/>
+      </w:pPr>
+      <w:r>
+        <w:drawing>
+          <wp:inline distT="0" distB="0" distL="114300" distR="114300">
+            <wp:extent cx="5471795" cy="3079750"/>
+            <wp:effectExtent l="0" t="0" r="14605" b="6350"/>
+            <wp:docPr id="4" name="Picture 4"/>
+            <wp:cNvGraphicFramePr>
+              <a:graphicFrameLocks xmlns:a="http://schemas.openxmlformats.org/drawingml/2006/main" noChangeAspect="1"/>
+            </wp:cNvGraphicFramePr>
+            <a:graphic xmlns:a="http://schemas.openxmlformats.org/drawingml/2006/main">
+              <a:graphicData uri="http://schemas.openxmlformats.org/drawingml/2006/picture">
+                <pic:pic xmlns:pic="http://schemas.openxmlformats.org/drawingml/2006/picture">
+                  <pic:nvPicPr>
+                    <pic:cNvPr id="4" name="Picture 4"/>
+                    <pic:cNvPicPr>
+                      <a:picLocks noChangeAspect="1"/>
+                    </pic:cNvPicPr>
+                  </pic:nvPicPr>
+                  <pic:blipFill>
+                    <a:blip r:embed="rId15"/>
+                    <a:stretch>
+                      <a:fillRect/>
+                    </a:stretch>
+                  </pic:blipFill>
+                  <pic:spPr>
+                    <a:xfrm>
+                      <a:off x="0" y="0"/>
+                      <a:ext cx="5472000" cy="3079893"/>
+                    </a:xfrm>
+                    <a:prstGeom prst="rect">
+                      <a:avLst/>
+                    </a:prstGeom>
+                  </pic:spPr>
+                </pic:pic>
+              </a:graphicData>
+            </a:graphic>
+          </wp:inline>
+        </w:drawing>
+      </w:r>
+    </w:p>
+    <w:p>
+      <w:pPr>
+        <w:widowControl/>
+        <w:spacing w:before="0" w:after="60" w:line="360" w:lineRule="auto"/>
+        <w:ind w:firstLine="0"/>
+        <w:jc w:val="center"/>
+      </w:pPr>
+      <w:r>
+        <w:rPr>
+          <w:rFonts w:ascii="宋体" w:hAnsi="宋体" w:eastAsia="宋体" w:cs="宋体"/>
+          <w:b w:val="0"/>
+          <w:color w:val="000000"/>
+          <w:sz w:val="24"/>
+        </w:rPr>
+        <w:t>图 4 当前对象的实际复检记录 不调用模型</w:t>
+      </w:r>
+    </w:p>
+    <w:p>
+      <w:pPr>
+        <w:pStyle w:val="11"/>
+        <w:keepNext/>
+        <w:spacing w:before="120" w:after="60" w:line="360" w:lineRule="auto"/>
+        <w:ind w:firstLine="0"/>
+        <w:jc w:val="left"/>
+      </w:pPr>
+      <w:r>
+        <w:rPr>
+          <w:rFonts w:ascii="黑体" w:hAnsi="黑体" w:eastAsia="黑体" w:cs="黑体"/>
+          <w:b/>
+          <w:color w:val="000000"/>
+          <w:sz w:val="28"/>
+        </w:rPr>
+        <w:t>3.8 分层交付与演示</w:t>
+      </w:r>
+    </w:p>
+    <w:p>
+      <w:pPr>
+        <w:widowControl/>
+        <w:spacing w:before="0" w:after="60" w:line="360" w:lineRule="auto"/>
+        <w:ind w:firstLine="480"/>
+      </w:pPr>
+      <w:r>
+        <w:rPr>
+          <w:rFonts w:ascii="宋体" w:hAnsi="宋体" w:eastAsia="宋体" w:cs="宋体"/>
+          <w:b w:val="0"/>
+          <w:color w:val="000000"/>
+          <w:sz w:val="24"/>
+        </w:rPr>
+        <w:t>查看作品入口仅需普通 Python，读取真实回放，不检查或启动模型；重新验收入口需要既有隔离设施但不调用模型；现场修复入口才需要完整本地推理环境。缺少隔离不降级到宿主执行。三种入口共享当前作品界面，现场失败不会由历史成功结果替换。</w:t>
+      </w:r>
+    </w:p>
+    <w:p>
+      <w:pPr>
+        <w:widowControl/>
+        <w:spacing w:before="0" w:after="60" w:line="360" w:lineRule="auto"/>
+        <w:ind w:firstLine="480"/>
+      </w:pPr>
+      <w:r>
+        <w:rPr>
+          <w:rFonts w:ascii="宋体" w:hAnsi="宋体" w:eastAsia="宋体" w:cs="宋体"/>
+          <w:b w:val="0"/>
+          <w:color w:val="000000"/>
+          <w:sz w:val="24"/>
+        </w:rPr>
+        <w:t>preliminary.4 在同机新源码目录、新 Python 环境中验证启动、历史查看、实际复检与导出，并生成约三分钟及一分钟字幕实录剪辑。前三例明确标为历史回放，复检段包含新的程序执行及对象摘要。同机验证复用了已准备的 WSL 隔离 runtime，不作为跨机器部署验证。本版 preliminary.5 仅重构价值表达和证据索引，沿用该实录并标注版本，没有新模型实验或新真人结果。</w:t>
+      </w:r>
+    </w:p>
     <w:p>
       <w:pPr>
         <w:pStyle w:val="2"/>
@@ -3633,7 +3698,7 @@
         <w:ind w:firstLine="0"/>
         <w:jc w:val="center"/>
       </w:pPr>
-      <w:bookmarkStart w:id="5" w:name="_Toc3656"/>
+      <w:bookmarkStart w:id="4" w:name="_Toc32170"/>
       <w:r>
         <w:rPr>
           <w:rFonts w:ascii="黑体" w:hAnsi="黑体" w:eastAsia="黑体" w:cs="黑体"/>
@@ -3641,57 +3706,9 @@
           <w:color w:val="000000"/>
           <w:sz w:val="32"/>
         </w:rPr>
-        <w:t>第五章 总结</w:t>
-      </w:r>
-      <w:bookmarkEnd w:id="5"/>
-    </w:p>
-    <w:p>
-      <w:pPr>
-        <w:widowControl/>
-        <w:spacing w:before="0" w:after="60" w:line="360" w:lineRule="auto"/>
-        <w:ind w:firstLine="480"/>
-      </w:pPr>
-      <w:r>
-        <w:rPr>
-          <w:rFonts w:ascii="宋体" w:hAnsi="宋体" w:eastAsia="宋体" w:cs="宋体"/>
-          <w:b w:val="0"/>
-          <w:color w:val="000000"/>
-          <w:sz w:val="24"/>
-        </w:rPr>
-        <w:t>密证已经形成“观察证据—候选生成—受控修改—安全与业务验收—材料复检”的可运行原型。它不是把所有安全工作交给模型，而是让模型在明确边界内处理代码理解和候选生成，让固定程序保留证据、权限和判定。完整同轮测试展示了四个问题例的合格修复、正常代码保留及一次真实失败反馈调整；任务完成指标同时揭示了工具协议仍需改进。Twine 外部接入说明了一条窄组件适配路径，未被写成泛化成绩。</w:t>
-      </w:r>
-    </w:p>
-    <w:p>
-      <w:pPr>
-        <w:widowControl/>
-        <w:spacing w:before="0" w:after="60" w:line="360" w:lineRule="auto"/>
-        <w:ind w:firstLine="480"/>
-      </w:pPr>
-      <w:r>
-        <w:rPr>
-          <w:rFonts w:ascii="宋体" w:hAnsi="宋体" w:eastAsia="宋体" w:cs="宋体"/>
-          <w:b w:val="0"/>
-          <w:color w:val="000000"/>
-          <w:sz w:val="24"/>
-        </w:rPr>
-        <w:t>作品对使用者的直接交付是：一份有实际执行依据的候选补丁、对应的安全与业务检查、以及可以由下一位开发者重新验收的材料。人工时间节省、企业部署收益、跨机器适配和任意代码库泛化尚未测量。本轮另准备了供 2—3 位未参与开发者执行的探索性体验包，但尚无真人结果，不把待执行材料写成用户研究结论。</w:t>
-      </w:r>
-    </w:p>
-    <w:p>
-      <w:pPr>
-        <w:widowControl/>
-        <w:spacing w:before="0" w:after="60" w:line="360" w:lineRule="auto"/>
-        <w:ind w:firstLine="480"/>
-      </w:pPr>
-      <w:r>
-        <w:rPr>
-          <w:rFonts w:ascii="宋体" w:hAnsi="宋体" w:eastAsia="宋体" w:cs="宋体"/>
-          <w:b w:val="0"/>
-          <w:color w:val="000000"/>
-          <w:sz w:val="24"/>
-        </w:rPr>
-        <w:t>后续优先提升协议稳定性和授权组件覆盖，邀请不同作者构造新案例，并把新评估与已知回归分开统计。</w:t>
-      </w:r>
+        <w:t>第四章 创新性说明</w:t>
+      </w:r>
+      <w:bookmarkEnd w:id="4"/>
     </w:p>
     <w:p>
       <w:pPr>
@@ -3708,7 +3725,7 @@
           <w:color w:val="000000"/>
           <w:sz w:val="28"/>
         </w:rPr>
-        <w:t>来源与 AI 参与披露</w:t>
+        <w:t>4.1 证据驱动的候选生成与反馈调整</w:t>
       </w:r>
     </w:p>
     <w:p>
@@ -3724,9 +3741,529 @@
           <w:color w:val="000000"/>
           <w:sz w:val="24"/>
         </w:rPr>
-        <w:t>公开模型、框架、推理服务和隔离基础设施按来源引用；本项目实现受限工具、授权与完成控制、裁判及案例、实验组织、材料复检和展示组件。ChatGPT/Codex 实质参与方案、主要代码生成与修改、调试、试验组织、结果核对和文稿准备。队伍实际成员贡献与身份字段待填；AI 辅助范围、独立研究要求及参赛资格由队伍向导师/组委会确认。本报告不替代队伍签署的原创性声明。</w:t>
-      </w:r>
-    </w:p>
+        <w:t>具体困难是：一次性补丁可能只改表面文本，无法说明真实值是否消失。密证的设计是让固定程序先执行已登记触发，把脱敏观察和失败回执交给模型；模型可以在预算内调整候选，程序再次检查。h03 的候选1仍输出真实值，回执进入后续请求后候选2改为固定安全错误信息并通过；h01 则展示参数日志这一固定启发式遗漏的有限增量。</w:t>
+      </w:r>
+    </w:p>
+    <w:p>
+      <w:pPr>
+        <w:widowControl/>
+        <w:spacing w:before="0" w:after="60" w:line="360" w:lineRule="auto"/>
+        <w:ind w:firstLine="480"/>
+      </w:pPr>
+      <w:r>
+        <w:rPr>
+          <w:rFonts w:ascii="宋体" w:hAnsi="宋体" w:eastAsia="宋体" w:cs="宋体"/>
+          <w:b w:val="0"/>
+          <w:color w:val="000000"/>
+          <w:sz w:val="24"/>
+        </w:rPr>
+        <w:t>本项目实现的是受控工具协议、反馈记录和候选状态，不是新的模型训练或通用修复算法。相比一次性模型修复，它多了一次基于当前执行结果的候选调整路径；相比本项目固定启发式，它允许在已登记结构内利用代码语义提出不同候选。两种基线都可能在部分案例中成功，本轮没有证明普遍优势。</w:t>
+      </w:r>
+    </w:p>
+    <w:p>
+      <w:pPr>
+        <w:pStyle w:val="11"/>
+        <w:keepNext/>
+        <w:spacing w:before="120" w:after="60" w:line="360" w:lineRule="auto"/>
+        <w:ind w:firstLine="0"/>
+        <w:jc w:val="left"/>
+      </w:pPr>
+      <w:r>
+        <w:rPr>
+          <w:rFonts w:ascii="黑体" w:hAnsi="黑体" w:eastAsia="黑体" w:cs="黑体"/>
+          <w:b/>
+          <w:color w:val="000000"/>
+          <w:sz w:val="28"/>
+        </w:rPr>
+        <w:t>4.2 程序控制的修改权限与安全/业务验收</w:t>
+      </w:r>
+    </w:p>
+    <w:p>
+      <w:pPr>
+        <w:widowControl/>
+        <w:spacing w:before="0" w:after="60" w:line="360" w:lineRule="auto"/>
+        <w:ind w:firstLine="480"/>
+      </w:pPr>
+      <w:r>
+        <w:rPr>
+          <w:rFonts w:ascii="宋体" w:hAnsi="宋体" w:eastAsia="宋体" w:cs="宋体"/>
+          <w:b w:val="0"/>
+          <w:color w:val="000000"/>
+          <w:sz w:val="24"/>
+        </w:rPr>
+        <w:t>具体困难是：模型建议不能自行获得写入和“通过”权限，安全修复也不能通过删除业务行为换取绿色结果。密证让执行侧固定当前副本、可信需求、允许修改范围、禁止输出通道和必要业务检查。只有有效泄露证据授权修改，候选通过协议和边界检查后，才进入隔离执行；裁判同时检查泄露是否消除、认证调用、成功响应、拒绝、异常和修改边界。</w:t>
+      </w:r>
+    </w:p>
+    <w:p>
+      <w:pPr>
+        <w:widowControl/>
+        <w:spacing w:before="0" w:after="60" w:line="360" w:lineRule="auto"/>
+        <w:ind w:firstLine="480"/>
+      </w:pPr>
+      <w:r>
+        <w:rPr>
+          <w:rFonts w:ascii="宋体" w:hAnsi="宋体" w:eastAsia="宋体" w:cs="宋体"/>
+          <w:b w:val="0"/>
+          <w:color w:val="000000"/>
+          <w:sz w:val="24"/>
+        </w:rPr>
+        <w:t>h07 中模型有疑点但没有实际泄露证据，原对象保持不变；Twine 前两候选在执行前因越界被拒，第三候选才进入七项检查。这些证据说明程序实施了权限与联合验收，不说明模型没有误报，也不把普通状态控制或隔离技术称为首创。</w:t>
+      </w:r>
+    </w:p>
+    <w:p>
+      <w:pPr>
+        <w:pStyle w:val="11"/>
+        <w:keepNext/>
+        <w:spacing w:before="120" w:after="60" w:line="360" w:lineRule="auto"/>
+        <w:ind w:firstLine="0"/>
+        <w:jc w:val="left"/>
+      </w:pPr>
+      <w:r>
+        <w:rPr>
+          <w:rFonts w:ascii="黑体" w:hAnsi="黑体" w:eastAsia="黑体" w:cs="黑体"/>
+          <w:b/>
+          <w:color w:val="000000"/>
+          <w:sz w:val="28"/>
+        </w:rPr>
+        <w:t>4.3 对应修复对象的材料导出与复检</w:t>
+      </w:r>
+    </w:p>
+    <w:p>
+      <w:pPr>
+        <w:widowControl/>
+        <w:spacing w:before="0" w:after="60" w:line="360" w:lineRule="auto"/>
+        <w:ind w:firstLine="480"/>
+      </w:pPr>
+      <w:r>
+        <w:rPr>
+          <w:rFonts w:ascii="宋体" w:hAnsi="宋体" w:eastAsia="宋体" w:cs="宋体"/>
+          <w:b w:val="0"/>
+          <w:color w:val="000000"/>
+          <w:sz w:val="24"/>
+        </w:rPr>
+        <w:t>具体困难是：保存一个 PASS 字段不能保证它仍对应当前代码、规则和检查条件。密证导出原件、当前候选、需求、规则、轨迹和绑定信息；复检重新读取这些材料并执行必要检查，分别报告旧报告适用性、历史材料完整性和当前结果。对象变化时不复用旧缓存结论，材料缺失会显式显示而不伪装成“证据齐全”。</w:t>
+      </w:r>
+    </w:p>
+    <w:p>
+      <w:pPr>
+        <w:widowControl/>
+        <w:spacing w:before="0" w:after="60" w:line="360" w:lineRule="auto"/>
+        <w:ind w:firstLine="480"/>
+      </w:pPr>
+      <w:r>
+        <w:rPr>
+          <w:rFonts w:ascii="宋体" w:hAnsi="宋体" w:eastAsia="宋体" w:cs="宋体"/>
+          <w:b w:val="0"/>
+          <w:color w:val="000000"/>
+          <w:sz w:val="24"/>
+        </w:rPr>
+        <w:t>相关实现位于 agent_pilot/web.py 的材料绑定和 agent_pilot/bundle.py 的复检逻辑。对象变化定向回归、h01/h03/h07 材料和 Twine 新目录复检共同支持这一交付主张。普通哈希只能检测相对清单的变化，不是第三方认证或不可伪造证明。规范 CI 同样可以实现固定检查和版本绑定；密证把它们与候选反馈、修改门槛和可移交复检材料组织为面向开发者的操作流程。此前官方资料核查确认扫描器已有暂存区扫描或凭据有效性等能力，本文未对成熟产品或其他修复 Agent 作效果排名[7]。</w:t>
+      </w:r>
+    </w:p>
+    <w:tbl>
+      <w:tblPr>
+        <w:tblStyle w:val="6"/>
+        <w:tblW w:w="0" w:type="auto"/>
+        <w:jc w:val="center"/>
+        <w:tblBorders>
+          <w:top w:val="single" w:color="D9D9D9" w:sz="4" w:space="0"/>
+          <w:left w:val="single" w:color="D9D9D9" w:sz="4" w:space="0"/>
+          <w:bottom w:val="single" w:color="D9D9D9" w:sz="4" w:space="0"/>
+          <w:right w:val="single" w:color="D9D9D9" w:sz="4" w:space="0"/>
+          <w:insideH w:val="single" w:color="D9D9D9" w:sz="4" w:space="0"/>
+          <w:insideV w:val="single" w:color="D9D9D9" w:sz="4" w:space="0"/>
+        </w:tblBorders>
+        <w:tblLayout w:type="fixed"/>
+        <w:tblCellMar>
+          <w:top w:w="0" w:type="dxa"/>
+          <w:left w:w="108" w:type="dxa"/>
+          <w:bottom w:w="0" w:type="dxa"/>
+          <w:right w:w="108" w:type="dxa"/>
+        </w:tblCellMar>
+      </w:tblPr>
+      <w:tblGrid>
+        <w:gridCol w:w="1984"/>
+        <w:gridCol w:w="3798"/>
+        <w:gridCol w:w="2891"/>
+      </w:tblGrid>
+      <w:tr>
+        <w:tblPrEx>
+          <w:tblBorders>
+            <w:top w:val="single" w:color="D9D9D9" w:sz="4" w:space="0"/>
+            <w:left w:val="single" w:color="D9D9D9" w:sz="4" w:space="0"/>
+            <w:bottom w:val="single" w:color="D9D9D9" w:sz="4" w:space="0"/>
+            <w:right w:val="single" w:color="D9D9D9" w:sz="4" w:space="0"/>
+            <w:insideH w:val="single" w:color="D9D9D9" w:sz="4" w:space="0"/>
+            <w:insideV w:val="single" w:color="D9D9D9" w:sz="4" w:space="0"/>
+          </w:tblBorders>
+          <w:tblCellMar>
+            <w:top w:w="0" w:type="dxa"/>
+            <w:left w:w="108" w:type="dxa"/>
+            <w:bottom w:w="0" w:type="dxa"/>
+            <w:right w:w="108" w:type="dxa"/>
+          </w:tblCellMar>
+        </w:tblPrEx>
+        <w:trPr>
+          <w:cantSplit/>
+          <w:tblHeader/>
+          <w:jc w:val="center"/>
+        </w:trPr>
+        <w:tc>
+          <w:tcPr>
+            <w:tcW w:w="1984" w:type="dxa"/>
+            <w:vAlign w:val="center"/>
+          </w:tcPr>
+          <w:p>
+            <w:pPr>
+              <w:keepNext/>
+              <w:widowControl/>
+              <w:spacing w:before="60" w:after="60" w:line="360" w:lineRule="auto"/>
+              <w:ind w:firstLine="0"/>
+              <w:jc w:val="center"/>
+            </w:pPr>
+            <w:r>
+              <w:rPr>
+                <w:rFonts w:ascii="宋体" w:hAnsi="宋体" w:eastAsia="宋体" w:cs="宋体"/>
+                <w:b/>
+                <w:color w:val="000000"/>
+                <w:sz w:val="24"/>
+              </w:rPr>
+              <w:t>特点</w:t>
+            </w:r>
+          </w:p>
+        </w:tc>
+        <w:tc>
+          <w:tcPr>
+            <w:tcW w:w="3798" w:type="dxa"/>
+            <w:vAlign w:val="center"/>
+          </w:tcPr>
+          <w:p>
+            <w:pPr>
+              <w:keepNext/>
+              <w:widowControl/>
+              <w:spacing w:before="60" w:after="60" w:line="360" w:lineRule="auto"/>
+              <w:ind w:firstLine="0"/>
+              <w:jc w:val="center"/>
+            </w:pPr>
+            <w:r>
+              <w:rPr>
+                <w:rFonts w:ascii="宋体" w:hAnsi="宋体" w:eastAsia="宋体" w:cs="宋体"/>
+                <w:b/>
+                <w:color w:val="000000"/>
+                <w:sz w:val="24"/>
+              </w:rPr>
+              <w:t>关键代码</w:t>
+            </w:r>
+          </w:p>
+        </w:tc>
+        <w:tc>
+          <w:tcPr>
+            <w:tcW w:w="2891" w:type="dxa"/>
+            <w:vAlign w:val="center"/>
+          </w:tcPr>
+          <w:p>
+            <w:pPr>
+              <w:keepNext/>
+              <w:widowControl/>
+              <w:spacing w:before="60" w:after="60" w:line="360" w:lineRule="auto"/>
+              <w:ind w:firstLine="0"/>
+              <w:jc w:val="center"/>
+            </w:pPr>
+            <w:r>
+              <w:rPr>
+                <w:rFonts w:ascii="宋体" w:hAnsi="宋体" w:eastAsia="宋体" w:cs="宋体"/>
+                <w:b/>
+                <w:color w:val="000000"/>
+                <w:sz w:val="24"/>
+              </w:rPr>
+              <w:t>主要依据</w:t>
+            </w:r>
+          </w:p>
+        </w:tc>
+      </w:tr>
+      <w:tr>
+        <w:tblPrEx>
+          <w:tblBorders>
+            <w:top w:val="single" w:color="D9D9D9" w:sz="4" w:space="0"/>
+            <w:left w:val="single" w:color="D9D9D9" w:sz="4" w:space="0"/>
+            <w:bottom w:val="single" w:color="D9D9D9" w:sz="4" w:space="0"/>
+            <w:right w:val="single" w:color="D9D9D9" w:sz="4" w:space="0"/>
+            <w:insideH w:val="single" w:color="D9D9D9" w:sz="4" w:space="0"/>
+            <w:insideV w:val="single" w:color="D9D9D9" w:sz="4" w:space="0"/>
+          </w:tblBorders>
+          <w:tblCellMar>
+            <w:top w:w="0" w:type="dxa"/>
+            <w:left w:w="108" w:type="dxa"/>
+            <w:bottom w:w="0" w:type="dxa"/>
+            <w:right w:w="108" w:type="dxa"/>
+          </w:tblCellMar>
+        </w:tblPrEx>
+        <w:trPr>
+          <w:cantSplit/>
+          <w:jc w:val="center"/>
+        </w:trPr>
+        <w:tc>
+          <w:tcPr>
+            <w:tcW w:w="1984" w:type="dxa"/>
+            <w:vAlign w:val="center"/>
+          </w:tcPr>
+          <w:p>
+            <w:pPr>
+              <w:keepNext/>
+              <w:widowControl/>
+              <w:spacing w:before="60" w:after="60" w:line="360" w:lineRule="auto"/>
+              <w:ind w:firstLine="0"/>
+              <w:jc w:val="center"/>
+            </w:pPr>
+            <w:r>
+              <w:rPr>
+                <w:rFonts w:ascii="宋体" w:hAnsi="宋体" w:eastAsia="宋体" w:cs="宋体"/>
+                <w:b w:val="0"/>
+                <w:color w:val="000000"/>
+                <w:sz w:val="24"/>
+              </w:rPr>
+              <w:t>证据反馈</w:t>
+            </w:r>
+          </w:p>
+        </w:tc>
+        <w:tc>
+          <w:tcPr>
+            <w:tcW w:w="3798" w:type="dxa"/>
+            <w:vAlign w:val="center"/>
+          </w:tcPr>
+          <w:p>
+            <w:pPr>
+              <w:keepNext/>
+              <w:widowControl/>
+              <w:spacing w:before="60" w:after="60" w:line="360" w:lineRule="auto"/>
+              <w:ind w:firstLine="0"/>
+              <w:jc w:val="center"/>
+            </w:pPr>
+            <w:r>
+              <w:rPr>
+                <w:rFonts w:ascii="宋体" w:hAnsi="宋体" w:eastAsia="宋体" w:cs="宋体"/>
+                <w:b w:val="0"/>
+                <w:color w:val="000000"/>
+                <w:sz w:val="24"/>
+              </w:rPr>
+              <w:t>reliability.GovernedSession、model_client.LocalAgentClient</w:t>
+            </w:r>
+          </w:p>
+        </w:tc>
+        <w:tc>
+          <w:tcPr>
+            <w:tcW w:w="2891" w:type="dxa"/>
+            <w:vAlign w:val="center"/>
+          </w:tcPr>
+          <w:p>
+            <w:pPr>
+              <w:keepNext/>
+              <w:widowControl/>
+              <w:spacing w:before="60" w:after="60" w:line="360" w:lineRule="auto"/>
+              <w:ind w:firstLine="0"/>
+              <w:jc w:val="center"/>
+            </w:pPr>
+            <w:r>
+              <w:rPr>
+                <w:rFonts w:ascii="宋体" w:hAnsi="宋体" w:eastAsia="宋体" w:cs="宋体"/>
+                <w:b w:val="0"/>
+                <w:color w:val="000000"/>
+                <w:sz w:val="24"/>
+              </w:rPr>
+              <w:t>h01 有限候选增量；h03 真实反馈调整</w:t>
+            </w:r>
+          </w:p>
+        </w:tc>
+      </w:tr>
+      <w:tr>
+        <w:tblPrEx>
+          <w:tblBorders>
+            <w:top w:val="single" w:color="D9D9D9" w:sz="4" w:space="0"/>
+            <w:left w:val="single" w:color="D9D9D9" w:sz="4" w:space="0"/>
+            <w:bottom w:val="single" w:color="D9D9D9" w:sz="4" w:space="0"/>
+            <w:right w:val="single" w:color="D9D9D9" w:sz="4" w:space="0"/>
+            <w:insideH w:val="single" w:color="D9D9D9" w:sz="4" w:space="0"/>
+            <w:insideV w:val="single" w:color="D9D9D9" w:sz="4" w:space="0"/>
+          </w:tblBorders>
+          <w:tblCellMar>
+            <w:top w:w="0" w:type="dxa"/>
+            <w:left w:w="108" w:type="dxa"/>
+            <w:bottom w:w="0" w:type="dxa"/>
+            <w:right w:w="108" w:type="dxa"/>
+          </w:tblCellMar>
+        </w:tblPrEx>
+        <w:trPr>
+          <w:cantSplit/>
+          <w:jc w:val="center"/>
+        </w:trPr>
+        <w:tc>
+          <w:tcPr>
+            <w:tcW w:w="1984" w:type="dxa"/>
+            <w:vAlign w:val="center"/>
+          </w:tcPr>
+          <w:p>
+            <w:pPr>
+              <w:keepNext/>
+              <w:widowControl/>
+              <w:spacing w:before="60" w:after="60" w:line="360" w:lineRule="auto"/>
+              <w:ind w:firstLine="0"/>
+              <w:jc w:val="center"/>
+            </w:pPr>
+            <w:r>
+              <w:rPr>
+                <w:rFonts w:ascii="宋体" w:hAnsi="宋体" w:eastAsia="宋体" w:cs="宋体"/>
+                <w:b w:val="0"/>
+                <w:color w:val="000000"/>
+                <w:sz w:val="24"/>
+              </w:rPr>
+              <w:t>程序控制验收</w:t>
+            </w:r>
+          </w:p>
+        </w:tc>
+        <w:tc>
+          <w:tcPr>
+            <w:tcW w:w="3798" w:type="dxa"/>
+            <w:vAlign w:val="center"/>
+          </w:tcPr>
+          <w:p>
+            <w:pPr>
+              <w:keepNext/>
+              <w:widowControl/>
+              <w:spacing w:before="60" w:after="60" w:line="360" w:lineRule="auto"/>
+              <w:ind w:firstLine="0"/>
+              <w:jc w:val="center"/>
+            </w:pPr>
+            <w:r>
+              <w:rPr>
+                <w:rFonts w:ascii="宋体" w:hAnsi="宋体" w:eastAsia="宋体" w:cs="宋体"/>
+                <w:b w:val="0"/>
+                <w:color w:val="000000"/>
+                <w:sz w:val="24"/>
+              </w:rPr>
+              <w:t>judge.judge_trial、isolation.run_isolated、external_twine.boundary</w:t>
+            </w:r>
+          </w:p>
+        </w:tc>
+        <w:tc>
+          <w:tcPr>
+            <w:tcW w:w="2891" w:type="dxa"/>
+            <w:vAlign w:val="center"/>
+          </w:tcPr>
+          <w:p>
+            <w:pPr>
+              <w:keepNext/>
+              <w:widowControl/>
+              <w:spacing w:before="60" w:after="60" w:line="360" w:lineRule="auto"/>
+              <w:ind w:firstLine="0"/>
+              <w:jc w:val="center"/>
+            </w:pPr>
+            <w:r>
+              <w:rPr>
+                <w:rFonts w:ascii="宋体" w:hAnsi="宋体" w:eastAsia="宋体" w:cs="宋体"/>
+                <w:b w:val="0"/>
+                <w:color w:val="000000"/>
+                <w:sz w:val="24"/>
+              </w:rPr>
+              <w:t>h07 正常保留；Twine 越界候选被拒</w:t>
+            </w:r>
+          </w:p>
+        </w:tc>
+      </w:tr>
+      <w:tr>
+        <w:tblPrEx>
+          <w:tblBorders>
+            <w:top w:val="single" w:color="D9D9D9" w:sz="4" w:space="0"/>
+            <w:left w:val="single" w:color="D9D9D9" w:sz="4" w:space="0"/>
+            <w:bottom w:val="single" w:color="D9D9D9" w:sz="4" w:space="0"/>
+            <w:right w:val="single" w:color="D9D9D9" w:sz="4" w:space="0"/>
+            <w:insideH w:val="single" w:color="D9D9D9" w:sz="4" w:space="0"/>
+            <w:insideV w:val="single" w:color="D9D9D9" w:sz="4" w:space="0"/>
+          </w:tblBorders>
+          <w:tblCellMar>
+            <w:top w:w="0" w:type="dxa"/>
+            <w:left w:w="108" w:type="dxa"/>
+            <w:bottom w:w="0" w:type="dxa"/>
+            <w:right w:w="108" w:type="dxa"/>
+          </w:tblCellMar>
+        </w:tblPrEx>
+        <w:trPr>
+          <w:cantSplit/>
+          <w:jc w:val="center"/>
+        </w:trPr>
+        <w:tc>
+          <w:tcPr>
+            <w:tcW w:w="1984" w:type="dxa"/>
+            <w:vAlign w:val="center"/>
+          </w:tcPr>
+          <w:p>
+            <w:pPr>
+              <w:keepNext w:val="0"/>
+              <w:widowControl/>
+              <w:spacing w:before="60" w:after="60" w:line="360" w:lineRule="auto"/>
+              <w:ind w:firstLine="0"/>
+              <w:jc w:val="center"/>
+            </w:pPr>
+            <w:r>
+              <w:rPr>
+                <w:rFonts w:ascii="宋体" w:hAnsi="宋体" w:eastAsia="宋体" w:cs="宋体"/>
+                <w:b w:val="0"/>
+                <w:color w:val="000000"/>
+                <w:sz w:val="24"/>
+              </w:rPr>
+              <w:t>对象材料复检</w:t>
+            </w:r>
+          </w:p>
+        </w:tc>
+        <w:tc>
+          <w:tcPr>
+            <w:tcW w:w="3798" w:type="dxa"/>
+            <w:vAlign w:val="center"/>
+          </w:tcPr>
+          <w:p>
+            <w:pPr>
+              <w:keepNext w:val="0"/>
+              <w:widowControl/>
+              <w:spacing w:before="60" w:after="60" w:line="360" w:lineRule="auto"/>
+              <w:ind w:firstLine="0"/>
+              <w:jc w:val="center"/>
+            </w:pPr>
+            <w:r>
+              <w:rPr>
+                <w:rFonts w:ascii="宋体" w:hAnsi="宋体" w:eastAsia="宋体" w:cs="宋体"/>
+                <w:b w:val="0"/>
+                <w:color w:val="000000"/>
+                <w:sz w:val="24"/>
+              </w:rPr>
+              <w:t>web._require_current_material、bundle.recheck_bundle</w:t>
+            </w:r>
+          </w:p>
+        </w:tc>
+        <w:tc>
+          <w:tcPr>
+            <w:tcW w:w="2891" w:type="dxa"/>
+            <w:vAlign w:val="center"/>
+          </w:tcPr>
+          <w:p>
+            <w:pPr>
+              <w:keepNext w:val="0"/>
+              <w:widowControl/>
+              <w:spacing w:before="60" w:after="60" w:line="360" w:lineRule="auto"/>
+              <w:ind w:firstLine="0"/>
+              <w:jc w:val="center"/>
+            </w:pPr>
+            <w:r>
+              <w:rPr>
+                <w:rFonts w:ascii="宋体" w:hAnsi="宋体" w:eastAsia="宋体" w:cs="宋体"/>
+                <w:b w:val="0"/>
+                <w:color w:val="000000"/>
+                <w:sz w:val="24"/>
+              </w:rPr>
+              <w:t>对象变化回归；当前对象的新复检</w:t>
+            </w:r>
+          </w:p>
+        </w:tc>
+      </w:tr>
+    </w:tbl>
     <w:p>
       <w:pPr>
         <w:pStyle w:val="2"/>
@@ -3735,7 +4272,7 @@
         <w:ind w:firstLine="0"/>
         <w:jc w:val="center"/>
       </w:pPr>
-      <w:bookmarkStart w:id="6" w:name="_Toc11030"/>
+      <w:bookmarkStart w:id="5" w:name="_Toc32303"/>
       <w:r>
         <w:rPr>
           <w:rFonts w:ascii="黑体" w:hAnsi="黑体" w:eastAsia="黑体" w:cs="黑体"/>
@@ -3743,26 +4280,111 @@
           <w:color w:val="000000"/>
           <w:sz w:val="32"/>
         </w:rPr>
-        <w:t>参考文献</w:t>
-      </w:r>
-      <w:bookmarkEnd w:id="6"/>
-    </w:p>
-    <w:p>
-      <w:pPr>
-        <w:widowControl/>
-        <w:spacing w:before="0" w:after="60" w:line="360" w:lineRule="auto"/>
+        <w:t>第五章 总结</w:t>
+      </w:r>
+      <w:bookmarkEnd w:id="5"/>
+    </w:p>
+    <w:p>
+      <w:pPr>
+        <w:widowControl/>
+        <w:spacing w:before="0" w:after="60" w:line="360" w:lineRule="auto"/>
+        <w:ind w:firstLine="480"/>
+      </w:pPr>
+      <w:r>
+        <w:rPr>
+          <w:rFonts w:ascii="宋体" w:hAnsi="宋体" w:eastAsia="宋体" w:cs="宋体"/>
+          <w:b w:val="0"/>
+          <w:color w:val="000000"/>
+          <w:sz w:val="24"/>
+        </w:rPr>
+        <w:t>密证已经形成“观察证据—候选生成—受控修改—安全与业务验收—材料复检”的可运行原型。它不是把所有安全工作交给模型，而是让模型在明确边界内处理代码理解和候选生成，让固定程序保留证据、权限和判定。完整同轮测试展示了四个问题例的合格修复、正常代码保留及一次真实失败反馈调整；任务完成指标同时揭示了工具协议仍需改进。Twine 外部接入说明了一条窄组件适配路径，未被写成泛化成绩。</w:t>
+      </w:r>
+    </w:p>
+    <w:p>
+      <w:pPr>
+        <w:widowControl/>
+        <w:spacing w:before="0" w:after="60" w:line="360" w:lineRule="auto"/>
+        <w:ind w:firstLine="480"/>
+      </w:pPr>
+      <w:r>
+        <w:rPr>
+          <w:rFonts w:ascii="宋体" w:hAnsi="宋体" w:eastAsia="宋体" w:cs="宋体"/>
+          <w:b w:val="0"/>
+          <w:color w:val="000000"/>
+          <w:sz w:val="24"/>
+        </w:rPr>
+        <w:t>作品对使用者的直接交付是：一份有实际执行依据的候选补丁、对应的安全与业务检查、以及可以由下一位开发者重新验收的材料。人工时间节省、企业部署收益、跨机器适配和任意代码库泛化尚未测量。本轮另准备了供 2—3 位未参与开发者执行的探索性体验包，但尚无真人结果，不把待执行材料写成用户研究结论。</w:t>
+      </w:r>
+    </w:p>
+    <w:p>
+      <w:pPr>
+        <w:widowControl/>
+        <w:spacing w:before="0" w:after="60" w:line="360" w:lineRule="auto"/>
+        <w:ind w:firstLine="480"/>
+      </w:pPr>
+      <w:r>
+        <w:rPr>
+          <w:rFonts w:ascii="宋体" w:hAnsi="宋体" w:eastAsia="宋体" w:cs="宋体"/>
+          <w:b w:val="0"/>
+          <w:color w:val="000000"/>
+          <w:sz w:val="24"/>
+        </w:rPr>
+        <w:t>后续优先提升协议稳定性和授权组件覆盖，邀请不同作者构造新案例，并把新评估与已知回归分开统计。</w:t>
+      </w:r>
+    </w:p>
+    <w:p>
+      <w:pPr>
+        <w:pStyle w:val="11"/>
+        <w:keepNext/>
+        <w:spacing w:before="120" w:after="60" w:line="360" w:lineRule="auto"/>
         <w:ind w:firstLine="0"/>
         <w:jc w:val="left"/>
       </w:pPr>
       <w:r>
         <w:rPr>
-          <w:rFonts w:ascii="宋体" w:hAnsi="宋体" w:eastAsia="宋体" w:cs="宋体"/>
-          <w:b w:val="0"/>
-          <w:color w:val="000000"/>
-          <w:sz w:val="24"/>
-        </w:rPr>
-        <w:t>[1] Qwen Team. Qwen-Agent 官方项目[EB/OL]. https://github.com/QwenLM/Qwen-Agent. 本项目使用 0.0.34，实际依赖锁与来源清单随材料提供。</w:t>
-      </w:r>
+          <w:rFonts w:ascii="黑体" w:hAnsi="黑体" w:eastAsia="黑体" w:cs="黑体"/>
+          <w:b/>
+          <w:color w:val="000000"/>
+          <w:sz w:val="28"/>
+        </w:rPr>
+        <w:t>来源与 AI 参与披露</w:t>
+      </w:r>
+    </w:p>
+    <w:p>
+      <w:pPr>
+        <w:widowControl/>
+        <w:spacing w:before="0" w:after="60" w:line="360" w:lineRule="auto"/>
+        <w:ind w:firstLine="480"/>
+      </w:pPr>
+      <w:r>
+        <w:rPr>
+          <w:rFonts w:ascii="宋体" w:hAnsi="宋体" w:eastAsia="宋体" w:cs="宋体"/>
+          <w:b w:val="0"/>
+          <w:color w:val="000000"/>
+          <w:sz w:val="24"/>
+        </w:rPr>
+        <w:t>公开模型、框架、推理服务和隔离基础设施按来源引用；本项目实现受限工具、授权与完成控制、裁判及案例、实验组织、材料复检和展示组件。ChatGPT/Codex 实质参与方案、主要代码生成与修改、调试、试验组织、结果核对和文稿准备。队伍实际成员贡献与身份字段待填；AI 辅助范围、独立研究要求及参赛资格由队伍向导师/组委会确认。本报告不替代队伍签署的原创性声明。</w:t>
+      </w:r>
+    </w:p>
+    <w:p>
+      <w:pPr>
+        <w:pStyle w:val="2"/>
+        <w:keepNext/>
+        <w:spacing w:before="160" w:after="100" w:line="360" w:lineRule="auto"/>
+        <w:ind w:firstLine="0"/>
+        <w:jc w:val="center"/>
+      </w:pPr>
+      <w:bookmarkStart w:id="6" w:name="_Toc6258"/>
+      <w:r>
+        <w:rPr>
+          <w:rFonts w:ascii="黑体" w:hAnsi="黑体" w:eastAsia="黑体" w:cs="黑体"/>
+          <w:b/>
+          <w:color w:val="000000"/>
+          <w:sz w:val="32"/>
+        </w:rPr>
+        <w:t>参考文献</w:t>
+      </w:r>
+      <w:bookmarkEnd w:id="6"/>
     </w:p>
     <w:p>
       <w:pPr>
@@ -3778,7 +4400,7 @@
           <w:color w:val="000000"/>
           <w:sz w:val="24"/>
         </w:rPr>
-        <w:t>[2] Qwen Team. Qwen3-Coder 官方项目[EB/OL]. https://github.com/QwenLM/Qwen3-Coder. 本项目使用 Ollama 分发的 qwen3-coder:30b Q4_K_M，不开展训练。</w:t>
+        <w:t>[1] Qwen Team. Qwen-Agent 官方项目[EB/OL]. https://github.com/QwenLM/Qwen-Agent. 本项目使用 0.0.34，实际依赖锁与来源清单随材料提供。</w:t>
       </w:r>
     </w:p>
     <w:p>
@@ -3795,7 +4417,7 @@
           <w:color w:val="000000"/>
           <w:sz w:val="24"/>
         </w:rPr>
-        <w:t>[3] Ollama. Ollama 官方项目[EB/OL]. https://github.com/ollama/ollama. 本轮推理版本 0.34.4。</w:t>
+        <w:t>[2] Qwen Team. Qwen3-Coder 官方项目[EB/OL]. https://github.com/QwenLM/Qwen3-Coder. 本项目使用 Ollama 分发的 qwen3-coder:30b Q4_K_M，不开展训练。</w:t>
       </w:r>
     </w:p>
     <w:p>
@@ -3812,7 +4434,7 @@
           <w:color w:val="000000"/>
           <w:sz w:val="24"/>
         </w:rPr>
-        <w:t>[4] 本项目. 冻结八案例完整运行记录[DS]. 2026-09-29. results.json；冻结文件摘要；源码快照；分层事实审计。</w:t>
+        <w:t>[3] Ollama. Ollama 官方项目[EB/OL]. https://github.com/ollama/ollama. 本轮推理版本 0.34.4。</w:t>
       </w:r>
     </w:p>
     <w:p>
@@ -3829,7 +4451,7 @@
           <w:color w:val="000000"/>
           <w:sz w:val="24"/>
         </w:rPr>
-        <w:t>[5] 本项目. h03 原始候选与反馈记录[DS]. 2026-09-29. 首候选；第二候选；失败进入下一请求。</w:t>
+        <w:t>[4] 本项目. 冻结八案例完整运行记录[DS]. 2026-09-29. results.json；冻结文件摘要；源码快照；分层事实审计。</w:t>
       </w:r>
     </w:p>
     <w:p>
@@ -3846,7 +4468,41 @@
           <w:color w:val="000000"/>
           <w:sz w:val="24"/>
         </w:rPr>
+        <w:t>[5] 本项目. h03 原始候选与反馈记录[DS]. 2026-09-29. 首候选；第二候选；失败进入下一请求。</w:t>
+      </w:r>
+    </w:p>
+    <w:p>
+      <w:pPr>
+        <w:widowControl/>
+        <w:spacing w:before="0" w:after="60" w:line="360" w:lineRule="auto"/>
+        <w:ind w:firstLine="0"/>
+        <w:jc w:val="left"/>
+      </w:pPr>
+      <w:r>
+        <w:rPr>
+          <w:rFonts w:ascii="宋体" w:hAnsi="宋体" w:eastAsia="宋体" w:cs="宋体"/>
+          <w:b w:val="0"/>
+          <w:color w:val="000000"/>
+          <w:sz w:val="24"/>
+        </w:rPr>
         <w:t>[6] PyPA Twine. bugfix utils catch configparser Error. PR #1240, merged 2025-04-11. https://github.com/pypa/twine/pull/1240. 固定来源、许可证、原组件和完整单次运行记录随候选材料提供。</w:t>
+      </w:r>
+    </w:p>
+    <w:p>
+      <w:pPr>
+        <w:widowControl/>
+        <w:spacing w:before="0" w:after="60" w:line="360" w:lineRule="auto"/>
+        <w:ind w:firstLine="0"/>
+        <w:jc w:val="left"/>
+      </w:pPr>
+      <w:r>
+        <w:rPr>
+          <w:rFonts w:ascii="宋体" w:hAnsi="宋体" w:eastAsia="宋体" w:cs="宋体"/>
+          <w:b w:val="0"/>
+          <w:color w:val="000000"/>
+          <w:sz w:val="24"/>
+        </w:rPr>
+        <w:t>[7] 本项目. 官方资料与原论文核查记录[EB/OL]. 2026-09-29. docs/preliminary/01_related_work_and_template.md，含 Gitleaks、TruffleHog、GitHub Secret Scanning 官方来源以及修复验证、in-toto 原论文。该历史核查未作为竞品效果实验。</w:t>
       </w:r>
     </w:p>
     <w:sectPr>
@@ -4051,7 +4707,7 @@
         <w:color w:val="000000"/>
         <w:sz w:val="24"/>
       </w:rPr>
-      <w:t>13</w:t>
+      <w:t>15</w:t>
     </w:r>
     <w:r>
       <w:rPr>
@@ -4513,7 +5169,6 @@
   </w:style>
   <w:style w:type="paragraph" w:customStyle="1" w:styleId="10">
     <w:name w:val="Title"/>
-    <w:qFormat/>
     <w:uiPriority w:val="0"/>
     <w:rPr>
       <w:rFonts w:ascii="黑体" w:hAnsi="黑体" w:eastAsia="宋体" w:cs="Times New Roman"/>

</xml_diff>

<commit_message>
enhance(candidate): integrate safety checks and project workflow
</commit_message>
<xml_diff>
--- a/docs/preliminary-candidate/credproof-manuscript-candidate.docx
+++ b/docs/preliminary-candidate/credproof-manuscript-candidate.docx
@@ -558,7 +558,7 @@
         <w:rPr>
           <w:rFonts w:ascii="宋体" w:hAnsi="宋体" w:eastAsia="宋体" w:cs="宋体"/>
         </w:rPr>
-        <w:instrText xml:space="preserve"> HYPERLINK \l _Toc18758 </w:instrText>
+        <w:instrText xml:space="preserve"> HYPERLINK \l _Toc12776 </w:instrText>
       </w:r>
       <w:r>
         <w:rPr>
@@ -579,7 +579,7 @@
         <w:fldChar w:fldCharType="begin"/>
       </w:r>
       <w:r>
-        <w:instrText xml:space="preserve"> PAGEREF _Toc18758 \h </w:instrText>
+        <w:instrText xml:space="preserve"> PAGEREF _Toc12776 \h </w:instrText>
       </w:r>
       <w:r>
         <w:fldChar w:fldCharType="separate"/>
@@ -616,7 +616,7 @@
         <w:rPr>
           <w:rFonts w:ascii="宋体" w:hAnsi="宋体" w:eastAsia="宋体" w:cs="宋体"/>
         </w:rPr>
-        <w:instrText xml:space="preserve"> HYPERLINK \l _Toc24465 </w:instrText>
+        <w:instrText xml:space="preserve"> HYPERLINK \l _Toc22527 </w:instrText>
       </w:r>
       <w:r>
         <w:rPr>
@@ -637,7 +637,7 @@
         <w:fldChar w:fldCharType="begin"/>
       </w:r>
       <w:r>
-        <w:instrText xml:space="preserve"> PAGEREF _Toc24465 \h </w:instrText>
+        <w:instrText xml:space="preserve"> PAGEREF _Toc22527 \h </w:instrText>
       </w:r>
       <w:r>
         <w:fldChar w:fldCharType="separate"/>
@@ -674,7 +674,7 @@
         <w:rPr>
           <w:rFonts w:ascii="宋体" w:hAnsi="宋体" w:eastAsia="宋体" w:cs="宋体"/>
         </w:rPr>
-        <w:instrText xml:space="preserve"> HYPERLINK \l _Toc3943 </w:instrText>
+        <w:instrText xml:space="preserve"> HYPERLINK \l _Toc14981 </w:instrText>
       </w:r>
       <w:r>
         <w:rPr>
@@ -695,7 +695,7 @@
         <w:fldChar w:fldCharType="begin"/>
       </w:r>
       <w:r>
-        <w:instrText xml:space="preserve"> PAGEREF _Toc3943 \h </w:instrText>
+        <w:instrText xml:space="preserve"> PAGEREF _Toc14981 \h </w:instrText>
       </w:r>
       <w:r>
         <w:fldChar w:fldCharType="separate"/>
@@ -732,7 +732,7 @@
         <w:rPr>
           <w:rFonts w:ascii="宋体" w:hAnsi="宋体" w:eastAsia="宋体" w:cs="宋体"/>
         </w:rPr>
-        <w:instrText xml:space="preserve"> HYPERLINK \l _Toc3312 </w:instrText>
+        <w:instrText xml:space="preserve"> HYPERLINK \l _Toc19523 </w:instrText>
       </w:r>
       <w:r>
         <w:rPr>
@@ -753,7 +753,7 @@
         <w:fldChar w:fldCharType="begin"/>
       </w:r>
       <w:r>
-        <w:instrText xml:space="preserve"> PAGEREF _Toc3312 \h </w:instrText>
+        <w:instrText xml:space="preserve"> PAGEREF _Toc19523 \h </w:instrText>
       </w:r>
       <w:r>
         <w:fldChar w:fldCharType="separate"/>
@@ -790,7 +790,7 @@
         <w:rPr>
           <w:rFonts w:ascii="宋体" w:hAnsi="宋体" w:eastAsia="宋体" w:cs="宋体"/>
         </w:rPr>
-        <w:instrText xml:space="preserve"> HYPERLINK \l _Toc32170 </w:instrText>
+        <w:instrText xml:space="preserve"> HYPERLINK \l _Toc1031 </w:instrText>
       </w:r>
       <w:r>
         <w:rPr>
@@ -811,7 +811,7 @@
         <w:fldChar w:fldCharType="begin"/>
       </w:r>
       <w:r>
-        <w:instrText xml:space="preserve"> PAGEREF _Toc32170 \h </w:instrText>
+        <w:instrText xml:space="preserve"> PAGEREF _Toc1031 \h </w:instrText>
       </w:r>
       <w:r>
         <w:fldChar w:fldCharType="separate"/>
@@ -848,7 +848,7 @@
         <w:rPr>
           <w:rFonts w:ascii="宋体" w:hAnsi="宋体" w:eastAsia="宋体" w:cs="宋体"/>
         </w:rPr>
-        <w:instrText xml:space="preserve"> HYPERLINK \l _Toc32303 </w:instrText>
+        <w:instrText xml:space="preserve"> HYPERLINK \l _Toc2807 </w:instrText>
       </w:r>
       <w:r>
         <w:rPr>
@@ -869,7 +869,7 @@
         <w:fldChar w:fldCharType="begin"/>
       </w:r>
       <w:r>
-        <w:instrText xml:space="preserve"> PAGEREF _Toc32303 \h </w:instrText>
+        <w:instrText xml:space="preserve"> PAGEREF _Toc2807 \h </w:instrText>
       </w:r>
       <w:r>
         <w:fldChar w:fldCharType="separate"/>
@@ -906,7 +906,7 @@
         <w:rPr>
           <w:rFonts w:ascii="宋体" w:hAnsi="宋体" w:eastAsia="宋体" w:cs="宋体"/>
         </w:rPr>
-        <w:instrText xml:space="preserve"> HYPERLINK \l _Toc6258 </w:instrText>
+        <w:instrText xml:space="preserve"> HYPERLINK \l _Toc19422 </w:instrText>
       </w:r>
       <w:r>
         <w:rPr>
@@ -927,7 +927,7 @@
         <w:fldChar w:fldCharType="begin"/>
       </w:r>
       <w:r>
-        <w:instrText xml:space="preserve"> PAGEREF _Toc6258 \h </w:instrText>
+        <w:instrText xml:space="preserve"> PAGEREF _Toc19422 \h </w:instrText>
       </w:r>
       <w:r>
         <w:fldChar w:fldCharType="separate"/>
@@ -968,7 +968,7 @@
         <w:ind w:firstLine="0"/>
         <w:jc w:val="center"/>
       </w:pPr>
-      <w:bookmarkStart w:id="0" w:name="_Toc18758"/>
+      <w:bookmarkStart w:id="0" w:name="_Toc12776"/>
       <w:r>
         <w:rPr>
           <w:rFonts w:ascii="黑体" w:hAnsi="黑体" w:eastAsia="黑体" w:cs="黑体"/>
@@ -993,7 +993,7 @@
           <w:color w:val="000000"/>
           <w:sz w:val="24"/>
         </w:rPr>
-        <w:t>凭据没有写进源码，也可能在工具执行时流入日志和异常返回。密证 CredProof 面向维护自有或授权 Python 工具的开发者，将泄露线索转化为可交付复查的候选修复。人工固定需求和允许范围，程序生成受控证据，本地模型提出补丁，程序联合检查泄露、业务行为与修改边界。h01 展示模型补足本项目固定启发式遗漏的参数日志；h03 展示脱敏前缀未移除真实值，失败反馈后第二候选通过；h07 保留未发现泄露的原代码。冻结八例中，Agent 取得四个问题例的合格补丁，完整任务六例，未完成记录保留。另对 Twine 一个公开历史问题进行窄组件复现与修复验证，独立导出材料并复检。作品提供的不只是补丁，还有对应副本和条件的验收依据，帮助开发者判断是否接受修复。</w:t>
+        <w:t>工具能完成任务，不代表它只做了被允许的事：凭据可能进入日志或异常返回，代码可能读取规定目录之外的文件，也可能请求未授权服务。密证 CredProof 面向维护自有或授权 Python 工具的开发者和安全人员，将这些问题放进同一条可复查流程。人工提供入口、允许目录/服务和必要业务测试；固定程序在隔离副本中观察三类安全行为并检查业务；本地模型只提出候选修改，程序决定是否接受。h01 展示模型补足参数日志路径，h03 展示失败回执带来第二份候选，h07 展示无确认泄露时保持原代码。冻结八例的完整任务仍为 6/8，失败和未完成保留。python-dotenv 外部案例单列，证明的是一个窄组件接入。最后交付候选差异、新生成的安全报告和以后可再次执行的导出测试。</w:t>
       </w:r>
     </w:p>
     <w:p>
@@ -1025,7 +1025,7 @@
         <w:ind w:firstLine="0"/>
         <w:jc w:val="center"/>
       </w:pPr>
-      <w:bookmarkStart w:id="1" w:name="_Toc24465"/>
+      <w:bookmarkStart w:id="1" w:name="_Toc22527"/>
       <w:r>
         <w:rPr>
           <w:rFonts w:ascii="黑体" w:hAnsi="黑体" w:eastAsia="黑体" w:cs="黑体"/>
@@ -1084,7 +1084,7 @@
           <w:color w:val="000000"/>
           <w:sz w:val="24"/>
         </w:rPr>
-        <w:t>使用者实际要处理五件事：找到触发条件和传播路径，区分合法认证与禁止泄露，修改并保持必要业务行为，判断候选是否真的消除了暴露，把对应材料交给下一位复查者。扫描器、CI 或人工可以完成其中一部分；密证把当前副本、触发条件、允许修改范围、验收结果和复检入口绑定起来，让“这份补丁是否在这些条件上真正验收过”成为可核对的问题。</w:t>
+        <w:t>使用者实际要处理五件事：找到触发条件和传播路径，区分合法认证与禁止泄露，检查目录和服务边界，修改并保持必要业务行为，判断候选是否真的消除了问题，把对应材料交给下一位复查者。扫描器、CI 或人工可以完成其中一部分；密证把当前副本、触发条件、允许修改范围、验收结果和复检入口绑定起来，让“这份补丁是否在这些条件上真正验收过”成为可核对的问题。</w:t>
       </w:r>
     </w:p>
     <w:p>
@@ -1236,7 +1236,7 @@
           <w:color w:val="000000"/>
           <w:sz w:val="24"/>
         </w:rPr>
-        <w:t>作品适用于教学实验、团队自有认证工具及内部授权组件。开发者可以定位泄露通道、比较候选差异，把对应材料交给他人复检；正常工具经验证后保持原样。当前范围是已登记、已适配的受控 Python 工具，使用合成凭据、本地模拟服务和既有隔离环境，不扫描真实账户或公网目标。</w:t>
+        <w:t>作品适用于教学实验、团队自有认证工具及内部授权组件。开发者可以定位凭据输出、越界文件读取和未授权网络请求，比较候选差异，把对应材料交给他人复检；正常工具经验证后保持原样。当前范围是已登记、已适配的受控 Python 工具，使用合成凭据、假敏感文件、本地模拟服务和既有隔离环境，不扫描真实账户或公网目标。</w:t>
       </w:r>
     </w:p>
     <w:p>
@@ -1263,7 +1263,7 @@
         <w:ind w:firstLine="0"/>
         <w:jc w:val="center"/>
       </w:pPr>
-      <w:bookmarkStart w:id="2" w:name="_Toc3943"/>
+      <w:bookmarkStart w:id="2" w:name="_Toc14981"/>
       <w:r>
         <w:rPr>
           <w:rFonts w:ascii="黑体" w:hAnsi="黑体" w:eastAsia="黑体" w:cs="黑体"/>
@@ -2049,7 +2049,7 @@
         <w:ind w:firstLine="0"/>
         <w:jc w:val="center"/>
       </w:pPr>
-      <w:bookmarkStart w:id="3" w:name="_Toc3312"/>
+      <w:bookmarkStart w:id="3" w:name="_Toc19523"/>
       <w:r>
         <w:rPr>
           <w:rFonts w:ascii="黑体" w:hAnsi="黑体" w:eastAsia="黑体" w:cs="黑体"/>
@@ -2159,6 +2159,22 @@
         <w:gridCol w:w="1417"/>
       </w:tblGrid>
       <w:tr>
+        <w:tblPrEx>
+          <w:tblBorders>
+            <w:top w:val="single" w:color="D9D9D9" w:sz="4" w:space="0"/>
+            <w:left w:val="single" w:color="D9D9D9" w:sz="4" w:space="0"/>
+            <w:bottom w:val="single" w:color="D9D9D9" w:sz="4" w:space="0"/>
+            <w:right w:val="single" w:color="D9D9D9" w:sz="4" w:space="0"/>
+            <w:insideH w:val="single" w:color="D9D9D9" w:sz="4" w:space="0"/>
+            <w:insideV w:val="single" w:color="D9D9D9" w:sz="4" w:space="0"/>
+          </w:tblBorders>
+          <w:tblCellMar>
+            <w:top w:w="0" w:type="dxa"/>
+            <w:left w:w="108" w:type="dxa"/>
+            <w:bottom w:w="0" w:type="dxa"/>
+            <w:right w:w="108" w:type="dxa"/>
+          </w:tblCellMar>
+        </w:tblPrEx>
         <w:trPr>
           <w:cantSplit/>
           <w:tblHeader/>
@@ -3698,7 +3714,7 @@
         <w:ind w:firstLine="0"/>
         <w:jc w:val="center"/>
       </w:pPr>
-      <w:bookmarkStart w:id="4" w:name="_Toc32170"/>
+      <w:bookmarkStart w:id="4" w:name="_Toc1031"/>
       <w:r>
         <w:rPr>
           <w:rFonts w:ascii="黑体" w:hAnsi="黑体" w:eastAsia="黑体" w:cs="黑体"/>
@@ -4272,7 +4288,7 @@
         <w:ind w:firstLine="0"/>
         <w:jc w:val="center"/>
       </w:pPr>
-      <w:bookmarkStart w:id="5" w:name="_Toc32303"/>
+      <w:bookmarkStart w:id="5" w:name="_Toc2807"/>
       <w:r>
         <w:rPr>
           <w:rFonts w:ascii="黑体" w:hAnsi="黑体" w:eastAsia="黑体" w:cs="黑体"/>
@@ -4374,7 +4390,7 @@
         <w:ind w:firstLine="0"/>
         <w:jc w:val="center"/>
       </w:pPr>
-      <w:bookmarkStart w:id="6" w:name="_Toc6258"/>
+      <w:bookmarkStart w:id="6" w:name="_Toc19422"/>
       <w:r>
         <w:rPr>
           <w:rFonts w:ascii="黑体" w:hAnsi="黑体" w:eastAsia="黑体" w:cs="黑体"/>
@@ -4851,7 +4867,7 @@
     <w:lsdException w:qFormat="1" w:unhideWhenUsed="0" w:uiPriority="0" w:semiHidden="0" w:name="Title"/>
     <w:lsdException w:unhideWhenUsed="0" w:uiPriority="0" w:semiHidden="0" w:name="Closing"/>
     <w:lsdException w:unhideWhenUsed="0" w:uiPriority="0" w:semiHidden="0" w:name="Signature"/>
-    <w:lsdException w:qFormat="1" w:unhideWhenUsed="0" w:uiPriority="0" w:name="Default Paragraph Font"/>
+    <w:lsdException w:unhideWhenUsed="0" w:uiPriority="0" w:name="Default Paragraph Font"/>
     <w:lsdException w:unhideWhenUsed="0" w:uiPriority="0" w:semiHidden="0" w:name="Body Text"/>
     <w:lsdException w:unhideWhenUsed="0" w:uiPriority="0" w:semiHidden="0" w:name="Body Text Indent"/>
     <w:lsdException w:unhideWhenUsed="0" w:uiPriority="0" w:semiHidden="0" w:name="List Continue"/>
@@ -5077,7 +5093,6 @@
   <w:style w:type="character" w:default="1" w:styleId="7">
     <w:name w:val="Default Paragraph Font"/>
     <w:semiHidden/>
-    <w:qFormat/>
     <w:uiPriority w:val="0"/>
   </w:style>
   <w:style w:type="table" w:default="1" w:styleId="6">
@@ -5179,6 +5194,7 @@
   <w:style w:type="paragraph" w:customStyle="1" w:styleId="11">
     <w:name w:val="heading 2"/>
     <w:basedOn w:val="1"/>
+    <w:qFormat/>
     <w:uiPriority w:val="0"/>
     <w:pPr>
       <w:outlineLvl w:val="1"/>

</xml_diff>

<commit_message>
feat(candidate): integrate registered project checks
</commit_message>
<xml_diff>
--- a/docs/preliminary-candidate/credproof-manuscript-candidate.docx
+++ b/docs/preliminary-candidate/credproof-manuscript-candidate.docx
@@ -558,7 +558,7 @@
         <w:rPr>
           <w:rFonts w:ascii="宋体" w:hAnsi="宋体" w:eastAsia="宋体" w:cs="宋体"/>
         </w:rPr>
-        <w:instrText xml:space="preserve"> HYPERLINK \l _Toc12776 </w:instrText>
+        <w:instrText xml:space="preserve"> HYPERLINK \l _Toc11374 </w:instrText>
       </w:r>
       <w:r>
         <w:rPr>
@@ -579,7 +579,7 @@
         <w:fldChar w:fldCharType="begin"/>
       </w:r>
       <w:r>
-        <w:instrText xml:space="preserve"> PAGEREF _Toc12776 \h </w:instrText>
+        <w:instrText xml:space="preserve"> PAGEREF _Toc11374 \h </w:instrText>
       </w:r>
       <w:r>
         <w:fldChar w:fldCharType="separate"/>
@@ -616,7 +616,7 @@
         <w:rPr>
           <w:rFonts w:ascii="宋体" w:hAnsi="宋体" w:eastAsia="宋体" w:cs="宋体"/>
         </w:rPr>
-        <w:instrText xml:space="preserve"> HYPERLINK \l _Toc22527 </w:instrText>
+        <w:instrText xml:space="preserve"> HYPERLINK \l _Toc11252 </w:instrText>
       </w:r>
       <w:r>
         <w:rPr>
@@ -637,7 +637,7 @@
         <w:fldChar w:fldCharType="begin"/>
       </w:r>
       <w:r>
-        <w:instrText xml:space="preserve"> PAGEREF _Toc22527 \h </w:instrText>
+        <w:instrText xml:space="preserve"> PAGEREF _Toc11252 \h </w:instrText>
       </w:r>
       <w:r>
         <w:fldChar w:fldCharType="separate"/>
@@ -674,7 +674,7 @@
         <w:rPr>
           <w:rFonts w:ascii="宋体" w:hAnsi="宋体" w:eastAsia="宋体" w:cs="宋体"/>
         </w:rPr>
-        <w:instrText xml:space="preserve"> HYPERLINK \l _Toc14981 </w:instrText>
+        <w:instrText xml:space="preserve"> HYPERLINK \l _Toc27184 </w:instrText>
       </w:r>
       <w:r>
         <w:rPr>
@@ -695,7 +695,7 @@
         <w:fldChar w:fldCharType="begin"/>
       </w:r>
       <w:r>
-        <w:instrText xml:space="preserve"> PAGEREF _Toc14981 \h </w:instrText>
+        <w:instrText xml:space="preserve"> PAGEREF _Toc27184 \h </w:instrText>
       </w:r>
       <w:r>
         <w:fldChar w:fldCharType="separate"/>
@@ -732,7 +732,7 @@
         <w:rPr>
           <w:rFonts w:ascii="宋体" w:hAnsi="宋体" w:eastAsia="宋体" w:cs="宋体"/>
         </w:rPr>
-        <w:instrText xml:space="preserve"> HYPERLINK \l _Toc19523 </w:instrText>
+        <w:instrText xml:space="preserve"> HYPERLINK \l _Toc22593 </w:instrText>
       </w:r>
       <w:r>
         <w:rPr>
@@ -753,7 +753,7 @@
         <w:fldChar w:fldCharType="begin"/>
       </w:r>
       <w:r>
-        <w:instrText xml:space="preserve"> PAGEREF _Toc19523 \h </w:instrText>
+        <w:instrText xml:space="preserve"> PAGEREF _Toc22593 \h </w:instrText>
       </w:r>
       <w:r>
         <w:fldChar w:fldCharType="separate"/>
@@ -790,7 +790,7 @@
         <w:rPr>
           <w:rFonts w:ascii="宋体" w:hAnsi="宋体" w:eastAsia="宋体" w:cs="宋体"/>
         </w:rPr>
-        <w:instrText xml:space="preserve"> HYPERLINK \l _Toc1031 </w:instrText>
+        <w:instrText xml:space="preserve"> HYPERLINK \l _Toc13869 </w:instrText>
       </w:r>
       <w:r>
         <w:rPr>
@@ -811,7 +811,7 @@
         <w:fldChar w:fldCharType="begin"/>
       </w:r>
       <w:r>
-        <w:instrText xml:space="preserve"> PAGEREF _Toc1031 \h </w:instrText>
+        <w:instrText xml:space="preserve"> PAGEREF _Toc13869 \h </w:instrText>
       </w:r>
       <w:r>
         <w:fldChar w:fldCharType="separate"/>
@@ -848,7 +848,7 @@
         <w:rPr>
           <w:rFonts w:ascii="宋体" w:hAnsi="宋体" w:eastAsia="宋体" w:cs="宋体"/>
         </w:rPr>
-        <w:instrText xml:space="preserve"> HYPERLINK \l _Toc2807 </w:instrText>
+        <w:instrText xml:space="preserve"> HYPERLINK \l _Toc31933 </w:instrText>
       </w:r>
       <w:r>
         <w:rPr>
@@ -869,7 +869,7 @@
         <w:fldChar w:fldCharType="begin"/>
       </w:r>
       <w:r>
-        <w:instrText xml:space="preserve"> PAGEREF _Toc2807 \h </w:instrText>
+        <w:instrText xml:space="preserve"> PAGEREF _Toc31933 \h </w:instrText>
       </w:r>
       <w:r>
         <w:fldChar w:fldCharType="separate"/>
@@ -906,7 +906,7 @@
         <w:rPr>
           <w:rFonts w:ascii="宋体" w:hAnsi="宋体" w:eastAsia="宋体" w:cs="宋体"/>
         </w:rPr>
-        <w:instrText xml:space="preserve"> HYPERLINK \l _Toc19422 </w:instrText>
+        <w:instrText xml:space="preserve"> HYPERLINK \l _Toc15871 </w:instrText>
       </w:r>
       <w:r>
         <w:rPr>
@@ -927,7 +927,7 @@
         <w:fldChar w:fldCharType="begin"/>
       </w:r>
       <w:r>
-        <w:instrText xml:space="preserve"> PAGEREF _Toc19422 \h </w:instrText>
+        <w:instrText xml:space="preserve"> PAGEREF _Toc15871 \h </w:instrText>
       </w:r>
       <w:r>
         <w:fldChar w:fldCharType="separate"/>
@@ -968,7 +968,7 @@
         <w:ind w:firstLine="0"/>
         <w:jc w:val="center"/>
       </w:pPr>
-      <w:bookmarkStart w:id="0" w:name="_Toc12776"/>
+      <w:bookmarkStart w:id="0" w:name="_Toc11374"/>
       <w:r>
         <w:rPr>
           <w:rFonts w:ascii="黑体" w:hAnsi="黑体" w:eastAsia="黑体" w:cs="黑体"/>
@@ -1025,7 +1025,7 @@
         <w:ind w:firstLine="0"/>
         <w:jc w:val="center"/>
       </w:pPr>
-      <w:bookmarkStart w:id="1" w:name="_Toc22527"/>
+      <w:bookmarkStart w:id="1" w:name="_Toc11252"/>
       <w:r>
         <w:rPr>
           <w:rFonts w:ascii="黑体" w:hAnsi="黑体" w:eastAsia="黑体" w:cs="黑体"/>
@@ -1263,7 +1263,7 @@
         <w:ind w:firstLine="0"/>
         <w:jc w:val="center"/>
       </w:pPr>
-      <w:bookmarkStart w:id="2" w:name="_Toc14981"/>
+      <w:bookmarkStart w:id="2" w:name="_Toc27184"/>
       <w:r>
         <w:rPr>
           <w:rFonts w:ascii="黑体" w:hAnsi="黑体" w:eastAsia="黑体" w:cs="黑体"/>
@@ -2049,7 +2049,7 @@
         <w:ind w:firstLine="0"/>
         <w:jc w:val="center"/>
       </w:pPr>
-      <w:bookmarkStart w:id="3" w:name="_Toc19523"/>
+      <w:bookmarkStart w:id="3" w:name="_Toc22593"/>
       <w:r>
         <w:rPr>
           <w:rFonts w:ascii="黑体" w:hAnsi="黑体" w:eastAsia="黑体" w:cs="黑体"/>
@@ -3714,7 +3714,7 @@
         <w:ind w:firstLine="0"/>
         <w:jc w:val="center"/>
       </w:pPr>
-      <w:bookmarkStart w:id="4" w:name="_Toc1031"/>
+      <w:bookmarkStart w:id="4" w:name="_Toc13869"/>
       <w:r>
         <w:rPr>
           <w:rFonts w:ascii="黑体" w:hAnsi="黑体" w:eastAsia="黑体" w:cs="黑体"/>
@@ -4288,7 +4288,7 @@
         <w:ind w:firstLine="0"/>
         <w:jc w:val="center"/>
       </w:pPr>
-      <w:bookmarkStart w:id="5" w:name="_Toc2807"/>
+      <w:bookmarkStart w:id="5" w:name="_Toc31933"/>
       <w:r>
         <w:rPr>
           <w:rFonts w:ascii="黑体" w:hAnsi="黑体" w:eastAsia="黑体" w:cs="黑体"/>
@@ -4390,7 +4390,7 @@
         <w:ind w:firstLine="0"/>
         <w:jc w:val="center"/>
       </w:pPr>
-      <w:bookmarkStart w:id="6" w:name="_Toc19422"/>
+      <w:bookmarkStart w:id="6" w:name="_Toc15871"/>
       <w:r>
         <w:rPr>
           <w:rFonts w:ascii="黑体" w:hAnsi="黑体" w:eastAsia="黑体" w:cs="黑体"/>
@@ -4867,7 +4867,7 @@
     <w:lsdException w:qFormat="1" w:unhideWhenUsed="0" w:uiPriority="0" w:semiHidden="0" w:name="Title"/>
     <w:lsdException w:unhideWhenUsed="0" w:uiPriority="0" w:semiHidden="0" w:name="Closing"/>
     <w:lsdException w:unhideWhenUsed="0" w:uiPriority="0" w:semiHidden="0" w:name="Signature"/>
-    <w:lsdException w:unhideWhenUsed="0" w:uiPriority="0" w:name="Default Paragraph Font"/>
+    <w:lsdException w:qFormat="1" w:unhideWhenUsed="0" w:uiPriority="0" w:name="Default Paragraph Font"/>
     <w:lsdException w:unhideWhenUsed="0" w:uiPriority="0" w:semiHidden="0" w:name="Body Text"/>
     <w:lsdException w:unhideWhenUsed="0" w:uiPriority="0" w:semiHidden="0" w:name="Body Text Indent"/>
     <w:lsdException w:unhideWhenUsed="0" w:uiPriority="0" w:semiHidden="0" w:name="List Continue"/>
@@ -5093,6 +5093,7 @@
   <w:style w:type="character" w:default="1" w:styleId="7">
     <w:name w:val="Default Paragraph Font"/>
     <w:semiHidden/>
+    <w:qFormat/>
     <w:uiPriority w:val="0"/>
   </w:style>
   <w:style w:type="table" w:default="1" w:styleId="6">
@@ -5184,6 +5185,7 @@
   </w:style>
   <w:style w:type="paragraph" w:customStyle="1" w:styleId="10">
     <w:name w:val="Title"/>
+    <w:qFormat/>
     <w:uiPriority w:val="0"/>
     <w:rPr>
       <w:rFonts w:ascii="黑体" w:hAnsi="黑体" w:eastAsia="宋体" w:cs="Times New Roman"/>

</xml_diff>

<commit_message>
feat(candidate): integrate safety checks and delivery path
</commit_message>
<xml_diff>
--- a/docs/preliminary-candidate/credproof-manuscript-candidate.docx
+++ b/docs/preliminary-candidate/credproof-manuscript-candidate.docx
@@ -170,7 +170,7 @@
           <w:color w:val="000000"/>
           <w:sz w:val="32"/>
         </w:rPr>
-        <w:t>面向 AI 工具的凭据泄露验证与受控修复系统</w:t>
+        <w:t>面向 AI 与 Python 工具的安全行为验证与受控修复系统</w:t>
       </w:r>
     </w:p>
     <w:p>
@@ -558,7 +558,7 @@
         <w:rPr>
           <w:rFonts w:ascii="宋体" w:hAnsi="宋体" w:eastAsia="宋体" w:cs="宋体"/>
         </w:rPr>
-        <w:instrText xml:space="preserve"> HYPERLINK \l _Toc11374 </w:instrText>
+        <w:instrText xml:space="preserve"> HYPERLINK \l _Toc20461 </w:instrText>
       </w:r>
       <w:r>
         <w:rPr>
@@ -579,7 +579,7 @@
         <w:fldChar w:fldCharType="begin"/>
       </w:r>
       <w:r>
-        <w:instrText xml:space="preserve"> PAGEREF _Toc11374 \h </w:instrText>
+        <w:instrText xml:space="preserve"> PAGEREF _Toc20461 \h </w:instrText>
       </w:r>
       <w:r>
         <w:fldChar w:fldCharType="separate"/>
@@ -616,7 +616,7 @@
         <w:rPr>
           <w:rFonts w:ascii="宋体" w:hAnsi="宋体" w:eastAsia="宋体" w:cs="宋体"/>
         </w:rPr>
-        <w:instrText xml:space="preserve"> HYPERLINK \l _Toc11252 </w:instrText>
+        <w:instrText xml:space="preserve"> HYPERLINK \l _Toc20651 </w:instrText>
       </w:r>
       <w:r>
         <w:rPr>
@@ -637,7 +637,7 @@
         <w:fldChar w:fldCharType="begin"/>
       </w:r>
       <w:r>
-        <w:instrText xml:space="preserve"> PAGEREF _Toc11252 \h </w:instrText>
+        <w:instrText xml:space="preserve"> PAGEREF _Toc20651 \h </w:instrText>
       </w:r>
       <w:r>
         <w:fldChar w:fldCharType="separate"/>
@@ -674,7 +674,7 @@
         <w:rPr>
           <w:rFonts w:ascii="宋体" w:hAnsi="宋体" w:eastAsia="宋体" w:cs="宋体"/>
         </w:rPr>
-        <w:instrText xml:space="preserve"> HYPERLINK \l _Toc27184 </w:instrText>
+        <w:instrText xml:space="preserve"> HYPERLINK \l _Toc7118 </w:instrText>
       </w:r>
       <w:r>
         <w:rPr>
@@ -695,7 +695,7 @@
         <w:fldChar w:fldCharType="begin"/>
       </w:r>
       <w:r>
-        <w:instrText xml:space="preserve"> PAGEREF _Toc27184 \h </w:instrText>
+        <w:instrText xml:space="preserve"> PAGEREF _Toc7118 \h </w:instrText>
       </w:r>
       <w:r>
         <w:fldChar w:fldCharType="separate"/>
@@ -732,7 +732,7 @@
         <w:rPr>
           <w:rFonts w:ascii="宋体" w:hAnsi="宋体" w:eastAsia="宋体" w:cs="宋体"/>
         </w:rPr>
-        <w:instrText xml:space="preserve"> HYPERLINK \l _Toc22593 </w:instrText>
+        <w:instrText xml:space="preserve"> HYPERLINK \l _Toc31737 </w:instrText>
       </w:r>
       <w:r>
         <w:rPr>
@@ -753,7 +753,7 @@
         <w:fldChar w:fldCharType="begin"/>
       </w:r>
       <w:r>
-        <w:instrText xml:space="preserve"> PAGEREF _Toc22593 \h </w:instrText>
+        <w:instrText xml:space="preserve"> PAGEREF _Toc31737 \h </w:instrText>
       </w:r>
       <w:r>
         <w:fldChar w:fldCharType="separate"/>
@@ -790,7 +790,7 @@
         <w:rPr>
           <w:rFonts w:ascii="宋体" w:hAnsi="宋体" w:eastAsia="宋体" w:cs="宋体"/>
         </w:rPr>
-        <w:instrText xml:space="preserve"> HYPERLINK \l _Toc13869 </w:instrText>
+        <w:instrText xml:space="preserve"> HYPERLINK \l _Toc22956 </w:instrText>
       </w:r>
       <w:r>
         <w:rPr>
@@ -811,13 +811,13 @@
         <w:fldChar w:fldCharType="begin"/>
       </w:r>
       <w:r>
-        <w:instrText xml:space="preserve"> PAGEREF _Toc13869 \h </w:instrText>
+        <w:instrText xml:space="preserve"> PAGEREF _Toc22956 \h </w:instrText>
       </w:r>
       <w:r>
         <w:fldChar w:fldCharType="separate"/>
       </w:r>
       <w:r>
-        <w:t>12</w:t>
+        <w:t>13</w:t>
       </w:r>
       <w:r>
         <w:fldChar w:fldCharType="end"/>
@@ -848,7 +848,7 @@
         <w:rPr>
           <w:rFonts w:ascii="宋体" w:hAnsi="宋体" w:eastAsia="宋体" w:cs="宋体"/>
         </w:rPr>
-        <w:instrText xml:space="preserve"> HYPERLINK \l _Toc31933 </w:instrText>
+        <w:instrText xml:space="preserve"> HYPERLINK \l _Toc15655 </w:instrText>
       </w:r>
       <w:r>
         <w:rPr>
@@ -869,7 +869,7 @@
         <w:fldChar w:fldCharType="begin"/>
       </w:r>
       <w:r>
-        <w:instrText xml:space="preserve"> PAGEREF _Toc31933 \h </w:instrText>
+        <w:instrText xml:space="preserve"> PAGEREF _Toc15655 \h </w:instrText>
       </w:r>
       <w:r>
         <w:fldChar w:fldCharType="separate"/>
@@ -906,7 +906,7 @@
         <w:rPr>
           <w:rFonts w:ascii="宋体" w:hAnsi="宋体" w:eastAsia="宋体" w:cs="宋体"/>
         </w:rPr>
-        <w:instrText xml:space="preserve"> HYPERLINK \l _Toc15871 </w:instrText>
+        <w:instrText xml:space="preserve"> HYPERLINK \l _Toc30571 </w:instrText>
       </w:r>
       <w:r>
         <w:rPr>
@@ -927,7 +927,7 @@
         <w:fldChar w:fldCharType="begin"/>
       </w:r>
       <w:r>
-        <w:instrText xml:space="preserve"> PAGEREF _Toc15871 \h </w:instrText>
+        <w:instrText xml:space="preserve"> PAGEREF _Toc30571 \h </w:instrText>
       </w:r>
       <w:r>
         <w:fldChar w:fldCharType="separate"/>
@@ -968,7 +968,7 @@
         <w:ind w:firstLine="0"/>
         <w:jc w:val="center"/>
       </w:pPr>
-      <w:bookmarkStart w:id="0" w:name="_Toc11374"/>
+      <w:bookmarkStart w:id="0" w:name="_Toc20461"/>
       <w:r>
         <w:rPr>
           <w:rFonts w:ascii="黑体" w:hAnsi="黑体" w:eastAsia="黑体" w:cs="黑体"/>
@@ -1025,7 +1025,7 @@
         <w:ind w:firstLine="0"/>
         <w:jc w:val="center"/>
       </w:pPr>
-      <w:bookmarkStart w:id="1" w:name="_Toc11252"/>
+      <w:bookmarkStart w:id="1" w:name="_Toc20651"/>
       <w:r>
         <w:rPr>
           <w:rFonts w:ascii="黑体" w:hAnsi="黑体" w:eastAsia="黑体" w:cs="黑体"/>
@@ -1263,7 +1263,7 @@
         <w:ind w:firstLine="0"/>
         <w:jc w:val="center"/>
       </w:pPr>
-      <w:bookmarkStart w:id="2" w:name="_Toc27184"/>
+      <w:bookmarkStart w:id="2" w:name="_Toc7118"/>
       <w:r>
         <w:rPr>
           <w:rFonts w:ascii="黑体" w:hAnsi="黑体" w:eastAsia="黑体" w:cs="黑体"/>
@@ -2049,7 +2049,7 @@
         <w:ind w:firstLine="0"/>
         <w:jc w:val="center"/>
       </w:pPr>
-      <w:bookmarkStart w:id="3" w:name="_Toc22593"/>
+      <w:bookmarkStart w:id="3" w:name="_Toc31737"/>
       <w:r>
         <w:rPr>
           <w:rFonts w:ascii="黑体" w:hAnsi="黑体" w:eastAsia="黑体" w:cs="黑体"/>
@@ -3703,6 +3703,22 @@
           <w:color w:val="000000"/>
           <w:sz w:val="24"/>
         </w:rPr>
+        <w:t>本版现场展示新增一条可复用路径：先查看当前源文件、允许目录、禁止目录、允许服务、凭据环境变量和必要业务测试，再对问题版本执行一次无模型隔离检查；页面分别显示业务、不泄密、不乱读、不乱连四组结果。切换到人工预置修复示例后重新检查，四组条件均由新报告返回 PASS；导出按钮生成的测试放回项目后仍须由 pytest 实际执行并读取新报告。问题版本的 FAIL、修复版本的 PASS 和导出提示均来自本机真实操作，属于增强候选版现场记录，不拼入冻结八例的模型统计。</w:t>
+      </w:r>
+    </w:p>
+    <w:p>
+      <w:pPr>
+        <w:widowControl/>
+        <w:spacing w:before="0" w:after="60" w:line="360" w:lineRule="auto"/>
+        <w:ind w:firstLine="480"/>
+      </w:pPr>
+      <w:r>
+        <w:rPr>
+          <w:rFonts w:ascii="宋体" w:hAnsi="宋体" w:eastAsia="宋体" w:cs="宋体"/>
+          <w:b w:val="0"/>
+          <w:color w:val="000000"/>
+          <w:sz w:val="24"/>
+        </w:rPr>
         <w:t>preliminary.4 在同机新源码目录、新 Python 环境中验证启动、历史查看、实际复检与导出，并生成约三分钟及一分钟字幕实录剪辑。前三例明确标为历史回放，复检段包含新的程序执行及对象摘要。同机验证复用了已准备的 WSL 隔离 runtime，不作为跨机器部署验证。本版 preliminary.5 仅重构价值表达和证据索引，沿用该实录并标注版本，没有新模型实验或新真人结果。</w:t>
       </w:r>
     </w:p>
@@ -3714,7 +3730,7 @@
         <w:ind w:firstLine="0"/>
         <w:jc w:val="center"/>
       </w:pPr>
-      <w:bookmarkStart w:id="4" w:name="_Toc13869"/>
+      <w:bookmarkStart w:id="4" w:name="_Toc22956"/>
       <w:r>
         <w:rPr>
           <w:rFonts w:ascii="黑体" w:hAnsi="黑体" w:eastAsia="黑体" w:cs="黑体"/>
@@ -4288,7 +4304,7 @@
         <w:ind w:firstLine="0"/>
         <w:jc w:val="center"/>
       </w:pPr>
-      <w:bookmarkStart w:id="5" w:name="_Toc31933"/>
+      <w:bookmarkStart w:id="5" w:name="_Toc15655"/>
       <w:r>
         <w:rPr>
           <w:rFonts w:ascii="黑体" w:hAnsi="黑体" w:eastAsia="黑体" w:cs="黑体"/>
@@ -4390,7 +4406,7 @@
         <w:ind w:firstLine="0"/>
         <w:jc w:val="center"/>
       </w:pPr>
-      <w:bookmarkStart w:id="6" w:name="_Toc15871"/>
+      <w:bookmarkStart w:id="6" w:name="_Toc30571"/>
       <w:r>
         <w:rPr>
           <w:rFonts w:ascii="黑体" w:hAnsi="黑体" w:eastAsia="黑体" w:cs="黑体"/>
@@ -4867,7 +4883,7 @@
     <w:lsdException w:qFormat="1" w:unhideWhenUsed="0" w:uiPriority="0" w:semiHidden="0" w:name="Title"/>
     <w:lsdException w:unhideWhenUsed="0" w:uiPriority="0" w:semiHidden="0" w:name="Closing"/>
     <w:lsdException w:unhideWhenUsed="0" w:uiPriority="0" w:semiHidden="0" w:name="Signature"/>
-    <w:lsdException w:qFormat="1" w:unhideWhenUsed="0" w:uiPriority="0" w:name="Default Paragraph Font"/>
+    <w:lsdException w:unhideWhenUsed="0" w:uiPriority="0" w:name="Default Paragraph Font"/>
     <w:lsdException w:unhideWhenUsed="0" w:uiPriority="0" w:semiHidden="0" w:name="Body Text"/>
     <w:lsdException w:unhideWhenUsed="0" w:uiPriority="0" w:semiHidden="0" w:name="Body Text Indent"/>
     <w:lsdException w:unhideWhenUsed="0" w:uiPriority="0" w:semiHidden="0" w:name="List Continue"/>
@@ -5093,7 +5109,6 @@
   <w:style w:type="character" w:default="1" w:styleId="7">
     <w:name w:val="Default Paragraph Font"/>
     <w:semiHidden/>
-    <w:qFormat/>
     <w:uiPriority w:val="0"/>
   </w:style>
   <w:style w:type="table" w:default="1" w:styleId="6">
@@ -5185,7 +5200,6 @@
   </w:style>
   <w:style w:type="paragraph" w:customStyle="1" w:styleId="10">
     <w:name w:val="Title"/>
-    <w:qFormat/>
     <w:uiPriority w:val="0"/>
     <w:rPr>
       <w:rFonts w:ascii="黑体" w:hAnsi="黑体" w:eastAsia="宋体" w:cs="Times New Roman"/>

</xml_diff>